<commit_message>
User manual screenshots recaptured from the current screens (in progress)
</commit_message>
<xml_diff>
--- a/docs/package/01_Sales/iNXT_BrokerVerse_FAQ_and_Objection_Handling.docx
+++ b/docs/package/01_Sales/iNXT_BrokerVerse_FAQ_and_Objection_Handling.docx
@@ -789,7 +789,7 @@
             </w:rPr>
             <w:fldChar w:fldCharType="separate"/>
           </w:r>
-          <w:hyperlink w:anchor="__RefHeading___Toc11569_3199679052">
+          <w:hyperlink w:anchor="__RefHeading___Toc9069_2913971107">
             <w:r>
               <w:rPr>
                 <w:webHidden/>
@@ -824,7 +824,7 @@
             </w:tabs>
             <w:rPr/>
           </w:pPr>
-          <w:hyperlink w:anchor="__RefHeading___Toc11571_3199679052">
+          <w:hyperlink w:anchor="__RefHeading___Toc9071_2913971107">
             <w:r>
               <w:rPr>
                 <w:webHidden/>
@@ -853,7 +853,7 @@
             </w:tabs>
             <w:rPr/>
           </w:pPr>
-          <w:hyperlink w:anchor="__RefHeading___Toc11573_3199679052">
+          <w:hyperlink w:anchor="__RefHeading___Toc9073_2913971107">
             <w:r>
               <w:rPr>
                 <w:webHidden/>
@@ -875,7 +875,7 @@
             </w:tabs>
             <w:rPr/>
           </w:pPr>
-          <w:hyperlink w:anchor="__RefHeading___Toc11575_3199679052">
+          <w:hyperlink w:anchor="__RefHeading___Toc9075_2913971107">
             <w:r>
               <w:rPr>
                 <w:webHidden/>
@@ -897,7 +897,7 @@
             </w:tabs>
             <w:rPr/>
           </w:pPr>
-          <w:hyperlink w:anchor="__RefHeading___Toc11577_3199679052">
+          <w:hyperlink w:anchor="__RefHeading___Toc9077_2913971107">
             <w:r>
               <w:rPr>
                 <w:webHidden/>
@@ -919,7 +919,7 @@
             </w:tabs>
             <w:rPr/>
           </w:pPr>
-          <w:hyperlink w:anchor="__RefHeading___Toc11579_3199679052">
+          <w:hyperlink w:anchor="__RefHeading___Toc9079_2913971107">
             <w:r>
               <w:rPr>
                 <w:webHidden/>
@@ -941,7 +941,7 @@
             </w:tabs>
             <w:rPr/>
           </w:pPr>
-          <w:hyperlink w:anchor="__RefHeading___Toc11581_3199679052">
+          <w:hyperlink w:anchor="__RefHeading___Toc9081_2913971107">
             <w:r>
               <w:rPr>
                 <w:webHidden/>
@@ -963,7 +963,7 @@
             </w:tabs>
             <w:rPr/>
           </w:pPr>
-          <w:hyperlink w:anchor="__RefHeading___Toc11583_3199679052">
+          <w:hyperlink w:anchor="__RefHeading___Toc9083_2913971107">
             <w:r>
               <w:rPr>
                 <w:webHidden/>
@@ -985,7 +985,7 @@
             </w:tabs>
             <w:rPr/>
           </w:pPr>
-          <w:hyperlink w:anchor="__RefHeading___Toc11585_3199679052">
+          <w:hyperlink w:anchor="__RefHeading___Toc9085_2913971107">
             <w:r>
               <w:rPr>
                 <w:webHidden/>
@@ -1007,7 +1007,7 @@
             </w:tabs>
             <w:rPr/>
           </w:pPr>
-          <w:hyperlink w:anchor="__RefHeading___Toc11587_3199679052">
+          <w:hyperlink w:anchor="__RefHeading___Toc9087_2913971107">
             <w:r>
               <w:rPr>
                 <w:webHidden/>
@@ -1029,7 +1029,7 @@
             </w:tabs>
             <w:rPr/>
           </w:pPr>
-          <w:hyperlink w:anchor="__RefHeading___Toc11589_3199679052">
+          <w:hyperlink w:anchor="__RefHeading___Toc9089_2913971107">
             <w:r>
               <w:rPr>
                 <w:webHidden/>
@@ -1051,7 +1051,7 @@
             </w:tabs>
             <w:rPr/>
           </w:pPr>
-          <w:hyperlink w:anchor="__RefHeading___Toc11591_3199679052">
+          <w:hyperlink w:anchor="__RefHeading___Toc9091_2913971107">
             <w:r>
               <w:rPr>
                 <w:webHidden/>
@@ -1073,7 +1073,7 @@
             </w:tabs>
             <w:rPr/>
           </w:pPr>
-          <w:hyperlink w:anchor="__RefHeading___Toc11593_3199679052">
+          <w:hyperlink w:anchor="__RefHeading___Toc9093_2913971107">
             <w:r>
               <w:rPr>
                 <w:webHidden/>
@@ -1095,7 +1095,7 @@
             </w:tabs>
             <w:rPr/>
           </w:pPr>
-          <w:hyperlink w:anchor="__RefHeading___Toc11595_3199679052">
+          <w:hyperlink w:anchor="__RefHeading___Toc9095_2913971107">
             <w:r>
               <w:rPr>
                 <w:webHidden/>
@@ -1117,7 +1117,7 @@
             </w:tabs>
             <w:rPr/>
           </w:pPr>
-          <w:hyperlink w:anchor="__RefHeading___Toc11597_3199679052">
+          <w:hyperlink w:anchor="__RefHeading___Toc9097_2913971107">
             <w:r>
               <w:rPr>
                 <w:webHidden/>
@@ -1139,7 +1139,7 @@
             </w:tabs>
             <w:rPr/>
           </w:pPr>
-          <w:hyperlink w:anchor="__RefHeading___Toc11599_3199679052">
+          <w:hyperlink w:anchor="__RefHeading___Toc9099_2913971107">
             <w:r>
               <w:rPr>
                 <w:webHidden/>
@@ -1161,7 +1161,7 @@
             </w:tabs>
             <w:rPr/>
           </w:pPr>
-          <w:hyperlink w:anchor="__RefHeading___Toc11601_3199679052">
+          <w:hyperlink w:anchor="__RefHeading___Toc9101_2913971107">
             <w:r>
               <w:rPr>
                 <w:webHidden/>
@@ -1183,7 +1183,7 @@
             </w:tabs>
             <w:rPr/>
           </w:pPr>
-          <w:hyperlink w:anchor="__RefHeading___Toc11603_3199679052">
+          <w:hyperlink w:anchor="__RefHeading___Toc9103_2913971107">
             <w:r>
               <w:rPr>
                 <w:webHidden/>
@@ -1205,7 +1205,7 @@
             </w:tabs>
             <w:rPr/>
           </w:pPr>
-          <w:hyperlink w:anchor="__RefHeading___Toc11605_3199679052">
+          <w:hyperlink w:anchor="__RefHeading___Toc9105_2913971107">
             <w:r>
               <w:rPr>
                 <w:webHidden/>
@@ -1227,7 +1227,7 @@
             </w:tabs>
             <w:rPr/>
           </w:pPr>
-          <w:hyperlink w:anchor="__RefHeading___Toc11607_3199679052">
+          <w:hyperlink w:anchor="__RefHeading___Toc9107_2913971107">
             <w:r>
               <w:rPr>
                 <w:webHidden/>
@@ -1249,7 +1249,7 @@
             </w:tabs>
             <w:rPr/>
           </w:pPr>
-          <w:hyperlink w:anchor="__RefHeading___Toc11609_3199679052">
+          <w:hyperlink w:anchor="__RefHeading___Toc9109_2913971107">
             <w:r>
               <w:rPr>
                 <w:webHidden/>
@@ -1271,7 +1271,7 @@
             </w:tabs>
             <w:rPr/>
           </w:pPr>
-          <w:hyperlink w:anchor="__RefHeading___Toc11611_3199679052">
+          <w:hyperlink w:anchor="__RefHeading___Toc9111_2913971107">
             <w:r>
               <w:rPr>
                 <w:webHidden/>
@@ -1293,7 +1293,7 @@
             </w:tabs>
             <w:rPr/>
           </w:pPr>
-          <w:hyperlink w:anchor="__RefHeading___Toc11613_3199679052">
+          <w:hyperlink w:anchor="__RefHeading___Toc9113_2913971107">
             <w:r>
               <w:rPr>
                 <w:webHidden/>
@@ -1315,7 +1315,7 @@
             </w:tabs>
             <w:rPr/>
           </w:pPr>
-          <w:hyperlink w:anchor="__RefHeading___Toc11615_3199679052">
+          <w:hyperlink w:anchor="__RefHeading___Toc9115_2913971107">
             <w:r>
               <w:rPr>
                 <w:webHidden/>
@@ -1337,7 +1337,7 @@
             </w:tabs>
             <w:rPr/>
           </w:pPr>
-          <w:hyperlink w:anchor="__RefHeading___Toc11617_3199679052">
+          <w:hyperlink w:anchor="__RefHeading___Toc9117_2913971107">
             <w:r>
               <w:rPr>
                 <w:webHidden/>
@@ -1359,7 +1359,7 @@
             </w:tabs>
             <w:rPr/>
           </w:pPr>
-          <w:hyperlink w:anchor="__RefHeading___Toc11619_3199679052">
+          <w:hyperlink w:anchor="__RefHeading___Toc9119_2913971107">
             <w:r>
               <w:rPr>
                 <w:webHidden/>
@@ -1381,7 +1381,7 @@
             </w:tabs>
             <w:rPr/>
           </w:pPr>
-          <w:hyperlink w:anchor="__RefHeading___Toc11621_3199679052">
+          <w:hyperlink w:anchor="__RefHeading___Toc9121_2913971107">
             <w:r>
               <w:rPr>
                 <w:webHidden/>
@@ -1403,7 +1403,7 @@
             </w:tabs>
             <w:rPr/>
           </w:pPr>
-          <w:hyperlink w:anchor="__RefHeading___Toc11623_3199679052">
+          <w:hyperlink w:anchor="__RefHeading___Toc9123_2913971107">
             <w:r>
               <w:rPr>
                 <w:webHidden/>
@@ -1425,7 +1425,7 @@
             </w:tabs>
             <w:rPr/>
           </w:pPr>
-          <w:hyperlink w:anchor="__RefHeading___Toc11625_3199679052">
+          <w:hyperlink w:anchor="__RefHeading___Toc9125_2913971107">
             <w:r>
               <w:rPr>
                 <w:webHidden/>
@@ -1447,7 +1447,7 @@
             </w:tabs>
             <w:rPr/>
           </w:pPr>
-          <w:hyperlink w:anchor="__RefHeading___Toc11627_3199679052">
+          <w:hyperlink w:anchor="__RefHeading___Toc9127_2913971107">
             <w:r>
               <w:rPr>
                 <w:webHidden/>
@@ -1469,7 +1469,7 @@
             </w:tabs>
             <w:rPr/>
           </w:pPr>
-          <w:hyperlink w:anchor="__RefHeading___Toc11629_3199679052">
+          <w:hyperlink w:anchor="__RefHeading___Toc9129_2913971107">
             <w:r>
               <w:rPr>
                 <w:webHidden/>
@@ -1491,7 +1491,7 @@
             </w:tabs>
             <w:rPr/>
           </w:pPr>
-          <w:hyperlink w:anchor="__RefHeading___Toc11631_3199679052">
+          <w:hyperlink w:anchor="__RefHeading___Toc9131_2913971107">
             <w:r>
               <w:rPr>
                 <w:webHidden/>
@@ -1513,7 +1513,7 @@
             </w:tabs>
             <w:rPr/>
           </w:pPr>
-          <w:hyperlink w:anchor="__RefHeading___Toc11633_3199679052">
+          <w:hyperlink w:anchor="__RefHeading___Toc9133_2913971107">
             <w:r>
               <w:rPr>
                 <w:webHidden/>
@@ -1535,7 +1535,7 @@
             </w:tabs>
             <w:rPr/>
           </w:pPr>
-          <w:hyperlink w:anchor="__RefHeading___Toc11635_3199679052">
+          <w:hyperlink w:anchor="__RefHeading___Toc9135_2913971107">
             <w:r>
               <w:rPr>
                 <w:webHidden/>
@@ -1557,7 +1557,7 @@
             </w:tabs>
             <w:rPr/>
           </w:pPr>
-          <w:hyperlink w:anchor="__RefHeading___Toc11637_3199679052">
+          <w:hyperlink w:anchor="__RefHeading___Toc9137_2913971107">
             <w:r>
               <w:rPr>
                 <w:webHidden/>
@@ -1579,7 +1579,7 @@
             </w:tabs>
             <w:rPr/>
           </w:pPr>
-          <w:hyperlink w:anchor="__RefHeading___Toc11639_3199679052">
+          <w:hyperlink w:anchor="__RefHeading___Toc9139_2913971107">
             <w:r>
               <w:rPr>
                 <w:webHidden/>
@@ -1601,7 +1601,7 @@
             </w:tabs>
             <w:rPr/>
           </w:pPr>
-          <w:hyperlink w:anchor="__RefHeading___Toc11641_3199679052">
+          <w:hyperlink w:anchor="__RefHeading___Toc9141_2913971107">
             <w:r>
               <w:rPr>
                 <w:webHidden/>
@@ -1623,7 +1623,7 @@
             </w:tabs>
             <w:rPr/>
           </w:pPr>
-          <w:hyperlink w:anchor="__RefHeading___Toc11643_3199679052">
+          <w:hyperlink w:anchor="__RefHeading___Toc9143_2913971107">
             <w:r>
               <w:rPr>
                 <w:webHidden/>
@@ -1645,7 +1645,7 @@
             </w:tabs>
             <w:rPr/>
           </w:pPr>
-          <w:hyperlink w:anchor="__RefHeading___Toc11645_3199679052">
+          <w:hyperlink w:anchor="__RefHeading___Toc9145_2913971107">
             <w:r>
               <w:rPr>
                 <w:webHidden/>
@@ -1667,7 +1667,7 @@
             </w:tabs>
             <w:rPr/>
           </w:pPr>
-          <w:hyperlink w:anchor="__RefHeading___Toc11647_3199679052">
+          <w:hyperlink w:anchor="__RefHeading___Toc9147_2913971107">
             <w:r>
               <w:rPr>
                 <w:webHidden/>
@@ -1689,7 +1689,7 @@
             </w:tabs>
             <w:rPr/>
           </w:pPr>
-          <w:hyperlink w:anchor="__RefHeading___Toc11649_3199679052">
+          <w:hyperlink w:anchor="__RefHeading___Toc9149_2913971107">
             <w:r>
               <w:rPr>
                 <w:webHidden/>
@@ -1711,7 +1711,7 @@
             </w:tabs>
             <w:rPr/>
           </w:pPr>
-          <w:hyperlink w:anchor="__RefHeading___Toc11651_3199679052">
+          <w:hyperlink w:anchor="__RefHeading___Toc9151_2913971107">
             <w:r>
               <w:rPr>
                 <w:webHidden/>
@@ -1733,7 +1733,7 @@
             </w:tabs>
             <w:rPr/>
           </w:pPr>
-          <w:hyperlink w:anchor="__RefHeading___Toc11653_3199679052">
+          <w:hyperlink w:anchor="__RefHeading___Toc9153_2913971107">
             <w:r>
               <w:rPr>
                 <w:webHidden/>
@@ -1755,7 +1755,7 @@
             </w:tabs>
             <w:rPr/>
           </w:pPr>
-          <w:hyperlink w:anchor="__RefHeading___Toc11655_3199679052">
+          <w:hyperlink w:anchor="__RefHeading___Toc9155_2913971107">
             <w:r>
               <w:rPr>
                 <w:webHidden/>
@@ -1777,7 +1777,7 @@
             </w:tabs>
             <w:rPr/>
           </w:pPr>
-          <w:hyperlink w:anchor="__RefHeading___Toc11657_3199679052">
+          <w:hyperlink w:anchor="__RefHeading___Toc9157_2913971107">
             <w:r>
               <w:rPr>
                 <w:webHidden/>
@@ -1799,7 +1799,7 @@
             </w:tabs>
             <w:rPr/>
           </w:pPr>
-          <w:hyperlink w:anchor="__RefHeading___Toc11659_3199679052">
+          <w:hyperlink w:anchor="__RefHeading___Toc9159_2913971107">
             <w:r>
               <w:rPr>
                 <w:webHidden/>
@@ -1821,7 +1821,7 @@
             </w:tabs>
             <w:rPr/>
           </w:pPr>
-          <w:hyperlink w:anchor="__RefHeading___Toc11661_3199679052">
+          <w:hyperlink w:anchor="__RefHeading___Toc9161_2913971107">
             <w:r>
               <w:rPr>
                 <w:webHidden/>
@@ -1843,7 +1843,7 @@
             </w:tabs>
             <w:rPr/>
           </w:pPr>
-          <w:hyperlink w:anchor="__RefHeading___Toc11663_3199679052">
+          <w:hyperlink w:anchor="__RefHeading___Toc9163_2913971107">
             <w:r>
               <w:rPr>
                 <w:webHidden/>
@@ -1865,7 +1865,7 @@
             </w:tabs>
             <w:rPr/>
           </w:pPr>
-          <w:hyperlink w:anchor="__RefHeading___Toc11665_3199679052">
+          <w:hyperlink w:anchor="__RefHeading___Toc9165_2913971107">
             <w:r>
               <w:rPr>
                 <w:webHidden/>
@@ -1887,7 +1887,7 @@
             </w:tabs>
             <w:rPr/>
           </w:pPr>
-          <w:hyperlink w:anchor="__RefHeading___Toc11667_3199679052">
+          <w:hyperlink w:anchor="__RefHeading___Toc9167_2913971107">
             <w:r>
               <w:rPr>
                 <w:webHidden/>
@@ -1909,7 +1909,7 @@
             </w:tabs>
             <w:rPr/>
           </w:pPr>
-          <w:hyperlink w:anchor="__RefHeading___Toc11669_3199679052">
+          <w:hyperlink w:anchor="__RefHeading___Toc9169_2913971107">
             <w:r>
               <w:rPr>
                 <w:webHidden/>
@@ -1931,7 +1931,7 @@
             </w:tabs>
             <w:rPr/>
           </w:pPr>
-          <w:hyperlink w:anchor="__RefHeading___Toc11671_3199679052">
+          <w:hyperlink w:anchor="__RefHeading___Toc9171_2913971107">
             <w:r>
               <w:rPr>
                 <w:webHidden/>
@@ -1953,7 +1953,7 @@
             </w:tabs>
             <w:rPr/>
           </w:pPr>
-          <w:hyperlink w:anchor="__RefHeading___Toc11673_3199679052">
+          <w:hyperlink w:anchor="__RefHeading___Toc9173_2913971107">
             <w:r>
               <w:rPr>
                 <w:webHidden/>
@@ -1975,7 +1975,7 @@
             </w:tabs>
             <w:rPr/>
           </w:pPr>
-          <w:hyperlink w:anchor="__RefHeading___Toc11675_3199679052">
+          <w:hyperlink w:anchor="__RefHeading___Toc9175_2913971107">
             <w:r>
               <w:rPr>
                 <w:webHidden/>
@@ -1997,7 +1997,7 @@
             </w:tabs>
             <w:rPr/>
           </w:pPr>
-          <w:hyperlink w:anchor="__RefHeading___Toc11677_3199679052">
+          <w:hyperlink w:anchor="__RefHeading___Toc9177_2913971107">
             <w:r>
               <w:rPr>
                 <w:webHidden/>
@@ -2019,7 +2019,7 @@
             </w:tabs>
             <w:rPr/>
           </w:pPr>
-          <w:hyperlink w:anchor="__RefHeading___Toc11679_3199679052">
+          <w:hyperlink w:anchor="__RefHeading___Toc9179_2913971107">
             <w:r>
               <w:rPr>
                 <w:webHidden/>
@@ -2041,7 +2041,7 @@
             </w:tabs>
             <w:rPr/>
           </w:pPr>
-          <w:hyperlink w:anchor="__RefHeading___Toc11681_3199679052">
+          <w:hyperlink w:anchor="__RefHeading___Toc9181_2913971107">
             <w:r>
               <w:rPr>
                 <w:webHidden/>
@@ -2063,7 +2063,7 @@
             </w:tabs>
             <w:rPr/>
           </w:pPr>
-          <w:hyperlink w:anchor="__RefHeading___Toc11683_3199679052">
+          <w:hyperlink w:anchor="__RefHeading___Toc9183_2913971107">
             <w:r>
               <w:rPr>
                 <w:webHidden/>
@@ -2085,7 +2085,7 @@
             </w:tabs>
             <w:rPr/>
           </w:pPr>
-          <w:hyperlink w:anchor="__RefHeading___Toc11685_3199679052">
+          <w:hyperlink w:anchor="__RefHeading___Toc9185_2913971107">
             <w:r>
               <w:rPr>
                 <w:webHidden/>
@@ -2107,7 +2107,7 @@
             </w:tabs>
             <w:rPr/>
           </w:pPr>
-          <w:hyperlink w:anchor="__RefHeading___Toc11687_3199679052">
+          <w:hyperlink w:anchor="__RefHeading___Toc9187_2913971107">
             <w:r>
               <w:rPr>
                 <w:webHidden/>
@@ -2129,7 +2129,7 @@
             </w:tabs>
             <w:rPr/>
           </w:pPr>
-          <w:hyperlink w:anchor="__RefHeading___Toc11689_3199679052">
+          <w:hyperlink w:anchor="__RefHeading___Toc9189_2913971107">
             <w:r>
               <w:rPr>
                 <w:webHidden/>
@@ -2151,7 +2151,7 @@
             </w:tabs>
             <w:rPr/>
           </w:pPr>
-          <w:hyperlink w:anchor="__RefHeading___Toc11691_3199679052">
+          <w:hyperlink w:anchor="__RefHeading___Toc9191_2913971107">
             <w:r>
               <w:rPr>
                 <w:webHidden/>
@@ -2173,7 +2173,7 @@
             </w:tabs>
             <w:rPr/>
           </w:pPr>
-          <w:hyperlink w:anchor="__RefHeading___Toc11693_3199679052">
+          <w:hyperlink w:anchor="__RefHeading___Toc9193_2913971107">
             <w:r>
               <w:rPr>
                 <w:webHidden/>
@@ -2195,7 +2195,7 @@
             </w:tabs>
             <w:rPr/>
           </w:pPr>
-          <w:hyperlink w:anchor="__RefHeading___Toc11695_3199679052">
+          <w:hyperlink w:anchor="__RefHeading___Toc9195_2913971107">
             <w:r>
               <w:rPr>
                 <w:webHidden/>
@@ -2217,7 +2217,7 @@
             </w:tabs>
             <w:rPr/>
           </w:pPr>
-          <w:hyperlink w:anchor="__RefHeading___Toc11697_3199679052">
+          <w:hyperlink w:anchor="__RefHeading___Toc9197_2913971107">
             <w:r>
               <w:rPr>
                 <w:webHidden/>
@@ -2239,7 +2239,7 @@
             </w:tabs>
             <w:rPr/>
           </w:pPr>
-          <w:hyperlink w:anchor="__RefHeading___Toc11699_3199679052">
+          <w:hyperlink w:anchor="__RefHeading___Toc9199_2913971107">
             <w:r>
               <w:rPr>
                 <w:webHidden/>
@@ -2261,7 +2261,7 @@
             </w:tabs>
             <w:rPr/>
           </w:pPr>
-          <w:hyperlink w:anchor="__RefHeading___Toc11701_3199679052">
+          <w:hyperlink w:anchor="__RefHeading___Toc9201_2913971107">
             <w:r>
               <w:rPr>
                 <w:webHidden/>
@@ -2283,7 +2283,7 @@
             </w:tabs>
             <w:rPr/>
           </w:pPr>
-          <w:hyperlink w:anchor="__RefHeading___Toc11703_3199679052">
+          <w:hyperlink w:anchor="__RefHeading___Toc9203_2913971107">
             <w:r>
               <w:rPr>
                 <w:webHidden/>
@@ -2305,7 +2305,7 @@
             </w:tabs>
             <w:rPr/>
           </w:pPr>
-          <w:hyperlink w:anchor="__RefHeading___Toc11705_3199679052">
+          <w:hyperlink w:anchor="__RefHeading___Toc9205_2913971107">
             <w:r>
               <w:rPr>
                 <w:webHidden/>
@@ -2327,7 +2327,7 @@
             </w:tabs>
             <w:rPr/>
           </w:pPr>
-          <w:hyperlink w:anchor="__RefHeading___Toc11707_3199679052">
+          <w:hyperlink w:anchor="__RefHeading___Toc9207_2913971107">
             <w:r>
               <w:rPr>
                 <w:webHidden/>
@@ -2349,7 +2349,7 @@
             </w:tabs>
             <w:rPr/>
           </w:pPr>
-          <w:hyperlink w:anchor="__RefHeading___Toc11709_3199679052">
+          <w:hyperlink w:anchor="__RefHeading___Toc9209_2913971107">
             <w:r>
               <w:rPr>
                 <w:webHidden/>
@@ -2371,7 +2371,7 @@
             </w:tabs>
             <w:rPr/>
           </w:pPr>
-          <w:hyperlink w:anchor="__RefHeading___Toc11711_3199679052">
+          <w:hyperlink w:anchor="__RefHeading___Toc9211_2913971107">
             <w:r>
               <w:rPr>
                 <w:webHidden/>
@@ -2419,7 +2419,7 @@
       <w:r>
         <w:br w:type="page"/>
       </w:r>
-      <w:bookmarkStart w:id="0" w:name="__RefHeading___Toc11569_3199679052"/>
+      <w:bookmarkStart w:id="0" w:name="__RefHeading___Toc9069_2913971107"/>
       <w:bookmarkStart w:id="1" w:name="_Toc48319687"/>
       <w:bookmarkStart w:id="2" w:name="_Toc11824118"/>
       <w:bookmarkEnd w:id="0"/>
@@ -3064,7 +3064,7 @@
           <w:spacing w:val="0"/>
         </w:rPr>
       </w:pPr>
-      <w:bookmarkStart w:id="4" w:name="__RefHeading___Toc11571_3199679052"/>
+      <w:bookmarkStart w:id="4" w:name="__RefHeading___Toc9071_2913971107"/>
       <w:bookmarkStart w:id="5" w:name="_Toc233203388"/>
       <w:bookmarkEnd w:id="4"/>
       <w:r>
@@ -4685,7 +4685,7 @@
         <w:pageBreakBefore w:val="false"/>
         <w:rPr/>
       </w:pPr>
-      <w:bookmarkStart w:id="6" w:name="__RefHeading___Toc11573_3199679052"/>
+      <w:bookmarkStart w:id="6" w:name="__RefHeading___Toc9073_2913971107"/>
       <w:bookmarkEnd w:id="6"/>
       <w:r>
         <w:rPr>
@@ -4702,7 +4702,7 @@
         <w:pStyle w:val="Heading2"/>
         <w:rPr/>
       </w:pPr>
-      <w:bookmarkStart w:id="7" w:name="__RefHeading___Toc11575_3199679052"/>
+      <w:bookmarkStart w:id="7" w:name="__RefHeading___Toc9075_2913971107"/>
       <w:bookmarkEnd w:id="7"/>
       <w:r>
         <w:rPr>
@@ -4734,7 +4734,7 @@
         <w:pStyle w:val="Heading2"/>
         <w:rPr/>
       </w:pPr>
-      <w:bookmarkStart w:id="8" w:name="__RefHeading___Toc11577_3199679052"/>
+      <w:bookmarkStart w:id="8" w:name="__RefHeading___Toc9077_2913971107"/>
       <w:bookmarkEnd w:id="8"/>
       <w:r>
         <w:rPr>
@@ -4849,7 +4849,7 @@
         <w:pStyle w:val="Heading1"/>
         <w:rPr/>
       </w:pPr>
-      <w:bookmarkStart w:id="9" w:name="__RefHeading___Toc11579_3199679052"/>
+      <w:bookmarkStart w:id="9" w:name="__RefHeading___Toc9079_2913971107"/>
       <w:bookmarkEnd w:id="9"/>
       <w:r>
         <w:rPr>
@@ -4866,7 +4866,7 @@
         <w:pStyle w:val="Heading2"/>
         <w:rPr/>
       </w:pPr>
-      <w:bookmarkStart w:id="10" w:name="__RefHeading___Toc11581_3199679052"/>
+      <w:bookmarkStart w:id="10" w:name="__RefHeading___Toc9081_2913971107"/>
       <w:bookmarkEnd w:id="10"/>
       <w:r>
         <w:rPr>
@@ -4898,7 +4898,7 @@
         <w:pStyle w:val="Heading2"/>
         <w:rPr/>
       </w:pPr>
-      <w:bookmarkStart w:id="11" w:name="__RefHeading___Toc11583_3199679052"/>
+      <w:bookmarkStart w:id="11" w:name="__RefHeading___Toc9083_2913971107"/>
       <w:bookmarkEnd w:id="11"/>
       <w:r>
         <w:rPr>
@@ -4930,7 +4930,7 @@
         <w:pStyle w:val="Heading2"/>
         <w:rPr/>
       </w:pPr>
-      <w:bookmarkStart w:id="12" w:name="__RefHeading___Toc11585_3199679052"/>
+      <w:bookmarkStart w:id="12" w:name="__RefHeading___Toc9085_2913971107"/>
       <w:bookmarkEnd w:id="12"/>
       <w:r>
         <w:rPr>
@@ -4962,7 +4962,7 @@
         <w:pStyle w:val="Heading2"/>
         <w:rPr/>
       </w:pPr>
-      <w:bookmarkStart w:id="13" w:name="__RefHeading___Toc11587_3199679052"/>
+      <w:bookmarkStart w:id="13" w:name="__RefHeading___Toc9087_2913971107"/>
       <w:bookmarkEnd w:id="13"/>
       <w:r>
         <w:rPr>
@@ -4994,7 +4994,7 @@
         <w:pStyle w:val="Heading2"/>
         <w:rPr/>
       </w:pPr>
-      <w:bookmarkStart w:id="14" w:name="__RefHeading___Toc11589_3199679052"/>
+      <w:bookmarkStart w:id="14" w:name="__RefHeading___Toc9089_2913971107"/>
       <w:bookmarkEnd w:id="14"/>
       <w:r>
         <w:rPr>
@@ -5026,7 +5026,7 @@
         <w:pStyle w:val="Heading2"/>
         <w:rPr/>
       </w:pPr>
-      <w:bookmarkStart w:id="15" w:name="__RefHeading___Toc11591_3199679052"/>
+      <w:bookmarkStart w:id="15" w:name="__RefHeading___Toc9091_2913971107"/>
       <w:bookmarkEnd w:id="15"/>
       <w:r>
         <w:rPr>
@@ -5058,7 +5058,7 @@
         <w:pStyle w:val="Heading2"/>
         <w:rPr/>
       </w:pPr>
-      <w:bookmarkStart w:id="16" w:name="__RefHeading___Toc11593_3199679052"/>
+      <w:bookmarkStart w:id="16" w:name="__RefHeading___Toc9093_2913971107"/>
       <w:bookmarkEnd w:id="16"/>
       <w:r>
         <w:rPr>
@@ -5090,7 +5090,7 @@
         <w:pStyle w:val="Heading2"/>
         <w:rPr/>
       </w:pPr>
-      <w:bookmarkStart w:id="17" w:name="__RefHeading___Toc11595_3199679052"/>
+      <w:bookmarkStart w:id="17" w:name="__RefHeading___Toc9095_2913971107"/>
       <w:bookmarkEnd w:id="17"/>
       <w:r>
         <w:rPr>
@@ -5122,7 +5122,7 @@
         <w:pStyle w:val="Heading2"/>
         <w:rPr/>
       </w:pPr>
-      <w:bookmarkStart w:id="18" w:name="__RefHeading___Toc11597_3199679052"/>
+      <w:bookmarkStart w:id="18" w:name="__RefHeading___Toc9097_2913971107"/>
       <w:bookmarkEnd w:id="18"/>
       <w:r>
         <w:rPr>
@@ -5154,7 +5154,7 @@
         <w:pStyle w:val="Heading2"/>
         <w:rPr/>
       </w:pPr>
-      <w:bookmarkStart w:id="19" w:name="__RefHeading___Toc11599_3199679052"/>
+      <w:bookmarkStart w:id="19" w:name="__RefHeading___Toc9099_2913971107"/>
       <w:bookmarkEnd w:id="19"/>
       <w:r>
         <w:rPr>
@@ -5189,7 +5189,7 @@
         <w:pStyle w:val="Heading1"/>
         <w:rPr/>
       </w:pPr>
-      <w:bookmarkStart w:id="20" w:name="__RefHeading___Toc11601_3199679052"/>
+      <w:bookmarkStart w:id="20" w:name="__RefHeading___Toc9101_2913971107"/>
       <w:bookmarkEnd w:id="20"/>
       <w:r>
         <w:rPr>
@@ -5206,7 +5206,7 @@
         <w:pStyle w:val="Heading2"/>
         <w:rPr/>
       </w:pPr>
-      <w:bookmarkStart w:id="21" w:name="__RefHeading___Toc11603_3199679052"/>
+      <w:bookmarkStart w:id="21" w:name="__RefHeading___Toc9103_2913971107"/>
       <w:bookmarkEnd w:id="21"/>
       <w:r>
         <w:rPr>
@@ -5238,7 +5238,7 @@
         <w:pStyle w:val="Heading2"/>
         <w:rPr/>
       </w:pPr>
-      <w:bookmarkStart w:id="22" w:name="__RefHeading___Toc11605_3199679052"/>
+      <w:bookmarkStart w:id="22" w:name="__RefHeading___Toc9105_2913971107"/>
       <w:bookmarkEnd w:id="22"/>
       <w:r>
         <w:rPr>
@@ -5270,7 +5270,7 @@
         <w:pStyle w:val="Heading2"/>
         <w:rPr/>
       </w:pPr>
-      <w:bookmarkStart w:id="23" w:name="__RefHeading___Toc11607_3199679052"/>
+      <w:bookmarkStart w:id="23" w:name="__RefHeading___Toc9107_2913971107"/>
       <w:bookmarkEnd w:id="23"/>
       <w:r>
         <w:rPr>
@@ -5302,7 +5302,7 @@
         <w:pStyle w:val="Heading2"/>
         <w:rPr/>
       </w:pPr>
-      <w:bookmarkStart w:id="24" w:name="__RefHeading___Toc11609_3199679052"/>
+      <w:bookmarkStart w:id="24" w:name="__RefHeading___Toc9109_2913971107"/>
       <w:bookmarkEnd w:id="24"/>
       <w:r>
         <w:rPr>
@@ -5334,7 +5334,7 @@
         <w:pStyle w:val="Heading2"/>
         <w:rPr/>
       </w:pPr>
-      <w:bookmarkStart w:id="25" w:name="__RefHeading___Toc11611_3199679052"/>
+      <w:bookmarkStart w:id="25" w:name="__RefHeading___Toc9111_2913971107"/>
       <w:bookmarkEnd w:id="25"/>
       <w:r>
         <w:rPr>
@@ -5366,7 +5366,7 @@
         <w:pStyle w:val="Heading2"/>
         <w:rPr/>
       </w:pPr>
-      <w:bookmarkStart w:id="26" w:name="__RefHeading___Toc11613_3199679052"/>
+      <w:bookmarkStart w:id="26" w:name="__RefHeading___Toc9113_2913971107"/>
       <w:bookmarkEnd w:id="26"/>
       <w:r>
         <w:rPr>
@@ -5508,7 +5508,7 @@
         <w:pStyle w:val="Heading2"/>
         <w:rPr/>
       </w:pPr>
-      <w:bookmarkStart w:id="27" w:name="__RefHeading___Toc11615_3199679052"/>
+      <w:bookmarkStart w:id="27" w:name="__RefHeading___Toc9115_2913971107"/>
       <w:bookmarkEnd w:id="27"/>
       <w:r>
         <w:rPr>
@@ -5543,7 +5543,7 @@
         <w:pStyle w:val="Heading1"/>
         <w:rPr/>
       </w:pPr>
-      <w:bookmarkStart w:id="28" w:name="__RefHeading___Toc11617_3199679052"/>
+      <w:bookmarkStart w:id="28" w:name="__RefHeading___Toc9117_2913971107"/>
       <w:bookmarkEnd w:id="28"/>
       <w:r>
         <w:rPr>
@@ -5560,7 +5560,7 @@
         <w:pStyle w:val="Heading2"/>
         <w:rPr/>
       </w:pPr>
-      <w:bookmarkStart w:id="29" w:name="__RefHeading___Toc11619_3199679052"/>
+      <w:bookmarkStart w:id="29" w:name="__RefHeading___Toc9119_2913971107"/>
       <w:bookmarkEnd w:id="29"/>
       <w:r>
         <w:rPr>
@@ -5592,7 +5592,7 @@
         <w:pStyle w:val="Heading2"/>
         <w:rPr/>
       </w:pPr>
-      <w:bookmarkStart w:id="30" w:name="__RefHeading___Toc11621_3199679052"/>
+      <w:bookmarkStart w:id="30" w:name="__RefHeading___Toc9121_2913971107"/>
       <w:bookmarkEnd w:id="30"/>
       <w:r>
         <w:rPr>
@@ -5624,7 +5624,7 @@
         <w:pStyle w:val="Heading2"/>
         <w:rPr/>
       </w:pPr>
-      <w:bookmarkStart w:id="31" w:name="__RefHeading___Toc11623_3199679052"/>
+      <w:bookmarkStart w:id="31" w:name="__RefHeading___Toc9123_2913971107"/>
       <w:bookmarkEnd w:id="31"/>
       <w:r>
         <w:rPr>
@@ -5656,7 +5656,7 @@
         <w:pStyle w:val="Heading2"/>
         <w:rPr/>
       </w:pPr>
-      <w:bookmarkStart w:id="32" w:name="__RefHeading___Toc11625_3199679052"/>
+      <w:bookmarkStart w:id="32" w:name="__RefHeading___Toc9125_2913971107"/>
       <w:bookmarkEnd w:id="32"/>
       <w:r>
         <w:rPr>
@@ -5688,7 +5688,7 @@
         <w:pStyle w:val="Heading2"/>
         <w:rPr/>
       </w:pPr>
-      <w:bookmarkStart w:id="33" w:name="__RefHeading___Toc11627_3199679052"/>
+      <w:bookmarkStart w:id="33" w:name="__RefHeading___Toc9127_2913971107"/>
       <w:bookmarkEnd w:id="33"/>
       <w:r>
         <w:rPr>
@@ -5723,7 +5723,7 @@
         <w:pStyle w:val="Heading1"/>
         <w:rPr/>
       </w:pPr>
-      <w:bookmarkStart w:id="34" w:name="__RefHeading___Toc11629_3199679052"/>
+      <w:bookmarkStart w:id="34" w:name="__RefHeading___Toc9129_2913971107"/>
       <w:bookmarkEnd w:id="34"/>
       <w:r>
         <w:rPr>
@@ -5740,7 +5740,7 @@
         <w:pStyle w:val="Heading2"/>
         <w:rPr/>
       </w:pPr>
-      <w:bookmarkStart w:id="35" w:name="__RefHeading___Toc11631_3199679052"/>
+      <w:bookmarkStart w:id="35" w:name="__RefHeading___Toc9131_2913971107"/>
       <w:bookmarkEnd w:id="35"/>
       <w:r>
         <w:rPr>
@@ -5772,7 +5772,7 @@
         <w:pStyle w:val="Heading2"/>
         <w:rPr/>
       </w:pPr>
-      <w:bookmarkStart w:id="36" w:name="__RefHeading___Toc11633_3199679052"/>
+      <w:bookmarkStart w:id="36" w:name="__RefHeading___Toc9133_2913971107"/>
       <w:bookmarkEnd w:id="36"/>
       <w:r>
         <w:rPr>
@@ -5804,7 +5804,7 @@
         <w:pStyle w:val="Heading2"/>
         <w:rPr/>
       </w:pPr>
-      <w:bookmarkStart w:id="37" w:name="__RefHeading___Toc11635_3199679052"/>
+      <w:bookmarkStart w:id="37" w:name="__RefHeading___Toc9135_2913971107"/>
       <w:bookmarkEnd w:id="37"/>
       <w:r>
         <w:rPr>
@@ -5836,7 +5836,7 @@
         <w:pStyle w:val="Heading2"/>
         <w:rPr/>
       </w:pPr>
-      <w:bookmarkStart w:id="38" w:name="__RefHeading___Toc11637_3199679052"/>
+      <w:bookmarkStart w:id="38" w:name="__RefHeading___Toc9137_2913971107"/>
       <w:bookmarkEnd w:id="38"/>
       <w:r>
         <w:rPr>
@@ -5868,7 +5868,7 @@
         <w:pStyle w:val="Heading2"/>
         <w:rPr/>
       </w:pPr>
-      <w:bookmarkStart w:id="39" w:name="__RefHeading___Toc11639_3199679052"/>
+      <w:bookmarkStart w:id="39" w:name="__RefHeading___Toc9139_2913971107"/>
       <w:bookmarkEnd w:id="39"/>
       <w:r>
         <w:rPr>
@@ -5900,7 +5900,7 @@
         <w:pStyle w:val="Heading2"/>
         <w:rPr/>
       </w:pPr>
-      <w:bookmarkStart w:id="40" w:name="__RefHeading___Toc11641_3199679052"/>
+      <w:bookmarkStart w:id="40" w:name="__RefHeading___Toc9141_2913971107"/>
       <w:bookmarkEnd w:id="40"/>
       <w:r>
         <w:rPr>
@@ -5935,7 +5935,7 @@
         <w:pStyle w:val="Heading1"/>
         <w:rPr/>
       </w:pPr>
-      <w:bookmarkStart w:id="41" w:name="__RefHeading___Toc11643_3199679052"/>
+      <w:bookmarkStart w:id="41" w:name="__RefHeading___Toc9143_2913971107"/>
       <w:bookmarkEnd w:id="41"/>
       <w:r>
         <w:rPr>
@@ -5952,7 +5952,7 @@
         <w:pStyle w:val="Heading2"/>
         <w:rPr/>
       </w:pPr>
-      <w:bookmarkStart w:id="42" w:name="__RefHeading___Toc11645_3199679052"/>
+      <w:bookmarkStart w:id="42" w:name="__RefHeading___Toc9145_2913971107"/>
       <w:bookmarkEnd w:id="42"/>
       <w:r>
         <w:rPr>
@@ -5984,7 +5984,7 @@
         <w:pStyle w:val="Heading2"/>
         <w:rPr/>
       </w:pPr>
-      <w:bookmarkStart w:id="43" w:name="__RefHeading___Toc11647_3199679052"/>
+      <w:bookmarkStart w:id="43" w:name="__RefHeading___Toc9147_2913971107"/>
       <w:bookmarkEnd w:id="43"/>
       <w:r>
         <w:rPr>
@@ -6016,7 +6016,7 @@
         <w:pStyle w:val="Heading2"/>
         <w:rPr/>
       </w:pPr>
-      <w:bookmarkStart w:id="44" w:name="__RefHeading___Toc11649_3199679052"/>
+      <w:bookmarkStart w:id="44" w:name="__RefHeading___Toc9149_2913971107"/>
       <w:bookmarkEnd w:id="44"/>
       <w:r>
         <w:rPr>
@@ -6048,7 +6048,7 @@
         <w:pStyle w:val="Heading2"/>
         <w:rPr/>
       </w:pPr>
-      <w:bookmarkStart w:id="45" w:name="__RefHeading___Toc11651_3199679052"/>
+      <w:bookmarkStart w:id="45" w:name="__RefHeading___Toc9151_2913971107"/>
       <w:bookmarkEnd w:id="45"/>
       <w:r>
         <w:rPr>
@@ -6072,7 +6072,7 @@
           <w:color w:val="101820"/>
           <w:sz w:val="21"/>
         </w:rPr>
-        <w:t>Train-the-trainer for key users, then end-user training per role, using the user manual (199 pages) and the role guides for the seven roles. Training days are included per tier; extra trainer days are PHP 30,000.00.</w:t>
+        <w:t>Train-the-trainer for key users, then end-user training per role, using the user manual (186 pages) and the role guides for the seven roles. Training days are included per tier; extra trainer days are PHP 30,000.00.</w:t>
       </w:r>
       <w:r>
         <w:br w:type="page"/>
@@ -6083,7 +6083,7 @@
         <w:pStyle w:val="Heading1"/>
         <w:rPr/>
       </w:pPr>
-      <w:bookmarkStart w:id="46" w:name="__RefHeading___Toc11653_3199679052"/>
+      <w:bookmarkStart w:id="46" w:name="__RefHeading___Toc9153_2913971107"/>
       <w:bookmarkEnd w:id="46"/>
       <w:r>
         <w:rPr>
@@ -6100,7 +6100,7 @@
         <w:pStyle w:val="Heading2"/>
         <w:rPr/>
       </w:pPr>
-      <w:bookmarkStart w:id="47" w:name="__RefHeading___Toc11655_3199679052"/>
+      <w:bookmarkStart w:id="47" w:name="__RefHeading___Toc9155_2913971107"/>
       <w:bookmarkEnd w:id="47"/>
       <w:r>
         <w:rPr>
@@ -6132,7 +6132,7 @@
         <w:pStyle w:val="Heading2"/>
         <w:rPr/>
       </w:pPr>
-      <w:bookmarkStart w:id="48" w:name="__RefHeading___Toc11657_3199679052"/>
+      <w:bookmarkStart w:id="48" w:name="__RefHeading___Toc9157_2913971107"/>
       <w:bookmarkEnd w:id="48"/>
       <w:r>
         <w:rPr>
@@ -6164,7 +6164,7 @@
         <w:pStyle w:val="Heading2"/>
         <w:rPr/>
       </w:pPr>
-      <w:bookmarkStart w:id="49" w:name="__RefHeading___Toc11659_3199679052"/>
+      <w:bookmarkStart w:id="49" w:name="__RefHeading___Toc9159_2913971107"/>
       <w:bookmarkEnd w:id="49"/>
       <w:r>
         <w:rPr>
@@ -6199,7 +6199,7 @@
         <w:pStyle w:val="Heading1"/>
         <w:rPr/>
       </w:pPr>
-      <w:bookmarkStart w:id="50" w:name="__RefHeading___Toc11661_3199679052"/>
+      <w:bookmarkStart w:id="50" w:name="__RefHeading___Toc9161_2913971107"/>
       <w:bookmarkEnd w:id="50"/>
       <w:r>
         <w:rPr>
@@ -6216,7 +6216,7 @@
         <w:pStyle w:val="Heading2"/>
         <w:rPr/>
       </w:pPr>
-      <w:bookmarkStart w:id="51" w:name="__RefHeading___Toc11663_3199679052"/>
+      <w:bookmarkStart w:id="51" w:name="__RefHeading___Toc9163_2913971107"/>
       <w:bookmarkEnd w:id="51"/>
       <w:r>
         <w:rPr>
@@ -6248,7 +6248,7 @@
         <w:pStyle w:val="Heading2"/>
         <w:rPr/>
       </w:pPr>
-      <w:bookmarkStart w:id="52" w:name="__RefHeading___Toc11665_3199679052"/>
+      <w:bookmarkStart w:id="52" w:name="__RefHeading___Toc9165_2913971107"/>
       <w:bookmarkEnd w:id="52"/>
       <w:r>
         <w:rPr>
@@ -6280,7 +6280,7 @@
         <w:pStyle w:val="Heading2"/>
         <w:rPr/>
       </w:pPr>
-      <w:bookmarkStart w:id="53" w:name="__RefHeading___Toc11667_3199679052"/>
+      <w:bookmarkStart w:id="53" w:name="__RefHeading___Toc9167_2913971107"/>
       <w:bookmarkEnd w:id="53"/>
       <w:r>
         <w:rPr>
@@ -6312,7 +6312,7 @@
         <w:pStyle w:val="Heading2"/>
         <w:rPr/>
       </w:pPr>
-      <w:bookmarkStart w:id="54" w:name="__RefHeading___Toc11669_3199679052"/>
+      <w:bookmarkStart w:id="54" w:name="__RefHeading___Toc9169_2913971107"/>
       <w:bookmarkEnd w:id="54"/>
       <w:r>
         <w:rPr>
@@ -6344,7 +6344,7 @@
         <w:pStyle w:val="Heading2"/>
         <w:rPr/>
       </w:pPr>
-      <w:bookmarkStart w:id="55" w:name="__RefHeading___Toc11671_3199679052"/>
+      <w:bookmarkStart w:id="55" w:name="__RefHeading___Toc9171_2913971107"/>
       <w:bookmarkEnd w:id="55"/>
       <w:r>
         <w:rPr>
@@ -6376,7 +6376,7 @@
         <w:pStyle w:val="Heading2"/>
         <w:rPr/>
       </w:pPr>
-      <w:bookmarkStart w:id="56" w:name="__RefHeading___Toc11673_3199679052"/>
+      <w:bookmarkStart w:id="56" w:name="__RefHeading___Toc9173_2913971107"/>
       <w:bookmarkEnd w:id="56"/>
       <w:r>
         <w:rPr>
@@ -6411,7 +6411,7 @@
         <w:pStyle w:val="Heading1"/>
         <w:rPr/>
       </w:pPr>
-      <w:bookmarkStart w:id="57" w:name="__RefHeading___Toc11675_3199679052"/>
+      <w:bookmarkStart w:id="57" w:name="__RefHeading___Toc9175_2913971107"/>
       <w:bookmarkEnd w:id="57"/>
       <w:r>
         <w:rPr>
@@ -6428,7 +6428,7 @@
         <w:pStyle w:val="Heading2"/>
         <w:rPr/>
       </w:pPr>
-      <w:bookmarkStart w:id="58" w:name="__RefHeading___Toc11677_3199679052"/>
+      <w:bookmarkStart w:id="58" w:name="__RefHeading___Toc9177_2913971107"/>
       <w:bookmarkEnd w:id="58"/>
       <w:r>
         <w:rPr>
@@ -6521,7 +6521,7 @@
         <w:pStyle w:val="Heading2"/>
         <w:rPr/>
       </w:pPr>
-      <w:bookmarkStart w:id="59" w:name="__RefHeading___Toc11679_3199679052"/>
+      <w:bookmarkStart w:id="59" w:name="__RefHeading___Toc9179_2913971107"/>
       <w:bookmarkEnd w:id="59"/>
       <w:r>
         <w:rPr>
@@ -6610,7 +6610,7 @@
         <w:pStyle w:val="Heading2"/>
         <w:rPr/>
       </w:pPr>
-      <w:bookmarkStart w:id="60" w:name="__RefHeading___Toc11681_3199679052"/>
+      <w:bookmarkStart w:id="60" w:name="__RefHeading___Toc9181_2913971107"/>
       <w:bookmarkEnd w:id="60"/>
       <w:r>
         <w:rPr>
@@ -6699,7 +6699,7 @@
         <w:pStyle w:val="Heading2"/>
         <w:rPr/>
       </w:pPr>
-      <w:bookmarkStart w:id="61" w:name="__RefHeading___Toc11683_3199679052"/>
+      <w:bookmarkStart w:id="61" w:name="__RefHeading___Toc9183_2913971107"/>
       <w:bookmarkEnd w:id="61"/>
       <w:r>
         <w:rPr>
@@ -6788,7 +6788,7 @@
         <w:pStyle w:val="Heading2"/>
         <w:rPr/>
       </w:pPr>
-      <w:bookmarkStart w:id="62" w:name="__RefHeading___Toc11685_3199679052"/>
+      <w:bookmarkStart w:id="62" w:name="__RefHeading___Toc9185_2913971107"/>
       <w:bookmarkEnd w:id="62"/>
       <w:r>
         <w:rPr>
@@ -6877,7 +6877,7 @@
         <w:pStyle w:val="Heading2"/>
         <w:rPr/>
       </w:pPr>
-      <w:bookmarkStart w:id="63" w:name="__RefHeading___Toc11687_3199679052"/>
+      <w:bookmarkStart w:id="63" w:name="__RefHeading___Toc9187_2913971107"/>
       <w:bookmarkEnd w:id="63"/>
       <w:r>
         <w:rPr>
@@ -6966,7 +6966,7 @@
         <w:pStyle w:val="Heading2"/>
         <w:rPr/>
       </w:pPr>
-      <w:bookmarkStart w:id="64" w:name="__RefHeading___Toc11689_3199679052"/>
+      <w:bookmarkStart w:id="64" w:name="__RefHeading___Toc9189_2913971107"/>
       <w:bookmarkEnd w:id="64"/>
       <w:r>
         <w:rPr>
@@ -7055,7 +7055,7 @@
         <w:pStyle w:val="Heading2"/>
         <w:rPr/>
       </w:pPr>
-      <w:bookmarkStart w:id="65" w:name="__RefHeading___Toc11691_3199679052"/>
+      <w:bookmarkStart w:id="65" w:name="__RefHeading___Toc9191_2913971107"/>
       <w:bookmarkEnd w:id="65"/>
       <w:r>
         <w:rPr>
@@ -7144,7 +7144,7 @@
         <w:pStyle w:val="Heading2"/>
         <w:rPr/>
       </w:pPr>
-      <w:bookmarkStart w:id="66" w:name="__RefHeading___Toc11693_3199679052"/>
+      <w:bookmarkStart w:id="66" w:name="__RefHeading___Toc9193_2913971107"/>
       <w:bookmarkEnd w:id="66"/>
       <w:r>
         <w:rPr>
@@ -7233,7 +7233,7 @@
         <w:pStyle w:val="Heading2"/>
         <w:rPr/>
       </w:pPr>
-      <w:bookmarkStart w:id="67" w:name="__RefHeading___Toc11695_3199679052"/>
+      <w:bookmarkStart w:id="67" w:name="__RefHeading___Toc9195_2913971107"/>
       <w:bookmarkEnd w:id="67"/>
       <w:r>
         <w:rPr>
@@ -7322,7 +7322,7 @@
         <w:pStyle w:val="Heading2"/>
         <w:rPr/>
       </w:pPr>
-      <w:bookmarkStart w:id="68" w:name="__RefHeading___Toc11697_3199679052"/>
+      <w:bookmarkStart w:id="68" w:name="__RefHeading___Toc9197_2913971107"/>
       <w:bookmarkEnd w:id="68"/>
       <w:r>
         <w:rPr>
@@ -7411,7 +7411,7 @@
         <w:pStyle w:val="Heading2"/>
         <w:rPr/>
       </w:pPr>
-      <w:bookmarkStart w:id="69" w:name="__RefHeading___Toc11699_3199679052"/>
+      <w:bookmarkStart w:id="69" w:name="__RefHeading___Toc9199_2913971107"/>
       <w:bookmarkEnd w:id="69"/>
       <w:r>
         <w:rPr>
@@ -7452,7 +7452,7 @@
         <w:pStyle w:val="Heading2"/>
         <w:rPr/>
       </w:pPr>
-      <w:bookmarkStart w:id="70" w:name="__RefHeading___Toc11701_3199679052"/>
+      <w:bookmarkStart w:id="70" w:name="__RefHeading___Toc9201_2913971107"/>
       <w:bookmarkEnd w:id="70"/>
       <w:r>
         <w:rPr>
@@ -7493,7 +7493,7 @@
         <w:pStyle w:val="Heading2"/>
         <w:rPr/>
       </w:pPr>
-      <w:bookmarkStart w:id="71" w:name="__RefHeading___Toc11703_3199679052"/>
+      <w:bookmarkStart w:id="71" w:name="__RefHeading___Toc9203_2913971107"/>
       <w:bookmarkEnd w:id="71"/>
       <w:r>
         <w:rPr>
@@ -7534,7 +7534,7 @@
         <w:pStyle w:val="Heading2"/>
         <w:rPr/>
       </w:pPr>
-      <w:bookmarkStart w:id="72" w:name="__RefHeading___Toc11705_3199679052"/>
+      <w:bookmarkStart w:id="72" w:name="__RefHeading___Toc9205_2913971107"/>
       <w:bookmarkEnd w:id="72"/>
       <w:r>
         <w:rPr>
@@ -7599,7 +7599,7 @@
         <w:pStyle w:val="Heading2"/>
         <w:rPr/>
       </w:pPr>
-      <w:bookmarkStart w:id="73" w:name="__RefHeading___Toc11707_3199679052"/>
+      <w:bookmarkStart w:id="73" w:name="__RefHeading___Toc9207_2913971107"/>
       <w:bookmarkEnd w:id="73"/>
       <w:r>
         <w:rPr>
@@ -7643,7 +7643,7 @@
         <w:pStyle w:val="Heading1"/>
         <w:rPr/>
       </w:pPr>
-      <w:bookmarkStart w:id="74" w:name="__RefHeading___Toc11709_3199679052"/>
+      <w:bookmarkStart w:id="74" w:name="__RefHeading___Toc9209_2913971107"/>
       <w:bookmarkEnd w:id="74"/>
       <w:r>
         <w:rPr>
@@ -8861,7 +8861,7 @@
       <w:r>
         <w:br w:type="page"/>
       </w:r>
-      <w:bookmarkStart w:id="75" w:name="__RefHeading___Toc11711_3199679052"/>
+      <w:bookmarkStart w:id="75" w:name="__RefHeading___Toc9211_2913971107"/>
       <w:bookmarkStart w:id="76" w:name="_Toc233203395"/>
       <w:bookmarkEnd w:id="75"/>
       <w:r>

</xml_diff>

<commit_message>
Hosting priced per environment set; environment model by broker size (in progress)
</commit_message>
<xml_diff>
--- a/docs/package/01_Sales/iNXT_BrokerVerse_FAQ_and_Objection_Handling.docx
+++ b/docs/package/01_Sales/iNXT_BrokerVerse_FAQ_and_Objection_Handling.docx
@@ -10,7 +10,7 @@
       <w:r>
         <w:rPr/>
         <w:drawing>
-          <wp:anchor behindDoc="1" distT="0" distB="0" distL="0" distR="0" simplePos="0" locked="0" layoutInCell="0" allowOverlap="1" relativeHeight="24">
+          <wp:anchor behindDoc="1" distT="0" distB="0" distL="0" distR="0" simplePos="0" locked="0" layoutInCell="0" allowOverlap="1" relativeHeight="25">
             <wp:simplePos x="0" y="0"/>
             <wp:positionH relativeFrom="margin">
               <wp:posOffset>-914400</wp:posOffset>
@@ -55,7 +55,7 @@
           </wp:anchor>
         </w:drawing>
         <w:drawing>
-          <wp:anchor behindDoc="1" distT="0" distB="0" distL="0" distR="0" simplePos="0" locked="0" layoutInCell="0" allowOverlap="1" relativeHeight="35">
+          <wp:anchor behindDoc="1" distT="0" distB="0" distL="0" distR="0" simplePos="0" locked="0" layoutInCell="0" allowOverlap="1" relativeHeight="36">
             <wp:simplePos x="0" y="0"/>
             <wp:positionH relativeFrom="margin">
               <wp:align>center</wp:align>
@@ -111,7 +111,7 @@
         <mc:AlternateContent>
           <mc:Choice Requires="wps">
             <w:drawing>
-              <wp:anchor behindDoc="0" distT="45720" distB="45720" distL="114300" distR="114300" simplePos="0" locked="0" layoutInCell="0" allowOverlap="1" relativeHeight="25" wp14:anchorId="3D43415C">
+              <wp:anchor behindDoc="0" distT="45720" distB="45720" distL="114300" distR="114300" simplePos="0" locked="0" layoutInCell="0" allowOverlap="1" relativeHeight="26" wp14:anchorId="3D43415C">
                 <wp:simplePos x="0" y="0"/>
                 <wp:positionH relativeFrom="page">
                   <wp:posOffset>194310</wp:posOffset>
@@ -226,7 +226,7 @@
         <mc:AlternateContent>
           <mc:Choice Requires="wps">
             <w:drawing>
-              <wp:anchor behindDoc="0" distT="45720" distB="45720" distL="113030" distR="114935" simplePos="0" locked="0" layoutInCell="0" allowOverlap="1" relativeHeight="27" wp14:anchorId="58C23128">
+              <wp:anchor behindDoc="0" distT="45720" distB="45720" distL="113030" distR="114935" simplePos="0" locked="0" layoutInCell="0" allowOverlap="1" relativeHeight="28" wp14:anchorId="58C23128">
                 <wp:simplePos x="0" y="0"/>
                 <wp:positionH relativeFrom="page">
                   <wp:posOffset>3094990</wp:posOffset>
@@ -341,7 +341,7 @@
         <mc:AlternateContent>
           <mc:Choice Requires="wps">
             <w:drawing>
-              <wp:anchor behindDoc="0" distT="45720" distB="45720" distL="114300" distR="113665" simplePos="0" locked="0" layoutInCell="0" allowOverlap="1" relativeHeight="29" wp14:anchorId="1BF25123">
+              <wp:anchor behindDoc="0" distT="45720" distB="45720" distL="114300" distR="113665" simplePos="0" locked="0" layoutInCell="0" allowOverlap="1" relativeHeight="30" wp14:anchorId="1BF25123">
                 <wp:simplePos x="0" y="0"/>
                 <wp:positionH relativeFrom="page">
                   <wp:posOffset>4992370</wp:posOffset>
@@ -456,7 +456,7 @@
         <mc:AlternateContent>
           <mc:Choice Requires="wps">
             <w:drawing>
-              <wp:anchor behindDoc="0" distT="45720" distB="46355" distL="114300" distR="114300" simplePos="0" locked="0" layoutInCell="0" allowOverlap="1" relativeHeight="31" wp14:anchorId="01DE2BF4">
+              <wp:anchor behindDoc="0" distT="45720" distB="46355" distL="114300" distR="114300" simplePos="0" locked="0" layoutInCell="0" allowOverlap="1" relativeHeight="32" wp14:anchorId="01DE2BF4">
                 <wp:simplePos x="0" y="0"/>
                 <wp:positionH relativeFrom="margin">
                   <wp:align>center</wp:align>
@@ -601,7 +601,7 @@
         <mc:AlternateContent>
           <mc:Choice Requires="wps">
             <w:drawing>
-              <wp:anchor behindDoc="0" distT="45720" distB="50800" distL="114300" distR="114300" simplePos="0" locked="0" layoutInCell="0" allowOverlap="1" relativeHeight="33" wp14:anchorId="204C02CC">
+              <wp:anchor behindDoc="0" distT="45720" distB="50800" distL="114300" distR="114300" simplePos="0" locked="0" layoutInCell="0" allowOverlap="1" relativeHeight="34" wp14:anchorId="204C02CC">
                 <wp:simplePos x="0" y="0"/>
                 <wp:positionH relativeFrom="margin">
                   <wp:align>center</wp:align>
@@ -789,7 +789,7 @@
             </w:rPr>
             <w:fldChar w:fldCharType="separate"/>
           </w:r>
-          <w:hyperlink w:anchor="__RefHeading___Toc9069_2913971107">
+          <w:hyperlink w:anchor="__RefHeading___Toc1157_3066934455">
             <w:r>
               <w:rPr>
                 <w:webHidden/>
@@ -824,7 +824,7 @@
             </w:tabs>
             <w:rPr/>
           </w:pPr>
-          <w:hyperlink w:anchor="__RefHeading___Toc9071_2913971107">
+          <w:hyperlink w:anchor="__RefHeading___Toc1159_3066934455">
             <w:r>
               <w:rPr>
                 <w:webHidden/>
@@ -853,7 +853,7 @@
             </w:tabs>
             <w:rPr/>
           </w:pPr>
-          <w:hyperlink w:anchor="__RefHeading___Toc9073_2913971107">
+          <w:hyperlink w:anchor="__RefHeading___Toc1161_3066934455">
             <w:r>
               <w:rPr>
                 <w:webHidden/>
@@ -875,7 +875,7 @@
             </w:tabs>
             <w:rPr/>
           </w:pPr>
-          <w:hyperlink w:anchor="__RefHeading___Toc9075_2913971107">
+          <w:hyperlink w:anchor="__RefHeading___Toc1163_3066934455">
             <w:r>
               <w:rPr>
                 <w:webHidden/>
@@ -897,7 +897,7 @@
             </w:tabs>
             <w:rPr/>
           </w:pPr>
-          <w:hyperlink w:anchor="__RefHeading___Toc9077_2913971107">
+          <w:hyperlink w:anchor="__RefHeading___Toc1165_3066934455">
             <w:r>
               <w:rPr>
                 <w:webHidden/>
@@ -919,7 +919,7 @@
             </w:tabs>
             <w:rPr/>
           </w:pPr>
-          <w:hyperlink w:anchor="__RefHeading___Toc9079_2913971107">
+          <w:hyperlink w:anchor="__RefHeading___Toc1167_3066934455">
             <w:r>
               <w:rPr>
                 <w:webHidden/>
@@ -941,7 +941,7 @@
             </w:tabs>
             <w:rPr/>
           </w:pPr>
-          <w:hyperlink w:anchor="__RefHeading___Toc9081_2913971107">
+          <w:hyperlink w:anchor="__RefHeading___Toc1169_3066934455">
             <w:r>
               <w:rPr>
                 <w:webHidden/>
@@ -963,7 +963,7 @@
             </w:tabs>
             <w:rPr/>
           </w:pPr>
-          <w:hyperlink w:anchor="__RefHeading___Toc9083_2913971107">
+          <w:hyperlink w:anchor="__RefHeading___Toc1171_3066934455">
             <w:r>
               <w:rPr>
                 <w:webHidden/>
@@ -985,7 +985,7 @@
             </w:tabs>
             <w:rPr/>
           </w:pPr>
-          <w:hyperlink w:anchor="__RefHeading___Toc9085_2913971107">
+          <w:hyperlink w:anchor="__RefHeading___Toc1173_3066934455">
             <w:r>
               <w:rPr>
                 <w:webHidden/>
@@ -1007,7 +1007,7 @@
             </w:tabs>
             <w:rPr/>
           </w:pPr>
-          <w:hyperlink w:anchor="__RefHeading___Toc9087_2913971107">
+          <w:hyperlink w:anchor="__RefHeading___Toc1175_3066934455">
             <w:r>
               <w:rPr>
                 <w:webHidden/>
@@ -1029,7 +1029,7 @@
             </w:tabs>
             <w:rPr/>
           </w:pPr>
-          <w:hyperlink w:anchor="__RefHeading___Toc9089_2913971107">
+          <w:hyperlink w:anchor="__RefHeading___Toc1177_3066934455">
             <w:r>
               <w:rPr>
                 <w:webHidden/>
@@ -1051,7 +1051,7 @@
             </w:tabs>
             <w:rPr/>
           </w:pPr>
-          <w:hyperlink w:anchor="__RefHeading___Toc9091_2913971107">
+          <w:hyperlink w:anchor="__RefHeading___Toc1179_3066934455">
             <w:r>
               <w:rPr>
                 <w:webHidden/>
@@ -1073,7 +1073,7 @@
             </w:tabs>
             <w:rPr/>
           </w:pPr>
-          <w:hyperlink w:anchor="__RefHeading___Toc9093_2913971107">
+          <w:hyperlink w:anchor="__RefHeading___Toc1181_3066934455">
             <w:r>
               <w:rPr>
                 <w:webHidden/>
@@ -1095,7 +1095,7 @@
             </w:tabs>
             <w:rPr/>
           </w:pPr>
-          <w:hyperlink w:anchor="__RefHeading___Toc9095_2913971107">
+          <w:hyperlink w:anchor="__RefHeading___Toc1183_3066934455">
             <w:r>
               <w:rPr>
                 <w:webHidden/>
@@ -1117,7 +1117,7 @@
             </w:tabs>
             <w:rPr/>
           </w:pPr>
-          <w:hyperlink w:anchor="__RefHeading___Toc9097_2913971107">
+          <w:hyperlink w:anchor="__RefHeading___Toc1185_3066934455">
             <w:r>
               <w:rPr>
                 <w:webHidden/>
@@ -1139,7 +1139,7 @@
             </w:tabs>
             <w:rPr/>
           </w:pPr>
-          <w:hyperlink w:anchor="__RefHeading___Toc9099_2913971107">
+          <w:hyperlink w:anchor="__RefHeading___Toc1187_3066934455">
             <w:r>
               <w:rPr>
                 <w:webHidden/>
@@ -1161,7 +1161,7 @@
             </w:tabs>
             <w:rPr/>
           </w:pPr>
-          <w:hyperlink w:anchor="__RefHeading___Toc9101_2913971107">
+          <w:hyperlink w:anchor="__RefHeading___Toc1189_3066934455">
             <w:r>
               <w:rPr>
                 <w:webHidden/>
@@ -1183,7 +1183,7 @@
             </w:tabs>
             <w:rPr/>
           </w:pPr>
-          <w:hyperlink w:anchor="__RefHeading___Toc9103_2913971107">
+          <w:hyperlink w:anchor="__RefHeading___Toc1191_3066934455">
             <w:r>
               <w:rPr>
                 <w:webHidden/>
@@ -1205,7 +1205,7 @@
             </w:tabs>
             <w:rPr/>
           </w:pPr>
-          <w:hyperlink w:anchor="__RefHeading___Toc9105_2913971107">
+          <w:hyperlink w:anchor="__RefHeading___Toc1193_3066934455">
             <w:r>
               <w:rPr>
                 <w:webHidden/>
@@ -1227,7 +1227,7 @@
             </w:tabs>
             <w:rPr/>
           </w:pPr>
-          <w:hyperlink w:anchor="__RefHeading___Toc9107_2913971107">
+          <w:hyperlink w:anchor="__RefHeading___Toc1195_3066934455">
             <w:r>
               <w:rPr>
                 <w:webHidden/>
@@ -1249,7 +1249,7 @@
             </w:tabs>
             <w:rPr/>
           </w:pPr>
-          <w:hyperlink w:anchor="__RefHeading___Toc9109_2913971107">
+          <w:hyperlink w:anchor="__RefHeading___Toc1197_3066934455">
             <w:r>
               <w:rPr>
                 <w:webHidden/>
@@ -1271,7 +1271,7 @@
             </w:tabs>
             <w:rPr/>
           </w:pPr>
-          <w:hyperlink w:anchor="__RefHeading___Toc9111_2913971107">
+          <w:hyperlink w:anchor="__RefHeading___Toc1199_3066934455">
             <w:r>
               <w:rPr>
                 <w:webHidden/>
@@ -1293,7 +1293,7 @@
             </w:tabs>
             <w:rPr/>
           </w:pPr>
-          <w:hyperlink w:anchor="__RefHeading___Toc9113_2913971107">
+          <w:hyperlink w:anchor="__RefHeading___Toc1201_3066934455">
             <w:r>
               <w:rPr>
                 <w:webHidden/>
@@ -1315,7 +1315,7 @@
             </w:tabs>
             <w:rPr/>
           </w:pPr>
-          <w:hyperlink w:anchor="__RefHeading___Toc9115_2913971107">
+          <w:hyperlink w:anchor="__RefHeading___Toc1203_3066934455">
             <w:r>
               <w:rPr>
                 <w:webHidden/>
@@ -1337,7 +1337,7 @@
             </w:tabs>
             <w:rPr/>
           </w:pPr>
-          <w:hyperlink w:anchor="__RefHeading___Toc9117_2913971107">
+          <w:hyperlink w:anchor="__RefHeading___Toc1205_3066934455">
             <w:r>
               <w:rPr>
                 <w:webHidden/>
@@ -1359,7 +1359,7 @@
             </w:tabs>
             <w:rPr/>
           </w:pPr>
-          <w:hyperlink w:anchor="__RefHeading___Toc9119_2913971107">
+          <w:hyperlink w:anchor="__RefHeading___Toc1207_3066934455">
             <w:r>
               <w:rPr>
                 <w:webHidden/>
@@ -1381,7 +1381,7 @@
             </w:tabs>
             <w:rPr/>
           </w:pPr>
-          <w:hyperlink w:anchor="__RefHeading___Toc9121_2913971107">
+          <w:hyperlink w:anchor="__RefHeading___Toc1209_3066934455">
             <w:r>
               <w:rPr>
                 <w:webHidden/>
@@ -1403,7 +1403,7 @@
             </w:tabs>
             <w:rPr/>
           </w:pPr>
-          <w:hyperlink w:anchor="__RefHeading___Toc9123_2913971107">
+          <w:hyperlink w:anchor="__RefHeading___Toc1211_3066934455">
             <w:r>
               <w:rPr>
                 <w:webHidden/>
@@ -1425,7 +1425,7 @@
             </w:tabs>
             <w:rPr/>
           </w:pPr>
-          <w:hyperlink w:anchor="__RefHeading___Toc9125_2913971107">
+          <w:hyperlink w:anchor="__RefHeading___Toc1213_3066934455">
             <w:r>
               <w:rPr>
                 <w:webHidden/>
@@ -1447,7 +1447,7 @@
             </w:tabs>
             <w:rPr/>
           </w:pPr>
-          <w:hyperlink w:anchor="__RefHeading___Toc9127_2913971107">
+          <w:hyperlink w:anchor="__RefHeading___Toc1215_3066934455">
             <w:r>
               <w:rPr>
                 <w:webHidden/>
@@ -1469,7 +1469,7 @@
             </w:tabs>
             <w:rPr/>
           </w:pPr>
-          <w:hyperlink w:anchor="__RefHeading___Toc9129_2913971107">
+          <w:hyperlink w:anchor="__RefHeading___Toc1217_3066934455">
             <w:r>
               <w:rPr>
                 <w:webHidden/>
@@ -1491,7 +1491,7 @@
             </w:tabs>
             <w:rPr/>
           </w:pPr>
-          <w:hyperlink w:anchor="__RefHeading___Toc9131_2913971107">
+          <w:hyperlink w:anchor="__RefHeading___Toc1219_3066934455">
             <w:r>
               <w:rPr>
                 <w:webHidden/>
@@ -1513,7 +1513,7 @@
             </w:tabs>
             <w:rPr/>
           </w:pPr>
-          <w:hyperlink w:anchor="__RefHeading___Toc9133_2913971107">
+          <w:hyperlink w:anchor="__RefHeading___Toc1221_3066934455">
             <w:r>
               <w:rPr>
                 <w:webHidden/>
@@ -1535,7 +1535,7 @@
             </w:tabs>
             <w:rPr/>
           </w:pPr>
-          <w:hyperlink w:anchor="__RefHeading___Toc9135_2913971107">
+          <w:hyperlink w:anchor="__RefHeading___Toc1223_3066934455">
             <w:r>
               <w:rPr>
                 <w:webHidden/>
@@ -1557,7 +1557,7 @@
             </w:tabs>
             <w:rPr/>
           </w:pPr>
-          <w:hyperlink w:anchor="__RefHeading___Toc9137_2913971107">
+          <w:hyperlink w:anchor="__RefHeading___Toc1225_3066934455">
             <w:r>
               <w:rPr>
                 <w:webHidden/>
@@ -1579,7 +1579,7 @@
             </w:tabs>
             <w:rPr/>
           </w:pPr>
-          <w:hyperlink w:anchor="__RefHeading___Toc9139_2913971107">
+          <w:hyperlink w:anchor="__RefHeading___Toc1227_3066934455">
             <w:r>
               <w:rPr>
                 <w:webHidden/>
@@ -1601,7 +1601,7 @@
             </w:tabs>
             <w:rPr/>
           </w:pPr>
-          <w:hyperlink w:anchor="__RefHeading___Toc9141_2913971107">
+          <w:hyperlink w:anchor="__RefHeading___Toc1229_3066934455">
             <w:r>
               <w:rPr>
                 <w:webHidden/>
@@ -1623,7 +1623,7 @@
             </w:tabs>
             <w:rPr/>
           </w:pPr>
-          <w:hyperlink w:anchor="__RefHeading___Toc9143_2913971107">
+          <w:hyperlink w:anchor="__RefHeading___Toc1231_3066934455">
             <w:r>
               <w:rPr>
                 <w:webHidden/>
@@ -1631,7 +1631,7 @@
               </w:rPr>
               <w:t>8. Implementation</w:t>
               <w:tab/>
-              <w:t>12</w:t>
+              <w:t>13</w:t>
             </w:r>
           </w:hyperlink>
         </w:p>
@@ -1645,7 +1645,7 @@
             </w:tabs>
             <w:rPr/>
           </w:pPr>
-          <w:hyperlink w:anchor="__RefHeading___Toc9145_2913971107">
+          <w:hyperlink w:anchor="__RefHeading___Toc1233_3066934455">
             <w:r>
               <w:rPr>
                 <w:webHidden/>
@@ -1653,7 +1653,7 @@
               </w:rPr>
               <w:t>8.1 How long does it take?</w:t>
               <w:tab/>
-              <w:t>12</w:t>
+              <w:t>13</w:t>
             </w:r>
           </w:hyperlink>
         </w:p>
@@ -1667,7 +1667,7 @@
             </w:tabs>
             <w:rPr/>
           </w:pPr>
-          <w:hyperlink w:anchor="__RefHeading___Toc9147_2913971107">
+          <w:hyperlink w:anchor="__RefHeading___Toc1235_3066934455">
             <w:r>
               <w:rPr>
                 <w:webHidden/>
@@ -1675,7 +1675,7 @@
               </w:rPr>
               <w:t>8.2 What do you need from us?</w:t>
               <w:tab/>
-              <w:t>12</w:t>
+              <w:t>13</w:t>
             </w:r>
           </w:hyperlink>
         </w:p>
@@ -1689,7 +1689,7 @@
             </w:tabs>
             <w:rPr/>
           </w:pPr>
-          <w:hyperlink w:anchor="__RefHeading___Toc9149_2913971107">
+          <w:hyperlink w:anchor="__RefHeading___Toc1237_3066934455">
             <w:r>
               <w:rPr>
                 <w:webHidden/>
@@ -1697,7 +1697,7 @@
               </w:rPr>
               <w:t>8.3 Can you customise it to our process?</w:t>
               <w:tab/>
-              <w:t>12</w:t>
+              <w:t>13</w:t>
             </w:r>
           </w:hyperlink>
         </w:p>
@@ -1711,7 +1711,7 @@
             </w:tabs>
             <w:rPr/>
           </w:pPr>
-          <w:hyperlink w:anchor="__RefHeading___Toc9151_2913971107">
+          <w:hyperlink w:anchor="__RefHeading___Toc1239_3066934455">
             <w:r>
               <w:rPr>
                 <w:webHidden/>
@@ -1719,7 +1719,7 @@
               </w:rPr>
               <w:t>8.4 How are users trained?</w:t>
               <w:tab/>
-              <w:t>12</w:t>
+              <w:t>13</w:t>
             </w:r>
           </w:hyperlink>
         </w:p>
@@ -1733,7 +1733,7 @@
             </w:tabs>
             <w:rPr/>
           </w:pPr>
-          <w:hyperlink w:anchor="__RefHeading___Toc9153_2913971107">
+          <w:hyperlink w:anchor="__RefHeading___Toc1241_3066934455">
             <w:r>
               <w:rPr>
                 <w:webHidden/>
@@ -1741,7 +1741,7 @@
               </w:rPr>
               <w:t>9. Support and maintenance</w:t>
               <w:tab/>
-              <w:t>13</w:t>
+              <w:t>14</w:t>
             </w:r>
           </w:hyperlink>
         </w:p>
@@ -1755,7 +1755,7 @@
             </w:tabs>
             <w:rPr/>
           </w:pPr>
-          <w:hyperlink w:anchor="__RefHeading___Toc9155_2913971107">
+          <w:hyperlink w:anchor="__RefHeading___Toc1243_3066934455">
             <w:r>
               <w:rPr>
                 <w:webHidden/>
@@ -1763,7 +1763,7 @@
               </w:rPr>
               <w:t>9.1 How does support work?</w:t>
               <w:tab/>
-              <w:t>13</w:t>
+              <w:t>14</w:t>
             </w:r>
           </w:hyperlink>
         </w:p>
@@ -1777,7 +1777,7 @@
             </w:tabs>
             <w:rPr/>
           </w:pPr>
-          <w:hyperlink w:anchor="__RefHeading___Toc9157_2913971107">
+          <w:hyperlink w:anchor="__RefHeading___Toc1245_3066934455">
             <w:r>
               <w:rPr>
                 <w:webHidden/>
@@ -1785,7 +1785,7 @@
               </w:rPr>
               <w:t>9.2 What does the AMC cover?</w:t>
               <w:tab/>
-              <w:t>13</w:t>
+              <w:t>14</w:t>
             </w:r>
           </w:hyperlink>
         </w:p>
@@ -1799,7 +1799,7 @@
             </w:tabs>
             <w:rPr/>
           </w:pPr>
-          <w:hyperlink w:anchor="__RefHeading___Toc9159_2913971107">
+          <w:hyperlink w:anchor="__RefHeading___Toc1247_3066934455">
             <w:r>
               <w:rPr>
                 <w:webHidden/>
@@ -1807,7 +1807,7 @@
               </w:rPr>
               <w:t>9.3 Will we get updates for new BIR forms?</w:t>
               <w:tab/>
-              <w:t>13</w:t>
+              <w:t>14</w:t>
             </w:r>
           </w:hyperlink>
         </w:p>
@@ -1821,7 +1821,7 @@
             </w:tabs>
             <w:rPr/>
           </w:pPr>
-          <w:hyperlink w:anchor="__RefHeading___Toc9161_2913971107">
+          <w:hyperlink w:anchor="__RefHeading___Toc1249_3066934455">
             <w:r>
               <w:rPr>
                 <w:webHidden/>
@@ -1829,7 +1829,7 @@
               </w:rPr>
               <w:t>10. Commercials</w:t>
               <w:tab/>
-              <w:t>14</w:t>
+              <w:t>15</w:t>
             </w:r>
           </w:hyperlink>
         </w:p>
@@ -1843,7 +1843,7 @@
             </w:tabs>
             <w:rPr/>
           </w:pPr>
-          <w:hyperlink w:anchor="__RefHeading___Toc9163_2913971107">
+          <w:hyperlink w:anchor="__RefHeading___Toc1251_3066934455">
             <w:r>
               <w:rPr>
                 <w:webHidden/>
@@ -1851,7 +1851,7 @@
               </w:rPr>
               <w:t>10.1 How is iNXT BrokerVerse priced?</w:t>
               <w:tab/>
-              <w:t>14</w:t>
+              <w:t>15</w:t>
             </w:r>
           </w:hyperlink>
         </w:p>
@@ -1865,7 +1865,7 @@
             </w:tabs>
             <w:rPr/>
           </w:pPr>
-          <w:hyperlink w:anchor="__RefHeading___Toc9165_2913971107">
+          <w:hyperlink w:anchor="__RefHeading___Toc1253_3066934455">
             <w:r>
               <w:rPr>
                 <w:webHidden/>
@@ -1873,7 +1873,7 @@
               </w:rPr>
               <w:t>10.2 Which model should we choose?</w:t>
               <w:tab/>
-              <w:t>14</w:t>
+              <w:t>15</w:t>
             </w:r>
           </w:hyperlink>
         </w:p>
@@ -1887,7 +1887,7 @@
             </w:tabs>
             <w:rPr/>
           </w:pPr>
-          <w:hyperlink w:anchor="__RefHeading___Toc9167_2913971107">
+          <w:hyperlink w:anchor="__RefHeading___Toc1255_3066934455">
             <w:r>
               <w:rPr>
                 <w:webHidden/>
@@ -1895,7 +1895,7 @@
               </w:rPr>
               <w:t>10.3 Who counts as a user?</w:t>
               <w:tab/>
-              <w:t>14</w:t>
+              <w:t>15</w:t>
             </w:r>
           </w:hyperlink>
         </w:p>
@@ -1909,7 +1909,7 @@
             </w:tabs>
             <w:rPr/>
           </w:pPr>
-          <w:hyperlink w:anchor="__RefHeading___Toc9169_2913971107">
+          <w:hyperlink w:anchor="__RefHeading___Toc1257_3066934455">
             <w:r>
               <w:rPr>
                 <w:webHidden/>
@@ -1917,7 +1917,7 @@
               </w:rPr>
               <w:t>10.4 What are the payment terms?</w:t>
               <w:tab/>
-              <w:t>14</w:t>
+              <w:t>15</w:t>
             </w:r>
           </w:hyperlink>
         </w:p>
@@ -1931,7 +1931,7 @@
             </w:tabs>
             <w:rPr/>
           </w:pPr>
-          <w:hyperlink w:anchor="__RefHeading___Toc9171_2913971107">
+          <w:hyperlink w:anchor="__RefHeading___Toc1259_3066934455">
             <w:r>
               <w:rPr>
                 <w:webHidden/>
@@ -1939,7 +1939,7 @@
               </w:rPr>
               <w:t>10.5 Can we withhold tax on your invoices?</w:t>
               <w:tab/>
-              <w:t>14</w:t>
+              <w:t>15</w:t>
             </w:r>
           </w:hyperlink>
         </w:p>
@@ -1953,7 +1953,7 @@
             </w:tabs>
             <w:rPr/>
           </w:pPr>
-          <w:hyperlink w:anchor="__RefHeading___Toc9173_2913971107">
+          <w:hyperlink w:anchor="__RefHeading___Toc1261_3066934455">
             <w:r>
               <w:rPr>
                 <w:webHidden/>
@@ -1961,7 +1961,7 @@
               </w:rPr>
               <w:t>10.6 Is there a discount?</w:t>
               <w:tab/>
-              <w:t>14</w:t>
+              <w:t>15</w:t>
             </w:r>
           </w:hyperlink>
         </w:p>
@@ -1975,7 +1975,7 @@
             </w:tabs>
             <w:rPr/>
           </w:pPr>
-          <w:hyperlink w:anchor="__RefHeading___Toc9175_2913971107">
+          <w:hyperlink w:anchor="__RefHeading___Toc1263_3066934455">
             <w:r>
               <w:rPr>
                 <w:webHidden/>
@@ -1983,7 +1983,7 @@
               </w:rPr>
               <w:t>11. Objection handling</w:t>
               <w:tab/>
-              <w:t>15</w:t>
+              <w:t>16</w:t>
             </w:r>
           </w:hyperlink>
         </w:p>
@@ -1997,7 +1997,7 @@
             </w:tabs>
             <w:rPr/>
           </w:pPr>
-          <w:hyperlink w:anchor="__RefHeading___Toc9177_2913971107">
+          <w:hyperlink w:anchor="__RefHeading___Toc1265_3066934455">
             <w:r>
               <w:rPr>
                 <w:webHidden/>
@@ -2005,7 +2005,7 @@
               </w:rPr>
               <w:t>11.1 How to handle an objection</w:t>
               <w:tab/>
-              <w:t>15</w:t>
+              <w:t>16</w:t>
             </w:r>
           </w:hyperlink>
         </w:p>
@@ -2019,7 +2019,7 @@
             </w:tabs>
             <w:rPr/>
           </w:pPr>
-          <w:hyperlink w:anchor="__RefHeading___Toc9179_2913971107">
+          <w:hyperlink w:anchor="__RefHeading___Toc1267_3066934455">
             <w:r>
               <w:rPr>
                 <w:webHidden/>
@@ -2027,7 +2027,7 @@
               </w:rPr>
               <w:t>11.2 "Our spreadsheets and current system work well enough."</w:t>
               <w:tab/>
-              <w:t>15</w:t>
+              <w:t>16</w:t>
             </w:r>
           </w:hyperlink>
         </w:p>
@@ -2041,7 +2041,7 @@
             </w:tabs>
             <w:rPr/>
           </w:pPr>
-          <w:hyperlink w:anchor="__RefHeading___Toc9181_2913971107">
+          <w:hyperlink w:anchor="__RefHeading___Toc1269_3066934455">
             <w:r>
               <w:rPr>
                 <w:webHidden/>
@@ -2049,7 +2049,7 @@
               </w:rPr>
               <w:t>11.3 "It is too expensive."</w:t>
               <w:tab/>
-              <w:t>15</w:t>
+              <w:t>16</w:t>
             </w:r>
           </w:hyperlink>
         </w:p>
@@ -2063,7 +2063,7 @@
             </w:tabs>
             <w:rPr/>
           </w:pPr>
-          <w:hyperlink w:anchor="__RefHeading___Toc9183_2913971107">
+          <w:hyperlink w:anchor="__RefHeading___Toc1271_3066934455">
             <w:r>
               <w:rPr>
                 <w:webHidden/>
@@ -2071,7 +2071,7 @@
               </w:rPr>
               <w:t>11.4 "A global broker system has more features."</w:t>
               <w:tab/>
-              <w:t>15</w:t>
+              <w:t>16</w:t>
             </w:r>
           </w:hyperlink>
         </w:p>
@@ -2085,7 +2085,7 @@
             </w:tabs>
             <w:rPr/>
           </w:pPr>
-          <w:hyperlink w:anchor="__RefHeading___Toc9185_2913971107">
+          <w:hyperlink w:anchor="__RefHeading___Toc1273_3066934455">
             <w:r>
               <w:rPr>
                 <w:webHidden/>
@@ -2093,7 +2093,7 @@
               </w:rPr>
               <w:t>11.5 "We are too small for a system like this."</w:t>
               <w:tab/>
-              <w:t>15</w:t>
+              <w:t>16</w:t>
             </w:r>
           </w:hyperlink>
         </w:p>
@@ -2107,7 +2107,7 @@
             </w:tabs>
             <w:rPr/>
           </w:pPr>
-          <w:hyperlink w:anchor="__RefHeading___Toc9187_2913971107">
+          <w:hyperlink w:anchor="__RefHeading___Toc1275_3066934455">
             <w:r>
               <w:rPr>
                 <w:webHidden/>
@@ -2115,7 +2115,7 @@
               </w:rPr>
               <w:t>11.6 "We need it to work exactly like our current process."</w:t>
               <w:tab/>
-              <w:t>16</w:t>
+              <w:t>17</w:t>
             </w:r>
           </w:hyperlink>
         </w:p>
@@ -2129,7 +2129,7 @@
             </w:tabs>
             <w:rPr/>
           </w:pPr>
-          <w:hyperlink w:anchor="__RefHeading___Toc9189_2913971107">
+          <w:hyperlink w:anchor="__RefHeading___Toc1277_3066934455">
             <w:r>
               <w:rPr>
                 <w:webHidden/>
@@ -2137,7 +2137,7 @@
               </w:rPr>
               <w:t>11.7 "Implementation projects always run late."</w:t>
               <w:tab/>
-              <w:t>16</w:t>
+              <w:t>17</w:t>
             </w:r>
           </w:hyperlink>
         </w:p>
@@ -2151,7 +2151,7 @@
             </w:tabs>
             <w:rPr/>
           </w:pPr>
-          <w:hyperlink w:anchor="__RefHeading___Toc9191_2913971107">
+          <w:hyperlink w:anchor="__RefHeading___Toc1279_3066934455">
             <w:r>
               <w:rPr>
                 <w:webHidden/>
@@ -2159,7 +2159,7 @@
               </w:rPr>
               <w:t>11.8 "We do not want our data in the cloud abroad."</w:t>
               <w:tab/>
-              <w:t>16</w:t>
+              <w:t>17</w:t>
             </w:r>
           </w:hyperlink>
         </w:p>
@@ -2173,7 +2173,7 @@
             </w:tabs>
             <w:rPr/>
           </w:pPr>
-          <w:hyperlink w:anchor="__RefHeading___Toc9193_2913971107">
+          <w:hyperlink w:anchor="__RefHeading___Toc1281_3066934455">
             <w:r>
               <w:rPr>
                 <w:webHidden/>
@@ -2181,7 +2181,7 @@
               </w:rPr>
               <w:t>11.9 "We need direct integration with our insurers."</w:t>
               <w:tab/>
-              <w:t>16</w:t>
+              <w:t>17</w:t>
             </w:r>
           </w:hyperlink>
         </w:p>
@@ -2195,7 +2195,7 @@
             </w:tabs>
             <w:rPr/>
           </w:pPr>
-          <w:hyperlink w:anchor="__RefHeading___Toc9195_2913971107">
+          <w:hyperlink w:anchor="__RefHeading___Toc1283_3066934455">
             <w:r>
               <w:rPr>
                 <w:webHidden/>
@@ -2203,7 +2203,7 @@
               </w:rPr>
               <w:t>11.10 "Our finance team will not change the accounting system."</w:t>
               <w:tab/>
-              <w:t>17</w:t>
+              <w:t>18</w:t>
             </w:r>
           </w:hyperlink>
         </w:p>
@@ -2217,7 +2217,7 @@
             </w:tabs>
             <w:rPr/>
           </w:pPr>
-          <w:hyperlink w:anchor="__RefHeading___Toc9197_2913971107">
+          <w:hyperlink w:anchor="__RefHeading___Toc1285_3066934455">
             <w:r>
               <w:rPr>
                 <w:webHidden/>
@@ -2225,7 +2225,7 @@
               </w:rPr>
               <w:t>11.11 "Twenty-two percent AMC is high."</w:t>
               <w:tab/>
-              <w:t>17</w:t>
+              <w:t>18</w:t>
             </w:r>
           </w:hyperlink>
         </w:p>
@@ -2239,7 +2239,7 @@
             </w:tabs>
             <w:rPr/>
           </w:pPr>
-          <w:hyperlink w:anchor="__RefHeading___Toc9199_2913971107">
+          <w:hyperlink w:anchor="__RefHeading___Toc1287_3066934455">
             <w:r>
               <w:rPr>
                 <w:webHidden/>
@@ -2247,7 +2247,7 @@
               </w:rPr>
               <w:t>11.12 "The 5% yearly increase is a concern."</w:t>
               <w:tab/>
-              <w:t>17</w:t>
+              <w:t>18</w:t>
             </w:r>
           </w:hyperlink>
         </w:p>
@@ -2261,7 +2261,7 @@
             </w:tabs>
             <w:rPr/>
           </w:pPr>
-          <w:hyperlink w:anchor="__RefHeading___Toc9201_2913971107">
+          <w:hyperlink w:anchor="__RefHeading___Toc1289_3066934455">
             <w:r>
               <w:rPr>
                 <w:webHidden/>
@@ -2269,7 +2269,7 @@
               </w:rPr>
               <w:t>11.13 "Who are your other clients?"</w:t>
               <w:tab/>
-              <w:t>17</w:t>
+              <w:t>18</w:t>
             </w:r>
           </w:hyperlink>
         </w:p>
@@ -2283,7 +2283,7 @@
             </w:tabs>
             <w:rPr/>
           </w:pPr>
-          <w:hyperlink w:anchor="__RefHeading___Toc9203_2913971107">
+          <w:hyperlink w:anchor="__RefHeading___Toc1291_3066934455">
             <w:r>
               <w:rPr>
                 <w:webHidden/>
@@ -2291,7 +2291,7 @@
               </w:rPr>
               <w:t>11.14 "What happens if iorta TechNXT is no longer there?"</w:t>
               <w:tab/>
-              <w:t>17</w:t>
+              <w:t>18</w:t>
             </w:r>
           </w:hyperlink>
         </w:p>
@@ -2305,7 +2305,7 @@
             </w:tabs>
             <w:rPr/>
           </w:pPr>
-          <w:hyperlink w:anchor="__RefHeading___Toc9205_2913971107">
+          <w:hyperlink w:anchor="__RefHeading___Toc1293_3066934455">
             <w:r>
               <w:rPr>
                 <w:webHidden/>
@@ -2313,7 +2313,7 @@
               </w:rPr>
               <w:t>11.15 "Our users will not adopt a new system."</w:t>
               <w:tab/>
-              <w:t>17</w:t>
+              <w:t>18</w:t>
             </w:r>
           </w:hyperlink>
         </w:p>
@@ -2327,7 +2327,7 @@
             </w:tabs>
             <w:rPr/>
           </w:pPr>
-          <w:hyperlink w:anchor="__RefHeading___Toc9207_2913971107">
+          <w:hyperlink w:anchor="__RefHeading___Toc1295_3066934455">
             <w:r>
               <w:rPr>
                 <w:webHidden/>
@@ -2335,7 +2335,7 @@
               </w:rPr>
               <w:t>11.16 "The timing is not right. Maybe next year."</w:t>
               <w:tab/>
-              <w:t>18</w:t>
+              <w:t>19</w:t>
             </w:r>
           </w:hyperlink>
         </w:p>
@@ -2349,7 +2349,7 @@
             </w:tabs>
             <w:rPr/>
           </w:pPr>
-          <w:hyperlink w:anchor="__RefHeading___Toc9209_2913971107">
+          <w:hyperlink w:anchor="__RefHeading___Toc1297_3066934455">
             <w:r>
               <w:rPr>
                 <w:webHidden/>
@@ -2357,7 +2357,7 @@
               </w:rPr>
               <w:t>12. Known limits of the OOTB version</w:t>
               <w:tab/>
-              <w:t>19</w:t>
+              <w:t>20</w:t>
             </w:r>
           </w:hyperlink>
         </w:p>
@@ -2371,7 +2371,7 @@
             </w:tabs>
             <w:rPr/>
           </w:pPr>
-          <w:hyperlink w:anchor="__RefHeading___Toc9211_2913971107">
+          <w:hyperlink w:anchor="__RefHeading___Toc1299_3066934455">
             <w:r>
               <w:rPr>
                 <w:webHidden/>
@@ -2386,7 +2386,7 @@
                 <w:rStyle w:val="IndexLink"/>
               </w:rPr>
               <w:tab/>
-              <w:t>20</w:t>
+              <w:t>21</w:t>
             </w:r>
           </w:hyperlink>
           <w:r>
@@ -2419,7 +2419,7 @@
       <w:r>
         <w:br w:type="page"/>
       </w:r>
-      <w:bookmarkStart w:id="0" w:name="__RefHeading___Toc9069_2913971107"/>
+      <w:bookmarkStart w:id="0" w:name="__RefHeading___Toc1157_3066934455"/>
       <w:bookmarkStart w:id="1" w:name="_Toc48319687"/>
       <w:bookmarkStart w:id="2" w:name="_Toc11824118"/>
       <w:bookmarkEnd w:id="0"/>
@@ -3064,7 +3064,7 @@
           <w:spacing w:val="0"/>
         </w:rPr>
       </w:pPr>
-      <w:bookmarkStart w:id="4" w:name="__RefHeading___Toc9071_2913971107"/>
+      <w:bookmarkStart w:id="4" w:name="__RefHeading___Toc1159_3066934455"/>
       <w:bookmarkStart w:id="5" w:name="_Toc233203388"/>
       <w:bookmarkEnd w:id="4"/>
       <w:r>
@@ -4348,7 +4348,7 @@
                 <w:szCs w:val="24"/>
                 <w:lang w:val="en-US" w:eastAsia="ja-JP" w:bidi="ar-SA"/>
               </w:rPr>
-              <w:t>UAT</w:t>
+              <w:t>Dev</w:t>
             </w:r>
           </w:p>
         </w:tc>
@@ -4385,7 +4385,7 @@
                 <w:szCs w:val="24"/>
                 <w:lang w:val="en-US" w:eastAsia="ja-JP" w:bidi="ar-SA"/>
               </w:rPr>
-              <w:t>User acceptance test</w:t>
+              <w:t>Development environment</w:t>
             </w:r>
           </w:p>
         </w:tc>
@@ -4427,7 +4427,7 @@
                 <w:szCs w:val="24"/>
                 <w:lang w:val="en-US" w:eastAsia="ja-JP" w:bidi="ar-SA"/>
               </w:rPr>
-              <w:t>VAT</w:t>
+              <w:t>Pre-Prod</w:t>
             </w:r>
           </w:p>
         </w:tc>
@@ -4464,6 +4464,243 @@
                 <w:szCs w:val="24"/>
                 <w:lang w:val="en-US" w:eastAsia="ja-JP" w:bidi="ar-SA"/>
               </w:rPr>
+              <w:t>Pre-production environment</w:t>
+            </w:r>
+          </w:p>
+        </w:tc>
+      </w:tr>
+      <w:tr>
+        <w:trPr>
+          <w:trHeight w:val="449" w:hRule="atLeast"/>
+        </w:trPr>
+        <w:tc>
+          <w:tcPr>
+            <w:tcW w:w="2514" w:type="dxa"/>
+            <w:tcBorders>
+              <w:top w:val="single" w:sz="4" w:space="0" w:color="808080"/>
+              <w:left w:val="single" w:sz="4" w:space="0" w:color="808080"/>
+              <w:bottom w:val="single" w:sz="4" w:space="0" w:color="808080"/>
+              <w:right w:val="single" w:sz="4" w:space="0" w:color="808080"/>
+            </w:tcBorders>
+            <w:vAlign w:val="center"/>
+          </w:tcPr>
+          <w:p>
+            <w:pPr>
+              <w:pStyle w:val="Normal"/>
+              <w:widowControl/>
+              <w:spacing w:lineRule="auto" w:line="240" w:before="60" w:after="0"/>
+              <w:jc w:val="left"/>
+              <w:rPr>
+                <w:rFonts w:ascii="Segoe UI" w:hAnsi="Segoe UI" w:eastAsia="Arial" w:cs="Segoe UI"/>
+                <w:color w:val="101820"/>
+                <w:sz w:val="16"/>
+                <w:szCs w:val="16"/>
+              </w:rPr>
+            </w:pPr>
+            <w:r>
+              <w:rPr>
+                <w:rFonts w:eastAsia="Segoe UI" w:cs="Segoe UI" w:ascii="Segoe UI" w:hAnsi="Segoe UI"/>
+                <w:color w:val="101820"/>
+                <w:kern w:val="0"/>
+                <w:sz w:val="16"/>
+                <w:szCs w:val="24"/>
+                <w:lang w:val="en-US" w:eastAsia="ja-JP" w:bidi="ar-SA"/>
+              </w:rPr>
+              <w:t>SIT</w:t>
+            </w:r>
+          </w:p>
+        </w:tc>
+        <w:tc>
+          <w:tcPr>
+            <w:tcW w:w="3712" w:type="dxa"/>
+            <w:tcBorders>
+              <w:top w:val="single" w:sz="4" w:space="0" w:color="808080"/>
+              <w:left w:val="single" w:sz="4" w:space="0" w:color="808080"/>
+              <w:bottom w:val="single" w:sz="4" w:space="0" w:color="808080"/>
+              <w:right w:val="single" w:sz="4" w:space="0" w:color="808080"/>
+            </w:tcBorders>
+            <w:vAlign w:val="center"/>
+          </w:tcPr>
+          <w:p>
+            <w:pPr>
+              <w:pStyle w:val="Normal"/>
+              <w:widowControl/>
+              <w:spacing w:lineRule="auto" w:line="240" w:before="60" w:after="0"/>
+              <w:jc w:val="left"/>
+              <w:rPr>
+                <w:rFonts w:ascii="Segoe UI" w:hAnsi="Segoe UI" w:eastAsia="Arial" w:cs="Segoe UI"/>
+                <w:color w:val="101820"/>
+                <w:sz w:val="16"/>
+                <w:szCs w:val="16"/>
+              </w:rPr>
+            </w:pPr>
+            <w:r>
+              <w:rPr>
+                <w:rFonts w:eastAsia="Segoe UI" w:cs="Segoe UI" w:ascii="Segoe UI" w:hAnsi="Segoe UI"/>
+                <w:color w:val="101820"/>
+                <w:kern w:val="0"/>
+                <w:sz w:val="16"/>
+                <w:szCs w:val="24"/>
+                <w:lang w:val="en-US" w:eastAsia="ja-JP" w:bidi="ar-SA"/>
+              </w:rPr>
+              <w:t>System integration test</w:t>
+            </w:r>
+          </w:p>
+        </w:tc>
+      </w:tr>
+      <w:tr>
+        <w:trPr>
+          <w:trHeight w:val="449" w:hRule="atLeast"/>
+        </w:trPr>
+        <w:tc>
+          <w:tcPr>
+            <w:tcW w:w="2514" w:type="dxa"/>
+            <w:tcBorders>
+              <w:top w:val="single" w:sz="4" w:space="0" w:color="808080"/>
+              <w:left w:val="single" w:sz="4" w:space="0" w:color="808080"/>
+              <w:bottom w:val="single" w:sz="4" w:space="0" w:color="808080"/>
+              <w:right w:val="single" w:sz="4" w:space="0" w:color="808080"/>
+            </w:tcBorders>
+            <w:vAlign w:val="center"/>
+          </w:tcPr>
+          <w:p>
+            <w:pPr>
+              <w:pStyle w:val="Normal"/>
+              <w:widowControl/>
+              <w:spacing w:lineRule="auto" w:line="240" w:before="60" w:after="0"/>
+              <w:jc w:val="left"/>
+              <w:rPr>
+                <w:rFonts w:ascii="Segoe UI" w:hAnsi="Segoe UI" w:eastAsia="Arial" w:cs="Segoe UI"/>
+                <w:color w:val="101820"/>
+                <w:sz w:val="16"/>
+                <w:szCs w:val="16"/>
+              </w:rPr>
+            </w:pPr>
+            <w:r>
+              <w:rPr>
+                <w:rFonts w:eastAsia="Segoe UI" w:cs="Segoe UI" w:ascii="Segoe UI" w:hAnsi="Segoe UI"/>
+                <w:color w:val="101820"/>
+                <w:kern w:val="0"/>
+                <w:sz w:val="16"/>
+                <w:szCs w:val="24"/>
+                <w:lang w:val="en-US" w:eastAsia="ja-JP" w:bidi="ar-SA"/>
+              </w:rPr>
+              <w:t>UAT</w:t>
+            </w:r>
+          </w:p>
+        </w:tc>
+        <w:tc>
+          <w:tcPr>
+            <w:tcW w:w="3712" w:type="dxa"/>
+            <w:tcBorders>
+              <w:top w:val="single" w:sz="4" w:space="0" w:color="808080"/>
+              <w:left w:val="single" w:sz="4" w:space="0" w:color="808080"/>
+              <w:bottom w:val="single" w:sz="4" w:space="0" w:color="808080"/>
+              <w:right w:val="single" w:sz="4" w:space="0" w:color="808080"/>
+            </w:tcBorders>
+            <w:vAlign w:val="center"/>
+          </w:tcPr>
+          <w:p>
+            <w:pPr>
+              <w:pStyle w:val="Normal"/>
+              <w:widowControl/>
+              <w:spacing w:lineRule="auto" w:line="240" w:before="60" w:after="0"/>
+              <w:jc w:val="left"/>
+              <w:rPr>
+                <w:rFonts w:ascii="Segoe UI" w:hAnsi="Segoe UI" w:eastAsia="Arial" w:cs="Segoe UI"/>
+                <w:color w:val="101820"/>
+                <w:sz w:val="16"/>
+                <w:szCs w:val="16"/>
+              </w:rPr>
+            </w:pPr>
+            <w:r>
+              <w:rPr>
+                <w:rFonts w:eastAsia="Segoe UI" w:cs="Segoe UI" w:ascii="Segoe UI" w:hAnsi="Segoe UI"/>
+                <w:color w:val="101820"/>
+                <w:kern w:val="0"/>
+                <w:sz w:val="16"/>
+                <w:szCs w:val="24"/>
+                <w:lang w:val="en-US" w:eastAsia="ja-JP" w:bidi="ar-SA"/>
+              </w:rPr>
+              <w:t>User acceptance test</w:t>
+            </w:r>
+          </w:p>
+        </w:tc>
+      </w:tr>
+      <w:tr>
+        <w:trPr>
+          <w:trHeight w:val="449" w:hRule="atLeast"/>
+        </w:trPr>
+        <w:tc>
+          <w:tcPr>
+            <w:tcW w:w="2514" w:type="dxa"/>
+            <w:tcBorders>
+              <w:top w:val="single" w:sz="4" w:space="0" w:color="808080"/>
+              <w:left w:val="single" w:sz="4" w:space="0" w:color="808080"/>
+              <w:bottom w:val="single" w:sz="4" w:space="0" w:color="808080"/>
+              <w:right w:val="single" w:sz="4" w:space="0" w:color="808080"/>
+            </w:tcBorders>
+            <w:vAlign w:val="center"/>
+          </w:tcPr>
+          <w:p>
+            <w:pPr>
+              <w:pStyle w:val="Normal"/>
+              <w:widowControl/>
+              <w:spacing w:lineRule="auto" w:line="240" w:before="60" w:after="0"/>
+              <w:jc w:val="left"/>
+              <w:rPr>
+                <w:rFonts w:ascii="Segoe UI" w:hAnsi="Segoe UI" w:eastAsia="Arial" w:cs="Segoe UI"/>
+                <w:color w:val="101820"/>
+                <w:sz w:val="16"/>
+                <w:szCs w:val="16"/>
+              </w:rPr>
+            </w:pPr>
+            <w:r>
+              <w:rPr>
+                <w:rFonts w:eastAsia="Segoe UI" w:cs="Segoe UI" w:ascii="Segoe UI" w:hAnsi="Segoe UI"/>
+                <w:color w:val="101820"/>
+                <w:kern w:val="0"/>
+                <w:sz w:val="16"/>
+                <w:szCs w:val="24"/>
+                <w:lang w:val="en-US" w:eastAsia="ja-JP" w:bidi="ar-SA"/>
+              </w:rPr>
+              <w:t>VAT</w:t>
+            </w:r>
+          </w:p>
+        </w:tc>
+        <w:tc>
+          <w:tcPr>
+            <w:tcW w:w="3712" w:type="dxa"/>
+            <w:tcBorders>
+              <w:top w:val="single" w:sz="4" w:space="0" w:color="808080"/>
+              <w:left w:val="single" w:sz="4" w:space="0" w:color="808080"/>
+              <w:bottom w:val="single" w:sz="4" w:space="0" w:color="808080"/>
+              <w:right w:val="single" w:sz="4" w:space="0" w:color="808080"/>
+            </w:tcBorders>
+            <w:vAlign w:val="center"/>
+          </w:tcPr>
+          <w:p>
+            <w:pPr>
+              <w:pStyle w:val="Normal"/>
+              <w:widowControl/>
+              <w:spacing w:lineRule="auto" w:line="240" w:before="60" w:after="0"/>
+              <w:jc w:val="left"/>
+              <w:rPr>
+                <w:rFonts w:ascii="Segoe UI" w:hAnsi="Segoe UI" w:eastAsia="Arial" w:cs="Segoe UI"/>
+                <w:color w:val="101820"/>
+                <w:sz w:val="16"/>
+                <w:szCs w:val="16"/>
+              </w:rPr>
+            </w:pPr>
+            <w:r>
+              <w:rPr>
+                <w:rFonts w:eastAsia="Segoe UI" w:cs="Segoe UI" w:ascii="Segoe UI" w:hAnsi="Segoe UI"/>
+                <w:color w:val="101820"/>
+                <w:kern w:val="0"/>
+                <w:sz w:val="16"/>
+                <w:szCs w:val="24"/>
+                <w:lang w:val="en-US" w:eastAsia="ja-JP" w:bidi="ar-SA"/>
+              </w:rPr>
               <w:t>Value-added tax</w:t>
             </w:r>
           </w:p>
@@ -4685,7 +4922,7 @@
         <w:pageBreakBefore w:val="false"/>
         <w:rPr/>
       </w:pPr>
-      <w:bookmarkStart w:id="6" w:name="__RefHeading___Toc9073_2913971107"/>
+      <w:bookmarkStart w:id="6" w:name="__RefHeading___Toc1161_3066934455"/>
       <w:bookmarkEnd w:id="6"/>
       <w:r>
         <w:rPr>
@@ -4702,7 +4939,7 @@
         <w:pStyle w:val="Heading2"/>
         <w:rPr/>
       </w:pPr>
-      <w:bookmarkStart w:id="7" w:name="__RefHeading___Toc9075_2913971107"/>
+      <w:bookmarkStart w:id="7" w:name="__RefHeading___Toc1163_3066934455"/>
       <w:bookmarkEnd w:id="7"/>
       <w:r>
         <w:rPr>
@@ -4734,7 +4971,7 @@
         <w:pStyle w:val="Heading2"/>
         <w:rPr/>
       </w:pPr>
-      <w:bookmarkStart w:id="8" w:name="__RefHeading___Toc9077_2913971107"/>
+      <w:bookmarkStart w:id="8" w:name="__RefHeading___Toc1165_3066934455"/>
       <w:bookmarkEnd w:id="8"/>
       <w:r>
         <w:rPr>
@@ -4849,7 +5086,7 @@
         <w:pStyle w:val="Heading1"/>
         <w:rPr/>
       </w:pPr>
-      <w:bookmarkStart w:id="9" w:name="__RefHeading___Toc9079_2913971107"/>
+      <w:bookmarkStart w:id="9" w:name="__RefHeading___Toc1167_3066934455"/>
       <w:bookmarkEnd w:id="9"/>
       <w:r>
         <w:rPr>
@@ -4866,7 +5103,7 @@
         <w:pStyle w:val="Heading2"/>
         <w:rPr/>
       </w:pPr>
-      <w:bookmarkStart w:id="10" w:name="__RefHeading___Toc9081_2913971107"/>
+      <w:bookmarkStart w:id="10" w:name="__RefHeading___Toc1169_3066934455"/>
       <w:bookmarkEnd w:id="10"/>
       <w:r>
         <w:rPr>
@@ -4898,7 +5135,7 @@
         <w:pStyle w:val="Heading2"/>
         <w:rPr/>
       </w:pPr>
-      <w:bookmarkStart w:id="11" w:name="__RefHeading___Toc9083_2913971107"/>
+      <w:bookmarkStart w:id="11" w:name="__RefHeading___Toc1171_3066934455"/>
       <w:bookmarkEnd w:id="11"/>
       <w:r>
         <w:rPr>
@@ -4930,7 +5167,7 @@
         <w:pStyle w:val="Heading2"/>
         <w:rPr/>
       </w:pPr>
-      <w:bookmarkStart w:id="12" w:name="__RefHeading___Toc9085_2913971107"/>
+      <w:bookmarkStart w:id="12" w:name="__RefHeading___Toc1173_3066934455"/>
       <w:bookmarkEnd w:id="12"/>
       <w:r>
         <w:rPr>
@@ -4962,7 +5199,7 @@
         <w:pStyle w:val="Heading2"/>
         <w:rPr/>
       </w:pPr>
-      <w:bookmarkStart w:id="13" w:name="__RefHeading___Toc9087_2913971107"/>
+      <w:bookmarkStart w:id="13" w:name="__RefHeading___Toc1175_3066934455"/>
       <w:bookmarkEnd w:id="13"/>
       <w:r>
         <w:rPr>
@@ -4994,7 +5231,7 @@
         <w:pStyle w:val="Heading2"/>
         <w:rPr/>
       </w:pPr>
-      <w:bookmarkStart w:id="14" w:name="__RefHeading___Toc9089_2913971107"/>
+      <w:bookmarkStart w:id="14" w:name="__RefHeading___Toc1177_3066934455"/>
       <w:bookmarkEnd w:id="14"/>
       <w:r>
         <w:rPr>
@@ -5026,7 +5263,7 @@
         <w:pStyle w:val="Heading2"/>
         <w:rPr/>
       </w:pPr>
-      <w:bookmarkStart w:id="15" w:name="__RefHeading___Toc9091_2913971107"/>
+      <w:bookmarkStart w:id="15" w:name="__RefHeading___Toc1179_3066934455"/>
       <w:bookmarkEnd w:id="15"/>
       <w:r>
         <w:rPr>
@@ -5058,7 +5295,7 @@
         <w:pStyle w:val="Heading2"/>
         <w:rPr/>
       </w:pPr>
-      <w:bookmarkStart w:id="16" w:name="__RefHeading___Toc9093_2913971107"/>
+      <w:bookmarkStart w:id="16" w:name="__RefHeading___Toc1181_3066934455"/>
       <w:bookmarkEnd w:id="16"/>
       <w:r>
         <w:rPr>
@@ -5090,7 +5327,7 @@
         <w:pStyle w:val="Heading2"/>
         <w:rPr/>
       </w:pPr>
-      <w:bookmarkStart w:id="17" w:name="__RefHeading___Toc9095_2913971107"/>
+      <w:bookmarkStart w:id="17" w:name="__RefHeading___Toc1183_3066934455"/>
       <w:bookmarkEnd w:id="17"/>
       <w:r>
         <w:rPr>
@@ -5122,7 +5359,7 @@
         <w:pStyle w:val="Heading2"/>
         <w:rPr/>
       </w:pPr>
-      <w:bookmarkStart w:id="18" w:name="__RefHeading___Toc9097_2913971107"/>
+      <w:bookmarkStart w:id="18" w:name="__RefHeading___Toc1185_3066934455"/>
       <w:bookmarkEnd w:id="18"/>
       <w:r>
         <w:rPr>
@@ -5154,7 +5391,7 @@
         <w:pStyle w:val="Heading2"/>
         <w:rPr/>
       </w:pPr>
-      <w:bookmarkStart w:id="19" w:name="__RefHeading___Toc9099_2913971107"/>
+      <w:bookmarkStart w:id="19" w:name="__RefHeading___Toc1187_3066934455"/>
       <w:bookmarkEnd w:id="19"/>
       <w:r>
         <w:rPr>
@@ -5189,7 +5426,7 @@
         <w:pStyle w:val="Heading1"/>
         <w:rPr/>
       </w:pPr>
-      <w:bookmarkStart w:id="20" w:name="__RefHeading___Toc9101_2913971107"/>
+      <w:bookmarkStart w:id="20" w:name="__RefHeading___Toc1189_3066934455"/>
       <w:bookmarkEnd w:id="20"/>
       <w:r>
         <w:rPr>
@@ -5206,7 +5443,7 @@
         <w:pStyle w:val="Heading2"/>
         <w:rPr/>
       </w:pPr>
-      <w:bookmarkStart w:id="21" w:name="__RefHeading___Toc9103_2913971107"/>
+      <w:bookmarkStart w:id="21" w:name="__RefHeading___Toc1191_3066934455"/>
       <w:bookmarkEnd w:id="21"/>
       <w:r>
         <w:rPr>
@@ -5238,7 +5475,7 @@
         <w:pStyle w:val="Heading2"/>
         <w:rPr/>
       </w:pPr>
-      <w:bookmarkStart w:id="22" w:name="__RefHeading___Toc9105_2913971107"/>
+      <w:bookmarkStart w:id="22" w:name="__RefHeading___Toc1193_3066934455"/>
       <w:bookmarkEnd w:id="22"/>
       <w:r>
         <w:rPr>
@@ -5270,7 +5507,7 @@
         <w:pStyle w:val="Heading2"/>
         <w:rPr/>
       </w:pPr>
-      <w:bookmarkStart w:id="23" w:name="__RefHeading___Toc9107_2913971107"/>
+      <w:bookmarkStart w:id="23" w:name="__RefHeading___Toc1195_3066934455"/>
       <w:bookmarkEnd w:id="23"/>
       <w:r>
         <w:rPr>
@@ -5302,7 +5539,7 @@
         <w:pStyle w:val="Heading2"/>
         <w:rPr/>
       </w:pPr>
-      <w:bookmarkStart w:id="24" w:name="__RefHeading___Toc9109_2913971107"/>
+      <w:bookmarkStart w:id="24" w:name="__RefHeading___Toc1197_3066934455"/>
       <w:bookmarkEnd w:id="24"/>
       <w:r>
         <w:rPr>
@@ -5334,7 +5571,7 @@
         <w:pStyle w:val="Heading2"/>
         <w:rPr/>
       </w:pPr>
-      <w:bookmarkStart w:id="25" w:name="__RefHeading___Toc9111_2913971107"/>
+      <w:bookmarkStart w:id="25" w:name="__RefHeading___Toc1199_3066934455"/>
       <w:bookmarkEnd w:id="25"/>
       <w:r>
         <w:rPr>
@@ -5366,7 +5603,7 @@
         <w:pStyle w:val="Heading2"/>
         <w:rPr/>
       </w:pPr>
-      <w:bookmarkStart w:id="26" w:name="__RefHeading___Toc9113_2913971107"/>
+      <w:bookmarkStart w:id="26" w:name="__RefHeading___Toc1201_3066934455"/>
       <w:bookmarkEnd w:id="26"/>
       <w:r>
         <w:rPr>
@@ -5508,7 +5745,7 @@
         <w:pStyle w:val="Heading2"/>
         <w:rPr/>
       </w:pPr>
-      <w:bookmarkStart w:id="27" w:name="__RefHeading___Toc9115_2913971107"/>
+      <w:bookmarkStart w:id="27" w:name="__RefHeading___Toc1203_3066934455"/>
       <w:bookmarkEnd w:id="27"/>
       <w:r>
         <w:rPr>
@@ -5543,7 +5780,7 @@
         <w:pStyle w:val="Heading1"/>
         <w:rPr/>
       </w:pPr>
-      <w:bookmarkStart w:id="28" w:name="__RefHeading___Toc9117_2913971107"/>
+      <w:bookmarkStart w:id="28" w:name="__RefHeading___Toc1205_3066934455"/>
       <w:bookmarkEnd w:id="28"/>
       <w:r>
         <w:rPr>
@@ -5560,7 +5797,7 @@
         <w:pStyle w:val="Heading2"/>
         <w:rPr/>
       </w:pPr>
-      <w:bookmarkStart w:id="29" w:name="__RefHeading___Toc9119_2913971107"/>
+      <w:bookmarkStart w:id="29" w:name="__RefHeading___Toc1207_3066934455"/>
       <w:bookmarkEnd w:id="29"/>
       <w:r>
         <w:rPr>
@@ -5592,7 +5829,7 @@
         <w:pStyle w:val="Heading2"/>
         <w:rPr/>
       </w:pPr>
-      <w:bookmarkStart w:id="30" w:name="__RefHeading___Toc9121_2913971107"/>
+      <w:bookmarkStart w:id="30" w:name="__RefHeading___Toc1209_3066934455"/>
       <w:bookmarkEnd w:id="30"/>
       <w:r>
         <w:rPr>
@@ -5624,7 +5861,7 @@
         <w:pStyle w:val="Heading2"/>
         <w:rPr/>
       </w:pPr>
-      <w:bookmarkStart w:id="31" w:name="__RefHeading___Toc9123_2913971107"/>
+      <w:bookmarkStart w:id="31" w:name="__RefHeading___Toc1211_3066934455"/>
       <w:bookmarkEnd w:id="31"/>
       <w:r>
         <w:rPr>
@@ -5656,7 +5893,7 @@
         <w:pStyle w:val="Heading2"/>
         <w:rPr/>
       </w:pPr>
-      <w:bookmarkStart w:id="32" w:name="__RefHeading___Toc9125_2913971107"/>
+      <w:bookmarkStart w:id="32" w:name="__RefHeading___Toc1213_3066934455"/>
       <w:bookmarkEnd w:id="32"/>
       <w:r>
         <w:rPr>
@@ -5688,7 +5925,7 @@
         <w:pStyle w:val="Heading2"/>
         <w:rPr/>
       </w:pPr>
-      <w:bookmarkStart w:id="33" w:name="__RefHeading___Toc9127_2913971107"/>
+      <w:bookmarkStart w:id="33" w:name="__RefHeading___Toc1215_3066934455"/>
       <w:bookmarkEnd w:id="33"/>
       <w:r>
         <w:rPr>
@@ -5723,7 +5960,7 @@
         <w:pStyle w:val="Heading1"/>
         <w:rPr/>
       </w:pPr>
-      <w:bookmarkStart w:id="34" w:name="__RefHeading___Toc9129_2913971107"/>
+      <w:bookmarkStart w:id="34" w:name="__RefHeading___Toc1217_3066934455"/>
       <w:bookmarkEnd w:id="34"/>
       <w:r>
         <w:rPr>
@@ -5740,7 +5977,7 @@
         <w:pStyle w:val="Heading2"/>
         <w:rPr/>
       </w:pPr>
-      <w:bookmarkStart w:id="35" w:name="__RefHeading___Toc9131_2913971107"/>
+      <w:bookmarkStart w:id="35" w:name="__RefHeading___Toc1219_3066934455"/>
       <w:bookmarkEnd w:id="35"/>
       <w:r>
         <w:rPr>
@@ -5772,7 +6009,7 @@
         <w:pStyle w:val="Heading2"/>
         <w:rPr/>
       </w:pPr>
-      <w:bookmarkStart w:id="36" w:name="__RefHeading___Toc9133_2913971107"/>
+      <w:bookmarkStart w:id="36" w:name="__RefHeading___Toc1221_3066934455"/>
       <w:bookmarkEnd w:id="36"/>
       <w:r>
         <w:rPr>
@@ -5796,7 +6033,7 @@
           <w:color w:val="101820"/>
           <w:sz w:val="21"/>
         </w:rPr>
-        <w:t>Four options: AWS (Singapore region), Microsoft Azure (Southeast Asia, Singapore), a Philippine hosting partner, or the broker's own data centre. Hosting by iorta TechNXT is optional and priced separately; a broker that hosts itself pays no hosting fee and receives the deployment guide, with set-up support at day rates.</w:t>
+        <w:t>Four options: AWS (Singapore region), Microsoft Azure (Southeast Asia, Singapore), a Philippine hosting partner, or the broker's own data centre. Hosting by iorta TechNXT is optional and priced separately, per environment set: Dev, UAT and Production for a small or medium broker; Dev, SIT, UAT and Production for a large broker. A temporary Pre-Prod, restored from a production backup for the go-live rehearsal and each major release, is billed only for the months it exists. On AWS the standing set costs PHP 43,000.00 a month for a small broker and PHP 143,000.00 for a large one (Rate Card). A broker that hosts itself pays no hosting fee and receives the deployment guide, with set-up support at day rates.</w:t>
       </w:r>
     </w:p>
     <w:p>
@@ -5804,7 +6041,7 @@
         <w:pStyle w:val="Heading2"/>
         <w:rPr/>
       </w:pPr>
-      <w:bookmarkStart w:id="37" w:name="__RefHeading___Toc9135_2913971107"/>
+      <w:bookmarkStart w:id="37" w:name="__RefHeading___Toc1223_3066934455"/>
       <w:bookmarkEnd w:id="37"/>
       <w:r>
         <w:rPr>
@@ -5836,7 +6073,7 @@
         <w:pStyle w:val="Heading2"/>
         <w:rPr/>
       </w:pPr>
-      <w:bookmarkStart w:id="38" w:name="__RefHeading___Toc9137_2913971107"/>
+      <w:bookmarkStart w:id="38" w:name="__RefHeading___Toc1225_3066934455"/>
       <w:bookmarkEnd w:id="38"/>
       <w:r>
         <w:rPr>
@@ -5868,7 +6105,7 @@
         <w:pStyle w:val="Heading2"/>
         <w:rPr/>
       </w:pPr>
-      <w:bookmarkStart w:id="39" w:name="__RefHeading___Toc9139_2913971107"/>
+      <w:bookmarkStart w:id="39" w:name="__RefHeading___Toc1227_3066934455"/>
       <w:bookmarkEnd w:id="39"/>
       <w:r>
         <w:rPr>
@@ -5900,7 +6137,7 @@
         <w:pStyle w:val="Heading2"/>
         <w:rPr/>
       </w:pPr>
-      <w:bookmarkStart w:id="40" w:name="__RefHeading___Toc9141_2913971107"/>
+      <w:bookmarkStart w:id="40" w:name="__RefHeading___Toc1229_3066934455"/>
       <w:bookmarkEnd w:id="40"/>
       <w:r>
         <w:rPr>
@@ -5935,7 +6172,7 @@
         <w:pStyle w:val="Heading1"/>
         <w:rPr/>
       </w:pPr>
-      <w:bookmarkStart w:id="41" w:name="__RefHeading___Toc9143_2913971107"/>
+      <w:bookmarkStart w:id="41" w:name="__RefHeading___Toc1231_3066934455"/>
       <w:bookmarkEnd w:id="41"/>
       <w:r>
         <w:rPr>
@@ -5952,7 +6189,7 @@
         <w:pStyle w:val="Heading2"/>
         <w:rPr/>
       </w:pPr>
-      <w:bookmarkStart w:id="42" w:name="__RefHeading___Toc9145_2913971107"/>
+      <w:bookmarkStart w:id="42" w:name="__RefHeading___Toc1233_3066934455"/>
       <w:bookmarkEnd w:id="42"/>
       <w:r>
         <w:rPr>
@@ -5984,7 +6221,7 @@
         <w:pStyle w:val="Heading2"/>
         <w:rPr/>
       </w:pPr>
-      <w:bookmarkStart w:id="43" w:name="__RefHeading___Toc9147_2913971107"/>
+      <w:bookmarkStart w:id="43" w:name="__RefHeading___Toc1235_3066934455"/>
       <w:bookmarkEnd w:id="43"/>
       <w:r>
         <w:rPr>
@@ -6016,7 +6253,7 @@
         <w:pStyle w:val="Heading2"/>
         <w:rPr/>
       </w:pPr>
-      <w:bookmarkStart w:id="44" w:name="__RefHeading___Toc9149_2913971107"/>
+      <w:bookmarkStart w:id="44" w:name="__RefHeading___Toc1237_3066934455"/>
       <w:bookmarkEnd w:id="44"/>
       <w:r>
         <w:rPr>
@@ -6048,7 +6285,7 @@
         <w:pStyle w:val="Heading2"/>
         <w:rPr/>
       </w:pPr>
-      <w:bookmarkStart w:id="45" w:name="__RefHeading___Toc9151_2913971107"/>
+      <w:bookmarkStart w:id="45" w:name="__RefHeading___Toc1239_3066934455"/>
       <w:bookmarkEnd w:id="45"/>
       <w:r>
         <w:rPr>
@@ -6083,7 +6320,7 @@
         <w:pStyle w:val="Heading1"/>
         <w:rPr/>
       </w:pPr>
-      <w:bookmarkStart w:id="46" w:name="__RefHeading___Toc9153_2913971107"/>
+      <w:bookmarkStart w:id="46" w:name="__RefHeading___Toc1241_3066934455"/>
       <w:bookmarkEnd w:id="46"/>
       <w:r>
         <w:rPr>
@@ -6100,7 +6337,7 @@
         <w:pStyle w:val="Heading2"/>
         <w:rPr/>
       </w:pPr>
-      <w:bookmarkStart w:id="47" w:name="__RefHeading___Toc9155_2913971107"/>
+      <w:bookmarkStart w:id="47" w:name="__RefHeading___Toc1243_3066934455"/>
       <w:bookmarkEnd w:id="47"/>
       <w:r>
         <w:rPr>
@@ -6132,7 +6369,7 @@
         <w:pStyle w:val="Heading2"/>
         <w:rPr/>
       </w:pPr>
-      <w:bookmarkStart w:id="48" w:name="__RefHeading___Toc9157_2913971107"/>
+      <w:bookmarkStart w:id="48" w:name="__RefHeading___Toc1245_3066934455"/>
       <w:bookmarkEnd w:id="48"/>
       <w:r>
         <w:rPr>
@@ -6164,7 +6401,7 @@
         <w:pStyle w:val="Heading2"/>
         <w:rPr/>
       </w:pPr>
-      <w:bookmarkStart w:id="49" w:name="__RefHeading___Toc9159_2913971107"/>
+      <w:bookmarkStart w:id="49" w:name="__RefHeading___Toc1247_3066934455"/>
       <w:bookmarkEnd w:id="49"/>
       <w:r>
         <w:rPr>
@@ -6199,7 +6436,7 @@
         <w:pStyle w:val="Heading1"/>
         <w:rPr/>
       </w:pPr>
-      <w:bookmarkStart w:id="50" w:name="__RefHeading___Toc9161_2913971107"/>
+      <w:bookmarkStart w:id="50" w:name="__RefHeading___Toc1249_3066934455"/>
       <w:bookmarkEnd w:id="50"/>
       <w:r>
         <w:rPr>
@@ -6216,7 +6453,7 @@
         <w:pStyle w:val="Heading2"/>
         <w:rPr/>
       </w:pPr>
-      <w:bookmarkStart w:id="51" w:name="__RefHeading___Toc9163_2913971107"/>
+      <w:bookmarkStart w:id="51" w:name="__RefHeading___Toc1251_3066934455"/>
       <w:bookmarkEnd w:id="51"/>
       <w:r>
         <w:rPr>
@@ -6248,7 +6485,7 @@
         <w:pStyle w:val="Heading2"/>
         <w:rPr/>
       </w:pPr>
-      <w:bookmarkStart w:id="52" w:name="__RefHeading___Toc9165_2913971107"/>
+      <w:bookmarkStart w:id="52" w:name="__RefHeading___Toc1253_3066934455"/>
       <w:bookmarkEnd w:id="52"/>
       <w:r>
         <w:rPr>
@@ -6280,7 +6517,7 @@
         <w:pStyle w:val="Heading2"/>
         <w:rPr/>
       </w:pPr>
-      <w:bookmarkStart w:id="53" w:name="__RefHeading___Toc9167_2913971107"/>
+      <w:bookmarkStart w:id="53" w:name="__RefHeading___Toc1255_3066934455"/>
       <w:bookmarkEnd w:id="53"/>
       <w:r>
         <w:rPr>
@@ -6312,7 +6549,7 @@
         <w:pStyle w:val="Heading2"/>
         <w:rPr/>
       </w:pPr>
-      <w:bookmarkStart w:id="54" w:name="__RefHeading___Toc9169_2913971107"/>
+      <w:bookmarkStart w:id="54" w:name="__RefHeading___Toc1257_3066934455"/>
       <w:bookmarkEnd w:id="54"/>
       <w:r>
         <w:rPr>
@@ -6344,7 +6581,7 @@
         <w:pStyle w:val="Heading2"/>
         <w:rPr/>
       </w:pPr>
-      <w:bookmarkStart w:id="55" w:name="__RefHeading___Toc9171_2913971107"/>
+      <w:bookmarkStart w:id="55" w:name="__RefHeading___Toc1259_3066934455"/>
       <w:bookmarkEnd w:id="55"/>
       <w:r>
         <w:rPr>
@@ -6376,7 +6613,7 @@
         <w:pStyle w:val="Heading2"/>
         <w:rPr/>
       </w:pPr>
-      <w:bookmarkStart w:id="56" w:name="__RefHeading___Toc9173_2913971107"/>
+      <w:bookmarkStart w:id="56" w:name="__RefHeading___Toc1261_3066934455"/>
       <w:bookmarkEnd w:id="56"/>
       <w:r>
         <w:rPr>
@@ -6411,7 +6648,7 @@
         <w:pStyle w:val="Heading1"/>
         <w:rPr/>
       </w:pPr>
-      <w:bookmarkStart w:id="57" w:name="__RefHeading___Toc9175_2913971107"/>
+      <w:bookmarkStart w:id="57" w:name="__RefHeading___Toc1263_3066934455"/>
       <w:bookmarkEnd w:id="57"/>
       <w:r>
         <w:rPr>
@@ -6428,7 +6665,7 @@
         <w:pStyle w:val="Heading2"/>
         <w:rPr/>
       </w:pPr>
-      <w:bookmarkStart w:id="58" w:name="__RefHeading___Toc9177_2913971107"/>
+      <w:bookmarkStart w:id="58" w:name="__RefHeading___Toc1265_3066934455"/>
       <w:bookmarkEnd w:id="58"/>
       <w:r>
         <w:rPr>
@@ -6521,7 +6758,7 @@
         <w:pStyle w:val="Heading2"/>
         <w:rPr/>
       </w:pPr>
-      <w:bookmarkStart w:id="59" w:name="__RefHeading___Toc9179_2913971107"/>
+      <w:bookmarkStart w:id="59" w:name="__RefHeading___Toc1267_3066934455"/>
       <w:bookmarkEnd w:id="59"/>
       <w:r>
         <w:rPr>
@@ -6610,7 +6847,7 @@
         <w:pStyle w:val="Heading2"/>
         <w:rPr/>
       </w:pPr>
-      <w:bookmarkStart w:id="60" w:name="__RefHeading___Toc9181_2913971107"/>
+      <w:bookmarkStart w:id="60" w:name="__RefHeading___Toc1269_3066934455"/>
       <w:bookmarkEnd w:id="60"/>
       <w:r>
         <w:rPr>
@@ -6699,7 +6936,7 @@
         <w:pStyle w:val="Heading2"/>
         <w:rPr/>
       </w:pPr>
-      <w:bookmarkStart w:id="61" w:name="__RefHeading___Toc9183_2913971107"/>
+      <w:bookmarkStart w:id="61" w:name="__RefHeading___Toc1271_3066934455"/>
       <w:bookmarkEnd w:id="61"/>
       <w:r>
         <w:rPr>
@@ -6788,7 +7025,7 @@
         <w:pStyle w:val="Heading2"/>
         <w:rPr/>
       </w:pPr>
-      <w:bookmarkStart w:id="62" w:name="__RefHeading___Toc9185_2913971107"/>
+      <w:bookmarkStart w:id="62" w:name="__RefHeading___Toc1273_3066934455"/>
       <w:bookmarkEnd w:id="62"/>
       <w:r>
         <w:rPr>
@@ -6877,7 +7114,7 @@
         <w:pStyle w:val="Heading2"/>
         <w:rPr/>
       </w:pPr>
-      <w:bookmarkStart w:id="63" w:name="__RefHeading___Toc9187_2913971107"/>
+      <w:bookmarkStart w:id="63" w:name="__RefHeading___Toc1275_3066934455"/>
       <w:bookmarkEnd w:id="63"/>
       <w:r>
         <w:rPr>
@@ -6966,7 +7203,7 @@
         <w:pStyle w:val="Heading2"/>
         <w:rPr/>
       </w:pPr>
-      <w:bookmarkStart w:id="64" w:name="__RefHeading___Toc9189_2913971107"/>
+      <w:bookmarkStart w:id="64" w:name="__RefHeading___Toc1277_3066934455"/>
       <w:bookmarkEnd w:id="64"/>
       <w:r>
         <w:rPr>
@@ -7055,7 +7292,7 @@
         <w:pStyle w:val="Heading2"/>
         <w:rPr/>
       </w:pPr>
-      <w:bookmarkStart w:id="65" w:name="__RefHeading___Toc9191_2913971107"/>
+      <w:bookmarkStart w:id="65" w:name="__RefHeading___Toc1279_3066934455"/>
       <w:bookmarkEnd w:id="65"/>
       <w:r>
         <w:rPr>
@@ -7144,7 +7381,7 @@
         <w:pStyle w:val="Heading2"/>
         <w:rPr/>
       </w:pPr>
-      <w:bookmarkStart w:id="66" w:name="__RefHeading___Toc9193_2913971107"/>
+      <w:bookmarkStart w:id="66" w:name="__RefHeading___Toc1281_3066934455"/>
       <w:bookmarkEnd w:id="66"/>
       <w:r>
         <w:rPr>
@@ -7233,7 +7470,7 @@
         <w:pStyle w:val="Heading2"/>
         <w:rPr/>
       </w:pPr>
-      <w:bookmarkStart w:id="67" w:name="__RefHeading___Toc9195_2913971107"/>
+      <w:bookmarkStart w:id="67" w:name="__RefHeading___Toc1283_3066934455"/>
       <w:bookmarkEnd w:id="67"/>
       <w:r>
         <w:rPr>
@@ -7322,7 +7559,7 @@
         <w:pStyle w:val="Heading2"/>
         <w:rPr/>
       </w:pPr>
-      <w:bookmarkStart w:id="68" w:name="__RefHeading___Toc9197_2913971107"/>
+      <w:bookmarkStart w:id="68" w:name="__RefHeading___Toc1285_3066934455"/>
       <w:bookmarkEnd w:id="68"/>
       <w:r>
         <w:rPr>
@@ -7411,7 +7648,7 @@
         <w:pStyle w:val="Heading2"/>
         <w:rPr/>
       </w:pPr>
-      <w:bookmarkStart w:id="69" w:name="__RefHeading___Toc9199_2913971107"/>
+      <w:bookmarkStart w:id="69" w:name="__RefHeading___Toc1287_3066934455"/>
       <w:bookmarkEnd w:id="69"/>
       <w:r>
         <w:rPr>
@@ -7452,7 +7689,7 @@
         <w:pStyle w:val="Heading2"/>
         <w:rPr/>
       </w:pPr>
-      <w:bookmarkStart w:id="70" w:name="__RefHeading___Toc9201_2913971107"/>
+      <w:bookmarkStart w:id="70" w:name="__RefHeading___Toc1289_3066934455"/>
       <w:bookmarkEnd w:id="70"/>
       <w:r>
         <w:rPr>
@@ -7493,7 +7730,7 @@
         <w:pStyle w:val="Heading2"/>
         <w:rPr/>
       </w:pPr>
-      <w:bookmarkStart w:id="71" w:name="__RefHeading___Toc9203_2913971107"/>
+      <w:bookmarkStart w:id="71" w:name="__RefHeading___Toc1291_3066934455"/>
       <w:bookmarkEnd w:id="71"/>
       <w:r>
         <w:rPr>
@@ -7534,7 +7771,7 @@
         <w:pStyle w:val="Heading2"/>
         <w:rPr/>
       </w:pPr>
-      <w:bookmarkStart w:id="72" w:name="__RefHeading___Toc9205_2913971107"/>
+      <w:bookmarkStart w:id="72" w:name="__RefHeading___Toc1293_3066934455"/>
       <w:bookmarkEnd w:id="72"/>
       <w:r>
         <w:rPr>
@@ -7599,7 +7836,7 @@
         <w:pStyle w:val="Heading2"/>
         <w:rPr/>
       </w:pPr>
-      <w:bookmarkStart w:id="73" w:name="__RefHeading___Toc9207_2913971107"/>
+      <w:bookmarkStart w:id="73" w:name="__RefHeading___Toc1295_3066934455"/>
       <w:bookmarkEnd w:id="73"/>
       <w:r>
         <w:rPr>
@@ -7643,7 +7880,7 @@
         <w:pStyle w:val="Heading1"/>
         <w:rPr/>
       </w:pPr>
-      <w:bookmarkStart w:id="74" w:name="__RefHeading___Toc9209_2913971107"/>
+      <w:bookmarkStart w:id="74" w:name="__RefHeading___Toc1297_3066934455"/>
       <w:bookmarkEnd w:id="74"/>
       <w:r>
         <w:rPr>
@@ -8861,7 +9098,7 @@
       <w:r>
         <w:br w:type="page"/>
       </w:r>
-      <w:bookmarkStart w:id="75" w:name="__RefHeading___Toc9211_2913971107"/>
+      <w:bookmarkStart w:id="75" w:name="__RefHeading___Toc1299_3066934455"/>
       <w:bookmarkStart w:id="76" w:name="_Toc233203395"/>
       <w:bookmarkEnd w:id="75"/>
       <w:r>
@@ -10619,7 +10856,7 @@
       <w:r>
         <w:rPr/>
         <w:drawing>
-          <wp:anchor behindDoc="1" distT="0" distB="0" distL="0" distR="0" simplePos="0" locked="0" layoutInCell="0" allowOverlap="1" relativeHeight="23">
+          <wp:anchor behindDoc="1" distT="0" distB="0" distL="0" distR="0" simplePos="0" locked="0" layoutInCell="0" allowOverlap="1" relativeHeight="24">
             <wp:simplePos x="0" y="0"/>
             <wp:positionH relativeFrom="margin">
               <wp:align>center</wp:align>
@@ -10690,7 +10927,7 @@
     <w:r>
       <w:rPr/>
       <w:drawing>
-        <wp:anchor behindDoc="1" distT="0" distB="0" distL="0" distR="0" simplePos="0" locked="0" layoutInCell="0" allowOverlap="1" relativeHeight="22">
+        <wp:anchor behindDoc="1" distT="0" distB="0" distL="0" distR="0" simplePos="0" locked="0" layoutInCell="0" allowOverlap="1" relativeHeight="23">
           <wp:simplePos x="0" y="0"/>
           <wp:positionH relativeFrom="page">
             <wp:align>left</wp:align>
@@ -10749,7 +10986,7 @@
     <w:r>
       <w:rPr/>
       <w:drawing>
-        <wp:anchor behindDoc="1" distT="0" distB="0" distL="0" distR="0" simplePos="0" locked="0" layoutInCell="0" allowOverlap="1" relativeHeight="22">
+        <wp:anchor behindDoc="1" distT="0" distB="0" distL="0" distR="0" simplePos="0" locked="0" layoutInCell="0" allowOverlap="1" relativeHeight="23">
           <wp:simplePos x="0" y="0"/>
           <wp:positionH relativeFrom="page">
             <wp:align>left</wp:align>

</xml_diff>

<commit_message>
Commercial and contract documents: optional services confirmed by management on 04 October 2026 (six activation and connector go-live lines are standard optional services; ten regulator and partner items added as optional modules and partner services at man-days x PHP 16,100 rounded to PHP 10,000; package totals unchanged); Rate Card 1.1.1, Commercial Proposal Note 1.1.1, Negotiation Playbook 1.0.1, Service Catalogue and Rate Annex 1.0.1, OOTB Strategy 1.1.2 (decisions 11 and 12 taken), PH Fit Assessment 1.1.2, FAQ 1.1.2; pricing workbook and price book rebuilt
</commit_message>
<xml_diff>
--- a/docs/package/01_Sales/iNXT_BrokerVerse_FAQ_and_Objection_Handling.docx
+++ b/docs/package/01_Sales/iNXT_BrokerVerse_FAQ_and_Objection_Handling.docx
@@ -10,7 +10,7 @@
       <w:r>
         <w:rPr/>
         <w:drawing>
-          <wp:anchor behindDoc="1" distT="0" distB="0" distL="0" distR="0" simplePos="0" locked="0" layoutInCell="0" allowOverlap="1" relativeHeight="30">
+          <wp:anchor behindDoc="1" distT="0" distB="0" distL="0" distR="0" simplePos="0" locked="0" layoutInCell="0" allowOverlap="1" relativeHeight="31">
             <wp:simplePos x="0" y="0"/>
             <wp:positionH relativeFrom="margin">
               <wp:posOffset>-914400</wp:posOffset>
@@ -55,7 +55,7 @@
           </wp:anchor>
         </w:drawing>
         <w:drawing>
-          <wp:anchor behindDoc="1" distT="0" distB="0" distL="0" distR="0" simplePos="0" locked="0" layoutInCell="0" allowOverlap="1" relativeHeight="41">
+          <wp:anchor behindDoc="1" distT="0" distB="0" distL="0" distR="0" simplePos="0" locked="0" layoutInCell="0" allowOverlap="1" relativeHeight="42">
             <wp:simplePos x="0" y="0"/>
             <wp:positionH relativeFrom="margin">
               <wp:align>center</wp:align>
@@ -111,7 +111,7 @@
         <mc:AlternateContent>
           <mc:Choice Requires="wps">
             <w:drawing>
-              <wp:anchor behindDoc="0" distT="45720" distB="45720" distL="114300" distR="114300" simplePos="0" locked="0" layoutInCell="0" allowOverlap="1" relativeHeight="31" wp14:anchorId="3D43415C">
+              <wp:anchor behindDoc="0" distT="45720" distB="45720" distL="114300" distR="114300" simplePos="0" locked="0" layoutInCell="0" allowOverlap="1" relativeHeight="32" wp14:anchorId="3D43415C">
                 <wp:simplePos x="0" y="0"/>
                 <wp:positionH relativeFrom="page">
                   <wp:posOffset>194310</wp:posOffset>
@@ -226,7 +226,7 @@
         <mc:AlternateContent>
           <mc:Choice Requires="wps">
             <w:drawing>
-              <wp:anchor behindDoc="0" distT="45720" distB="45720" distL="113030" distR="114935" simplePos="0" locked="0" layoutInCell="0" allowOverlap="1" relativeHeight="33" wp14:anchorId="58C23128">
+              <wp:anchor behindDoc="0" distT="45720" distB="45720" distL="113030" distR="114935" simplePos="0" locked="0" layoutInCell="0" allowOverlap="1" relativeHeight="34" wp14:anchorId="58C23128">
                 <wp:simplePos x="0" y="0"/>
                 <wp:positionH relativeFrom="page">
                   <wp:posOffset>3094990</wp:posOffset>
@@ -341,7 +341,7 @@
         <mc:AlternateContent>
           <mc:Choice Requires="wps">
             <w:drawing>
-              <wp:anchor behindDoc="0" distT="45720" distB="45720" distL="114300" distR="113665" simplePos="0" locked="0" layoutInCell="0" allowOverlap="1" relativeHeight="35" wp14:anchorId="1BF25123">
+              <wp:anchor behindDoc="0" distT="45720" distB="45720" distL="114300" distR="113665" simplePos="0" locked="0" layoutInCell="0" allowOverlap="1" relativeHeight="36" wp14:anchorId="1BF25123">
                 <wp:simplePos x="0" y="0"/>
                 <wp:positionH relativeFrom="page">
                   <wp:posOffset>4992370</wp:posOffset>
@@ -456,7 +456,7 @@
         <mc:AlternateContent>
           <mc:Choice Requires="wps">
             <w:drawing>
-              <wp:anchor behindDoc="0" distT="45720" distB="46355" distL="114300" distR="114300" simplePos="0" locked="0" layoutInCell="0" allowOverlap="1" relativeHeight="37" wp14:anchorId="01DE2BF4">
+              <wp:anchor behindDoc="0" distT="45720" distB="46355" distL="114300" distR="114300" simplePos="0" locked="0" layoutInCell="0" allowOverlap="1" relativeHeight="38" wp14:anchorId="01DE2BF4">
                 <wp:simplePos x="0" y="0"/>
                 <wp:positionH relativeFrom="margin">
                   <wp:align>center</wp:align>
@@ -601,7 +601,7 @@
         <mc:AlternateContent>
           <mc:Choice Requires="wps">
             <w:drawing>
-              <wp:anchor behindDoc="0" distT="45720" distB="50800" distL="114300" distR="114300" simplePos="0" locked="0" layoutInCell="0" allowOverlap="1" relativeHeight="39" wp14:anchorId="204C02CC">
+              <wp:anchor behindDoc="0" distT="45720" distB="50800" distL="114300" distR="114300" simplePos="0" locked="0" layoutInCell="0" allowOverlap="1" relativeHeight="40" wp14:anchorId="204C02CC">
                 <wp:simplePos x="0" y="0"/>
                 <wp:positionH relativeFrom="margin">
                   <wp:align>center</wp:align>
@@ -789,7 +789,7 @@
             </w:rPr>
             <w:fldChar w:fldCharType="separate"/>
           </w:r>
-          <w:hyperlink w:anchor="__RefHeading___Toc1305_3593330738">
+          <w:hyperlink w:anchor="__RefHeading___Toc1307_2842061002">
             <w:r>
               <w:rPr>
                 <w:webHidden/>
@@ -824,7 +824,7 @@
             </w:tabs>
             <w:rPr/>
           </w:pPr>
-          <w:hyperlink w:anchor="__RefHeading___Toc1307_3593330738">
+          <w:hyperlink w:anchor="__RefHeading___Toc1309_2842061002">
             <w:r>
               <w:rPr>
                 <w:webHidden/>
@@ -853,7 +853,7 @@
             </w:tabs>
             <w:rPr/>
           </w:pPr>
-          <w:hyperlink w:anchor="__RefHeading___Toc1309_3593330738">
+          <w:hyperlink w:anchor="__RefHeading___Toc1311_2842061002">
             <w:r>
               <w:rPr>
                 <w:webHidden/>
@@ -875,7 +875,7 @@
             </w:tabs>
             <w:rPr/>
           </w:pPr>
-          <w:hyperlink w:anchor="__RefHeading___Toc1311_3593330738">
+          <w:hyperlink w:anchor="__RefHeading___Toc1313_2842061002">
             <w:r>
               <w:rPr>
                 <w:webHidden/>
@@ -897,7 +897,7 @@
             </w:tabs>
             <w:rPr/>
           </w:pPr>
-          <w:hyperlink w:anchor="__RefHeading___Toc1313_3593330738">
+          <w:hyperlink w:anchor="__RefHeading___Toc1315_2842061002">
             <w:r>
               <w:rPr>
                 <w:webHidden/>
@@ -919,7 +919,7 @@
             </w:tabs>
             <w:rPr/>
           </w:pPr>
-          <w:hyperlink w:anchor="__RefHeading___Toc1315_3593330738">
+          <w:hyperlink w:anchor="__RefHeading___Toc1317_2842061002">
             <w:r>
               <w:rPr>
                 <w:webHidden/>
@@ -941,7 +941,7 @@
             </w:tabs>
             <w:rPr/>
           </w:pPr>
-          <w:hyperlink w:anchor="__RefHeading___Toc1317_3593330738">
+          <w:hyperlink w:anchor="__RefHeading___Toc1319_2842061002">
             <w:r>
               <w:rPr>
                 <w:webHidden/>
@@ -963,7 +963,7 @@
             </w:tabs>
             <w:rPr/>
           </w:pPr>
-          <w:hyperlink w:anchor="__RefHeading___Toc1319_3593330738">
+          <w:hyperlink w:anchor="__RefHeading___Toc1321_2842061002">
             <w:r>
               <w:rPr>
                 <w:webHidden/>
@@ -985,7 +985,7 @@
             </w:tabs>
             <w:rPr/>
           </w:pPr>
-          <w:hyperlink w:anchor="__RefHeading___Toc1321_3593330738">
+          <w:hyperlink w:anchor="__RefHeading___Toc1323_2842061002">
             <w:r>
               <w:rPr>
                 <w:webHidden/>
@@ -1007,7 +1007,7 @@
             </w:tabs>
             <w:rPr/>
           </w:pPr>
-          <w:hyperlink w:anchor="__RefHeading___Toc1323_3593330738">
+          <w:hyperlink w:anchor="__RefHeading___Toc1325_2842061002">
             <w:r>
               <w:rPr>
                 <w:webHidden/>
@@ -1029,7 +1029,7 @@
             </w:tabs>
             <w:rPr/>
           </w:pPr>
-          <w:hyperlink w:anchor="__RefHeading___Toc1325_3593330738">
+          <w:hyperlink w:anchor="__RefHeading___Toc1327_2842061002">
             <w:r>
               <w:rPr>
                 <w:webHidden/>
@@ -1051,7 +1051,7 @@
             </w:tabs>
             <w:rPr/>
           </w:pPr>
-          <w:hyperlink w:anchor="__RefHeading___Toc1327_3593330738">
+          <w:hyperlink w:anchor="__RefHeading___Toc1329_2842061002">
             <w:r>
               <w:rPr>
                 <w:webHidden/>
@@ -1073,7 +1073,7 @@
             </w:tabs>
             <w:rPr/>
           </w:pPr>
-          <w:hyperlink w:anchor="__RefHeading___Toc1329_3593330738">
+          <w:hyperlink w:anchor="__RefHeading___Toc1331_2842061002">
             <w:r>
               <w:rPr>
                 <w:webHidden/>
@@ -1095,7 +1095,7 @@
             </w:tabs>
             <w:rPr/>
           </w:pPr>
-          <w:hyperlink w:anchor="__RefHeading___Toc1331_3593330738">
+          <w:hyperlink w:anchor="__RefHeading___Toc1333_2842061002">
             <w:r>
               <w:rPr>
                 <w:webHidden/>
@@ -1117,7 +1117,7 @@
             </w:tabs>
             <w:rPr/>
           </w:pPr>
-          <w:hyperlink w:anchor="__RefHeading___Toc1333_3593330738">
+          <w:hyperlink w:anchor="__RefHeading___Toc1335_2842061002">
             <w:r>
               <w:rPr>
                 <w:webHidden/>
@@ -1139,7 +1139,7 @@
             </w:tabs>
             <w:rPr/>
           </w:pPr>
-          <w:hyperlink w:anchor="__RefHeading___Toc1335_3593330738">
+          <w:hyperlink w:anchor="__RefHeading___Toc1337_2842061002">
             <w:r>
               <w:rPr>
                 <w:webHidden/>
@@ -1161,7 +1161,7 @@
             </w:tabs>
             <w:rPr/>
           </w:pPr>
-          <w:hyperlink w:anchor="__RefHeading___Toc1337_3593330738">
+          <w:hyperlink w:anchor="__RefHeading___Toc1339_2842061002">
             <w:r>
               <w:rPr>
                 <w:webHidden/>
@@ -1183,7 +1183,7 @@
             </w:tabs>
             <w:rPr/>
           </w:pPr>
-          <w:hyperlink w:anchor="__RefHeading___Toc1339_3593330738">
+          <w:hyperlink w:anchor="__RefHeading___Toc1341_2842061002">
             <w:r>
               <w:rPr>
                 <w:webHidden/>
@@ -1205,7 +1205,7 @@
             </w:tabs>
             <w:rPr/>
           </w:pPr>
-          <w:hyperlink w:anchor="__RefHeading___Toc1341_3593330738">
+          <w:hyperlink w:anchor="__RefHeading___Toc1343_2842061002">
             <w:r>
               <w:rPr>
                 <w:webHidden/>
@@ -1227,7 +1227,7 @@
             </w:tabs>
             <w:rPr/>
           </w:pPr>
-          <w:hyperlink w:anchor="__RefHeading___Toc1343_3593330738">
+          <w:hyperlink w:anchor="__RefHeading___Toc1345_2842061002">
             <w:r>
               <w:rPr>
                 <w:webHidden/>
@@ -1249,7 +1249,7 @@
             </w:tabs>
             <w:rPr/>
           </w:pPr>
-          <w:hyperlink w:anchor="__RefHeading___Toc1345_3593330738">
+          <w:hyperlink w:anchor="__RefHeading___Toc1347_2842061002">
             <w:r>
               <w:rPr>
                 <w:webHidden/>
@@ -1271,7 +1271,7 @@
             </w:tabs>
             <w:rPr/>
           </w:pPr>
-          <w:hyperlink w:anchor="__RefHeading___Toc1347_3593330738">
+          <w:hyperlink w:anchor="__RefHeading___Toc1349_2842061002">
             <w:r>
               <w:rPr>
                 <w:webHidden/>
@@ -1293,7 +1293,7 @@
             </w:tabs>
             <w:rPr/>
           </w:pPr>
-          <w:hyperlink w:anchor="__RefHeading___Toc1349_3593330738">
+          <w:hyperlink w:anchor="__RefHeading___Toc1351_2842061002">
             <w:r>
               <w:rPr>
                 <w:webHidden/>
@@ -1315,7 +1315,7 @@
             </w:tabs>
             <w:rPr/>
           </w:pPr>
-          <w:hyperlink w:anchor="__RefHeading___Toc1351_3593330738">
+          <w:hyperlink w:anchor="__RefHeading___Toc1353_2842061002">
             <w:r>
               <w:rPr>
                 <w:webHidden/>
@@ -1337,7 +1337,7 @@
             </w:tabs>
             <w:rPr/>
           </w:pPr>
-          <w:hyperlink w:anchor="__RefHeading___Toc1353_3593330738">
+          <w:hyperlink w:anchor="__RefHeading___Toc1355_2842061002">
             <w:r>
               <w:rPr>
                 <w:webHidden/>
@@ -1359,7 +1359,7 @@
             </w:tabs>
             <w:rPr/>
           </w:pPr>
-          <w:hyperlink w:anchor="__RefHeading___Toc1355_3593330738">
+          <w:hyperlink w:anchor="__RefHeading___Toc1357_2842061002">
             <w:r>
               <w:rPr>
                 <w:webHidden/>
@@ -1381,7 +1381,7 @@
             </w:tabs>
             <w:rPr/>
           </w:pPr>
-          <w:hyperlink w:anchor="__RefHeading___Toc1357_3593330738">
+          <w:hyperlink w:anchor="__RefHeading___Toc1359_2842061002">
             <w:r>
               <w:rPr>
                 <w:webHidden/>
@@ -1403,7 +1403,7 @@
             </w:tabs>
             <w:rPr/>
           </w:pPr>
-          <w:hyperlink w:anchor="__RefHeading___Toc1359_3593330738">
+          <w:hyperlink w:anchor="__RefHeading___Toc1361_2842061002">
             <w:r>
               <w:rPr>
                 <w:webHidden/>
@@ -1425,7 +1425,7 @@
             </w:tabs>
             <w:rPr/>
           </w:pPr>
-          <w:hyperlink w:anchor="__RefHeading___Toc1361_3593330738">
+          <w:hyperlink w:anchor="__RefHeading___Toc1363_2842061002">
             <w:r>
               <w:rPr>
                 <w:webHidden/>
@@ -1447,7 +1447,7 @@
             </w:tabs>
             <w:rPr/>
           </w:pPr>
-          <w:hyperlink w:anchor="__RefHeading___Toc1363_3593330738">
+          <w:hyperlink w:anchor="__RefHeading___Toc1365_2842061002">
             <w:r>
               <w:rPr>
                 <w:webHidden/>
@@ -1469,7 +1469,7 @@
             </w:tabs>
             <w:rPr/>
           </w:pPr>
-          <w:hyperlink w:anchor="__RefHeading___Toc1365_3593330738">
+          <w:hyperlink w:anchor="__RefHeading___Toc1367_2842061002">
             <w:r>
               <w:rPr>
                 <w:webHidden/>
@@ -1491,7 +1491,7 @@
             </w:tabs>
             <w:rPr/>
           </w:pPr>
-          <w:hyperlink w:anchor="__RefHeading___Toc1367_3593330738">
+          <w:hyperlink w:anchor="__RefHeading___Toc1369_2842061002">
             <w:r>
               <w:rPr>
                 <w:webHidden/>
@@ -1513,7 +1513,7 @@
             </w:tabs>
             <w:rPr/>
           </w:pPr>
-          <w:hyperlink w:anchor="__RefHeading___Toc1369_3593330738">
+          <w:hyperlink w:anchor="__RefHeading___Toc1371_2842061002">
             <w:r>
               <w:rPr>
                 <w:webHidden/>
@@ -1535,7 +1535,7 @@
             </w:tabs>
             <w:rPr/>
           </w:pPr>
-          <w:hyperlink w:anchor="__RefHeading___Toc1371_3593330738">
+          <w:hyperlink w:anchor="__RefHeading___Toc1373_2842061002">
             <w:r>
               <w:rPr>
                 <w:webHidden/>
@@ -1557,7 +1557,7 @@
             </w:tabs>
             <w:rPr/>
           </w:pPr>
-          <w:hyperlink w:anchor="__RefHeading___Toc1373_3593330738">
+          <w:hyperlink w:anchor="__RefHeading___Toc1375_2842061002">
             <w:r>
               <w:rPr>
                 <w:webHidden/>
@@ -1579,7 +1579,7 @@
             </w:tabs>
             <w:rPr/>
           </w:pPr>
-          <w:hyperlink w:anchor="__RefHeading___Toc1375_3593330738">
+          <w:hyperlink w:anchor="__RefHeading___Toc1377_2842061002">
             <w:r>
               <w:rPr>
                 <w:webHidden/>
@@ -1601,7 +1601,7 @@
             </w:tabs>
             <w:rPr/>
           </w:pPr>
-          <w:hyperlink w:anchor="__RefHeading___Toc1377_3593330738">
+          <w:hyperlink w:anchor="__RefHeading___Toc1379_2842061002">
             <w:r>
               <w:rPr>
                 <w:webHidden/>
@@ -1623,7 +1623,7 @@
             </w:tabs>
             <w:rPr/>
           </w:pPr>
-          <w:hyperlink w:anchor="__RefHeading___Toc1379_3593330738">
+          <w:hyperlink w:anchor="__RefHeading___Toc1381_2842061002">
             <w:r>
               <w:rPr>
                 <w:webHidden/>
@@ -1645,7 +1645,7 @@
             </w:tabs>
             <w:rPr/>
           </w:pPr>
-          <w:hyperlink w:anchor="__RefHeading___Toc1381_3593330738">
+          <w:hyperlink w:anchor="__RefHeading___Toc1383_2842061002">
             <w:r>
               <w:rPr>
                 <w:webHidden/>
@@ -1667,7 +1667,7 @@
             </w:tabs>
             <w:rPr/>
           </w:pPr>
-          <w:hyperlink w:anchor="__RefHeading___Toc1383_3593330738">
+          <w:hyperlink w:anchor="__RefHeading___Toc1385_2842061002">
             <w:r>
               <w:rPr>
                 <w:webHidden/>
@@ -1689,7 +1689,7 @@
             </w:tabs>
             <w:rPr/>
           </w:pPr>
-          <w:hyperlink w:anchor="__RefHeading___Toc1385_3593330738">
+          <w:hyperlink w:anchor="__RefHeading___Toc1387_2842061002">
             <w:r>
               <w:rPr>
                 <w:webHidden/>
@@ -1711,7 +1711,7 @@
             </w:tabs>
             <w:rPr/>
           </w:pPr>
-          <w:hyperlink w:anchor="__RefHeading___Toc1387_3593330738">
+          <w:hyperlink w:anchor="__RefHeading___Toc1389_2842061002">
             <w:r>
               <w:rPr>
                 <w:webHidden/>
@@ -1733,7 +1733,7 @@
             </w:tabs>
             <w:rPr/>
           </w:pPr>
-          <w:hyperlink w:anchor="__RefHeading___Toc1389_3593330738">
+          <w:hyperlink w:anchor="__RefHeading___Toc1391_2842061002">
             <w:r>
               <w:rPr>
                 <w:webHidden/>
@@ -1755,7 +1755,7 @@
             </w:tabs>
             <w:rPr/>
           </w:pPr>
-          <w:hyperlink w:anchor="__RefHeading___Toc1391_3593330738">
+          <w:hyperlink w:anchor="__RefHeading___Toc1393_2842061002">
             <w:r>
               <w:rPr>
                 <w:webHidden/>
@@ -1777,7 +1777,7 @@
             </w:tabs>
             <w:rPr/>
           </w:pPr>
-          <w:hyperlink w:anchor="__RefHeading___Toc1393_3593330738">
+          <w:hyperlink w:anchor="__RefHeading___Toc1395_2842061002">
             <w:r>
               <w:rPr>
                 <w:webHidden/>
@@ -1799,7 +1799,7 @@
             </w:tabs>
             <w:rPr/>
           </w:pPr>
-          <w:hyperlink w:anchor="__RefHeading___Toc1395_3593330738">
+          <w:hyperlink w:anchor="__RefHeading___Toc1397_2842061002">
             <w:r>
               <w:rPr>
                 <w:webHidden/>
@@ -1821,7 +1821,7 @@
             </w:tabs>
             <w:rPr/>
           </w:pPr>
-          <w:hyperlink w:anchor="__RefHeading___Toc1397_3593330738">
+          <w:hyperlink w:anchor="__RefHeading___Toc1399_2842061002">
             <w:r>
               <w:rPr>
                 <w:webHidden/>
@@ -1843,7 +1843,7 @@
             </w:tabs>
             <w:rPr/>
           </w:pPr>
-          <w:hyperlink w:anchor="__RefHeading___Toc1399_3593330738">
+          <w:hyperlink w:anchor="__RefHeading___Toc1401_2842061002">
             <w:r>
               <w:rPr>
                 <w:webHidden/>
@@ -1865,7 +1865,7 @@
             </w:tabs>
             <w:rPr/>
           </w:pPr>
-          <w:hyperlink w:anchor="__RefHeading___Toc1401_3593330738">
+          <w:hyperlink w:anchor="__RefHeading___Toc1403_2842061002">
             <w:r>
               <w:rPr>
                 <w:webHidden/>
@@ -1887,7 +1887,7 @@
             </w:tabs>
             <w:rPr/>
           </w:pPr>
-          <w:hyperlink w:anchor="__RefHeading___Toc1403_3593330738">
+          <w:hyperlink w:anchor="__RefHeading___Toc1405_2842061002">
             <w:r>
               <w:rPr>
                 <w:webHidden/>
@@ -1909,7 +1909,7 @@
             </w:tabs>
             <w:rPr/>
           </w:pPr>
-          <w:hyperlink w:anchor="__RefHeading___Toc1405_3593330738">
+          <w:hyperlink w:anchor="__RefHeading___Toc1407_2842061002">
             <w:r>
               <w:rPr>
                 <w:webHidden/>
@@ -1931,13 +1931,13 @@
             </w:tabs>
             <w:rPr/>
           </w:pPr>
-          <w:hyperlink w:anchor="__RefHeading___Toc1407_3593330738">
+          <w:hyperlink w:anchor="__RefHeading___Toc1409_2842061002">
             <w:r>
               <w:rPr>
                 <w:webHidden/>
                 <w:rStyle w:val="IndexLink"/>
               </w:rPr>
-              <w:t>10.2 Which model should we choose?</w:t>
+              <w:t>10.2 Are the AML/CFT, IC compliance and BIR modules add-ons? What costs extra?</w:t>
               <w:tab/>
               <w:t>20</w:t>
             </w:r>
@@ -1953,13 +1953,13 @@
             </w:tabs>
             <w:rPr/>
           </w:pPr>
-          <w:hyperlink w:anchor="__RefHeading___Toc1409_3593330738">
+          <w:hyperlink w:anchor="__RefHeading___Toc1411_2842061002">
             <w:r>
               <w:rPr>
                 <w:webHidden/>
                 <w:rStyle w:val="IndexLink"/>
               </w:rPr>
-              <w:t>10.3 Who counts as a user?</w:t>
+              <w:t>10.3 Which model should we choose?</w:t>
               <w:tab/>
               <w:t>20</w:t>
             </w:r>
@@ -1975,13 +1975,13 @@
             </w:tabs>
             <w:rPr/>
           </w:pPr>
-          <w:hyperlink w:anchor="__RefHeading___Toc1411_3593330738">
+          <w:hyperlink w:anchor="__RefHeading___Toc1413_2842061002">
             <w:r>
               <w:rPr>
                 <w:webHidden/>
                 <w:rStyle w:val="IndexLink"/>
               </w:rPr>
-              <w:t>10.4 What are the payment terms?</w:t>
+              <w:t>10.4 Who counts as a user?</w:t>
               <w:tab/>
               <w:t>20</w:t>
             </w:r>
@@ -1997,15 +1997,15 @@
             </w:tabs>
             <w:rPr/>
           </w:pPr>
-          <w:hyperlink w:anchor="__RefHeading___Toc1413_3593330738">
+          <w:hyperlink w:anchor="__RefHeading___Toc1415_2842061002">
             <w:r>
               <w:rPr>
                 <w:webHidden/>
                 <w:rStyle w:val="IndexLink"/>
               </w:rPr>
-              <w:t>10.5 Can we withhold tax on your invoices?</w:t>
+              <w:t>10.5 What are the payment terms?</w:t>
               <w:tab/>
-              <w:t>20</w:t>
+              <w:t>21</w:t>
             </w:r>
           </w:hyperlink>
         </w:p>
@@ -2019,15 +2019,37 @@
             </w:tabs>
             <w:rPr/>
           </w:pPr>
-          <w:hyperlink w:anchor="__RefHeading___Toc1415_3593330738">
+          <w:hyperlink w:anchor="__RefHeading___Toc1417_2842061002">
             <w:r>
               <w:rPr>
                 <w:webHidden/>
                 <w:rStyle w:val="IndexLink"/>
               </w:rPr>
-              <w:t>10.6 Is there a discount?</w:t>
+              <w:t>10.6 Can we withhold tax on your invoices?</w:t>
               <w:tab/>
-              <w:t>20</w:t>
+              <w:t>21</w:t>
+            </w:r>
+          </w:hyperlink>
+        </w:p>
+        <w:p>
+          <w:pPr>
+            <w:pStyle w:val="TOC2"/>
+            <w:tabs>
+              <w:tab w:val="clear" w:pos="900"/>
+              <w:tab w:val="clear" w:pos="9350"/>
+              <w:tab w:val="right" w:pos="9025" w:leader="dot"/>
+            </w:tabs>
+            <w:rPr/>
+          </w:pPr>
+          <w:hyperlink w:anchor="__RefHeading___Toc1419_2842061002">
+            <w:r>
+              <w:rPr>
+                <w:webHidden/>
+                <w:rStyle w:val="IndexLink"/>
+              </w:rPr>
+              <w:t>10.7 Is there a discount?</w:t>
+              <w:tab/>
+              <w:t>21</w:t>
             </w:r>
           </w:hyperlink>
         </w:p>
@@ -2041,7 +2063,7 @@
             </w:tabs>
             <w:rPr/>
           </w:pPr>
-          <w:hyperlink w:anchor="__RefHeading___Toc1417_3593330738">
+          <w:hyperlink w:anchor="__RefHeading___Toc1421_2842061002">
             <w:r>
               <w:rPr>
                 <w:webHidden/>
@@ -2049,7 +2071,7 @@
               </w:rPr>
               <w:t>11. Objection handling</w:t>
               <w:tab/>
-              <w:t>21</w:t>
+              <w:t>22</w:t>
             </w:r>
           </w:hyperlink>
         </w:p>
@@ -2063,7 +2085,7 @@
             </w:tabs>
             <w:rPr/>
           </w:pPr>
-          <w:hyperlink w:anchor="__RefHeading___Toc1419_3593330738">
+          <w:hyperlink w:anchor="__RefHeading___Toc1423_2842061002">
             <w:r>
               <w:rPr>
                 <w:webHidden/>
@@ -2071,7 +2093,7 @@
               </w:rPr>
               <w:t>11.1 How to handle an objection</w:t>
               <w:tab/>
-              <w:t>21</w:t>
+              <w:t>22</w:t>
             </w:r>
           </w:hyperlink>
         </w:p>
@@ -2085,7 +2107,7 @@
             </w:tabs>
             <w:rPr/>
           </w:pPr>
-          <w:hyperlink w:anchor="__RefHeading___Toc1421_3593330738">
+          <w:hyperlink w:anchor="__RefHeading___Toc1425_2842061002">
             <w:r>
               <w:rPr>
                 <w:webHidden/>
@@ -2093,7 +2115,7 @@
               </w:rPr>
               <w:t>11.2 "Our spreadsheets and current system work well enough."</w:t>
               <w:tab/>
-              <w:t>21</w:t>
+              <w:t>22</w:t>
             </w:r>
           </w:hyperlink>
         </w:p>
@@ -2107,7 +2129,7 @@
             </w:tabs>
             <w:rPr/>
           </w:pPr>
-          <w:hyperlink w:anchor="__RefHeading___Toc1423_3593330738">
+          <w:hyperlink w:anchor="__RefHeading___Toc1427_2842061002">
             <w:r>
               <w:rPr>
                 <w:webHidden/>
@@ -2115,7 +2137,7 @@
               </w:rPr>
               <w:t>11.3 "It is too expensive."</w:t>
               <w:tab/>
-              <w:t>21</w:t>
+              <w:t>22</w:t>
             </w:r>
           </w:hyperlink>
         </w:p>
@@ -2129,7 +2151,7 @@
             </w:tabs>
             <w:rPr/>
           </w:pPr>
-          <w:hyperlink w:anchor="__RefHeading___Toc1425_3593330738">
+          <w:hyperlink w:anchor="__RefHeading___Toc1429_2842061002">
             <w:r>
               <w:rPr>
                 <w:webHidden/>
@@ -2137,7 +2159,7 @@
               </w:rPr>
               <w:t>11.4 "A global broker system has more features."</w:t>
               <w:tab/>
-              <w:t>21</w:t>
+              <w:t>22</w:t>
             </w:r>
           </w:hyperlink>
         </w:p>
@@ -2151,7 +2173,7 @@
             </w:tabs>
             <w:rPr/>
           </w:pPr>
-          <w:hyperlink w:anchor="__RefHeading___Toc1427_3593330738">
+          <w:hyperlink w:anchor="__RefHeading___Toc1431_2842061002">
             <w:r>
               <w:rPr>
                 <w:webHidden/>
@@ -2159,7 +2181,7 @@
               </w:rPr>
               <w:t>11.5 "We are too small for a system like this."</w:t>
               <w:tab/>
-              <w:t>22</w:t>
+              <w:t>23</w:t>
             </w:r>
           </w:hyperlink>
         </w:p>
@@ -2173,7 +2195,7 @@
             </w:tabs>
             <w:rPr/>
           </w:pPr>
-          <w:hyperlink w:anchor="__RefHeading___Toc1429_3593330738">
+          <w:hyperlink w:anchor="__RefHeading___Toc1433_2842061002">
             <w:r>
               <w:rPr>
                 <w:webHidden/>
@@ -2181,7 +2203,7 @@
               </w:rPr>
               <w:t>11.6 "We need it to work exactly like our current process."</w:t>
               <w:tab/>
-              <w:t>22</w:t>
+              <w:t>23</w:t>
             </w:r>
           </w:hyperlink>
         </w:p>
@@ -2195,7 +2217,7 @@
             </w:tabs>
             <w:rPr/>
           </w:pPr>
-          <w:hyperlink w:anchor="__RefHeading___Toc1431_3593330738">
+          <w:hyperlink w:anchor="__RefHeading___Toc1435_2842061002">
             <w:r>
               <w:rPr>
                 <w:webHidden/>
@@ -2203,7 +2225,7 @@
               </w:rPr>
               <w:t>11.7 "Implementation projects always run late."</w:t>
               <w:tab/>
-              <w:t>22</w:t>
+              <w:t>23</w:t>
             </w:r>
           </w:hyperlink>
         </w:p>
@@ -2217,7 +2239,7 @@
             </w:tabs>
             <w:rPr/>
           </w:pPr>
-          <w:hyperlink w:anchor="__RefHeading___Toc1433_3593330738">
+          <w:hyperlink w:anchor="__RefHeading___Toc1437_2842061002">
             <w:r>
               <w:rPr>
                 <w:webHidden/>
@@ -2225,7 +2247,7 @@
               </w:rPr>
               <w:t>11.8 "We do not want our data in the cloud abroad."</w:t>
               <w:tab/>
-              <w:t>22</w:t>
+              <w:t>23</w:t>
             </w:r>
           </w:hyperlink>
         </w:p>
@@ -2239,7 +2261,7 @@
             </w:tabs>
             <w:rPr/>
           </w:pPr>
-          <w:hyperlink w:anchor="__RefHeading___Toc1435_3593330738">
+          <w:hyperlink w:anchor="__RefHeading___Toc1439_2842061002">
             <w:r>
               <w:rPr>
                 <w:webHidden/>
@@ -2247,7 +2269,7 @@
               </w:rPr>
               <w:t>11.9 "We need direct integration with our insurers."</w:t>
               <w:tab/>
-              <w:t>22</w:t>
+              <w:t>23</w:t>
             </w:r>
           </w:hyperlink>
         </w:p>
@@ -2261,7 +2283,7 @@
             </w:tabs>
             <w:rPr/>
           </w:pPr>
-          <w:hyperlink w:anchor="__RefHeading___Toc1437_3593330738">
+          <w:hyperlink w:anchor="__RefHeading___Toc1441_2842061002">
             <w:r>
               <w:rPr>
                 <w:webHidden/>
@@ -2269,7 +2291,7 @@
               </w:rPr>
               <w:t>11.10 "Our finance team will not change the accounting system."</w:t>
               <w:tab/>
-              <w:t>23</w:t>
+              <w:t>24</w:t>
             </w:r>
           </w:hyperlink>
         </w:p>
@@ -2283,7 +2305,7 @@
             </w:tabs>
             <w:rPr/>
           </w:pPr>
-          <w:hyperlink w:anchor="__RefHeading___Toc1439_3593330738">
+          <w:hyperlink w:anchor="__RefHeading___Toc1443_2842061002">
             <w:r>
               <w:rPr>
                 <w:webHidden/>
@@ -2291,7 +2313,7 @@
               </w:rPr>
               <w:t>11.11 "Twenty-two percent AMC is high."</w:t>
               <w:tab/>
-              <w:t>23</w:t>
+              <w:t>24</w:t>
             </w:r>
           </w:hyperlink>
         </w:p>
@@ -2305,7 +2327,7 @@
             </w:tabs>
             <w:rPr/>
           </w:pPr>
-          <w:hyperlink w:anchor="__RefHeading___Toc1441_3593330738">
+          <w:hyperlink w:anchor="__RefHeading___Toc1445_2842061002">
             <w:r>
               <w:rPr>
                 <w:webHidden/>
@@ -2313,7 +2335,7 @@
               </w:rPr>
               <w:t>11.12 "The 5% yearly increase is a concern."</w:t>
               <w:tab/>
-              <w:t>23</w:t>
+              <w:t>24</w:t>
             </w:r>
           </w:hyperlink>
         </w:p>
@@ -2327,7 +2349,7 @@
             </w:tabs>
             <w:rPr/>
           </w:pPr>
-          <w:hyperlink w:anchor="__RefHeading___Toc1443_3593330738">
+          <w:hyperlink w:anchor="__RefHeading___Toc1447_2842061002">
             <w:r>
               <w:rPr>
                 <w:webHidden/>
@@ -2335,7 +2357,7 @@
               </w:rPr>
               <w:t>11.13 "Who are your other clients?"</w:t>
               <w:tab/>
-              <w:t>23</w:t>
+              <w:t>24</w:t>
             </w:r>
           </w:hyperlink>
         </w:p>
@@ -2349,7 +2371,7 @@
             </w:tabs>
             <w:rPr/>
           </w:pPr>
-          <w:hyperlink w:anchor="__RefHeading___Toc1445_3593330738">
+          <w:hyperlink w:anchor="__RefHeading___Toc1449_2842061002">
             <w:r>
               <w:rPr>
                 <w:webHidden/>
@@ -2357,7 +2379,7 @@
               </w:rPr>
               <w:t>11.14 "What happens if iorta TechNXT is no longer there?"</w:t>
               <w:tab/>
-              <w:t>23</w:t>
+              <w:t>24</w:t>
             </w:r>
           </w:hyperlink>
         </w:p>
@@ -2371,7 +2393,7 @@
             </w:tabs>
             <w:rPr/>
           </w:pPr>
-          <w:hyperlink w:anchor="__RefHeading___Toc1447_3593330738">
+          <w:hyperlink w:anchor="__RefHeading___Toc1451_2842061002">
             <w:r>
               <w:rPr>
                 <w:webHidden/>
@@ -2379,7 +2401,7 @@
               </w:rPr>
               <w:t>11.15 "Our users will not adopt a new system."</w:t>
               <w:tab/>
-              <w:t>24</w:t>
+              <w:t>25</w:t>
             </w:r>
           </w:hyperlink>
         </w:p>
@@ -2393,7 +2415,7 @@
             </w:tabs>
             <w:rPr/>
           </w:pPr>
-          <w:hyperlink w:anchor="__RefHeading___Toc1449_3593330738">
+          <w:hyperlink w:anchor="__RefHeading___Toc1453_2842061002">
             <w:r>
               <w:rPr>
                 <w:webHidden/>
@@ -2401,7 +2423,7 @@
               </w:rPr>
               <w:t>11.16 "The timing is not right. Maybe next year."</w:t>
               <w:tab/>
-              <w:t>24</w:t>
+              <w:t>25</w:t>
             </w:r>
           </w:hyperlink>
         </w:p>
@@ -2415,7 +2437,7 @@
             </w:tabs>
             <w:rPr/>
           </w:pPr>
-          <w:hyperlink w:anchor="__RefHeading___Toc1451_3593330738">
+          <w:hyperlink w:anchor="__RefHeading___Toc1455_2842061002">
             <w:r>
               <w:rPr>
                 <w:webHidden/>
@@ -2423,7 +2445,7 @@
               </w:rPr>
               <w:t>12. Known limits of the OOTB version</w:t>
               <w:tab/>
-              <w:t>25</w:t>
+              <w:t>26</w:t>
             </w:r>
           </w:hyperlink>
         </w:p>
@@ -2437,7 +2459,7 @@
             </w:tabs>
             <w:rPr/>
           </w:pPr>
-          <w:hyperlink w:anchor="__RefHeading___Toc1453_3593330738">
+          <w:hyperlink w:anchor="__RefHeading___Toc1457_2842061002">
             <w:r>
               <w:rPr>
                 <w:webHidden/>
@@ -2452,7 +2474,7 @@
                 <w:rStyle w:val="IndexLink"/>
               </w:rPr>
               <w:tab/>
-              <w:t>26</w:t>
+              <w:t>27</w:t>
             </w:r>
           </w:hyperlink>
           <w:r>
@@ -2485,7 +2507,7 @@
       <w:r>
         <w:br w:type="page"/>
       </w:r>
-      <w:bookmarkStart w:id="0" w:name="__RefHeading___Toc1305_3593330738"/>
+      <w:bookmarkStart w:id="0" w:name="__RefHeading___Toc1307_2842061002"/>
       <w:bookmarkStart w:id="1" w:name="_Toc48319687"/>
       <w:bookmarkStart w:id="2" w:name="_Toc11824118"/>
       <w:bookmarkEnd w:id="0"/>
@@ -2879,7 +2901,7 @@
                 <w:szCs w:val="24"/>
                 <w:lang w:val="en-US" w:eastAsia="ja-JP" w:bidi="ar-SA"/>
               </w:rPr>
-              <w:t>1.1.1</w:t>
+              <w:t>1.1.2</w:t>
             </w:r>
           </w:p>
         </w:tc>
@@ -3027,7 +3049,7 @@
                 <w:szCs w:val="24"/>
                 <w:lang w:val="en-US" w:eastAsia="ja-JP" w:bidi="ar-SA"/>
               </w:rPr>
-              <w:t>Version 1.1.1: release figures aligned with the release verification of 04 October 2026 (test cases, automated tests, UAT cycle, go-live rehearsal). Version 1.1: answers updated for AML/CFT, the IC and NPC compliance registers, BIR forms and EOPT invoices, integrations, dealer programmes, branding, My Work and the Report Builder; known limits revised</w:t>
+              <w:t>Version 1.1.2: answer on add-on modules and optional services added (optional modules and partner services confirmed by management on 04 October 2026). Version 1.1.1: release figures aligned with the release verification of 04 October 2026 (test cases, automated tests, UAT cycle, go-live rehearsal). Version 1.1: answers updated for AML/CFT, the IC and NPC compliance registers, BIR forms and EOPT invoices, integrations, dealer programmes, branding, My Work and the Report Builder; known limits revised</w:t>
             </w:r>
           </w:p>
         </w:tc>
@@ -3130,7 +3152,7 @@
           <w:spacing w:val="0"/>
         </w:rPr>
       </w:pPr>
-      <w:bookmarkStart w:id="4" w:name="__RefHeading___Toc1307_3593330738"/>
+      <w:bookmarkStart w:id="4" w:name="__RefHeading___Toc1309_2842061002"/>
       <w:bookmarkStart w:id="5" w:name="_Toc233203388"/>
       <w:bookmarkEnd w:id="4"/>
       <w:r>
@@ -5778,7 +5800,7 @@
         <w:pageBreakBefore w:val="false"/>
         <w:rPr/>
       </w:pPr>
-      <w:bookmarkStart w:id="6" w:name="__RefHeading___Toc1309_3593330738"/>
+      <w:bookmarkStart w:id="6" w:name="__RefHeading___Toc1311_2842061002"/>
       <w:bookmarkEnd w:id="6"/>
       <w:r>
         <w:rPr>
@@ -5795,7 +5817,7 @@
         <w:pStyle w:val="Heading2"/>
         <w:rPr/>
       </w:pPr>
-      <w:bookmarkStart w:id="7" w:name="__RefHeading___Toc1311_3593330738"/>
+      <w:bookmarkStart w:id="7" w:name="__RefHeading___Toc1313_2842061002"/>
       <w:bookmarkEnd w:id="7"/>
       <w:r>
         <w:rPr>
@@ -5827,7 +5849,7 @@
         <w:pStyle w:val="Heading2"/>
         <w:rPr/>
       </w:pPr>
-      <w:bookmarkStart w:id="8" w:name="__RefHeading___Toc1313_3593330738"/>
+      <w:bookmarkStart w:id="8" w:name="__RefHeading___Toc1315_2842061002"/>
       <w:bookmarkEnd w:id="8"/>
       <w:r>
         <w:rPr>
@@ -5942,7 +5964,7 @@
         <w:pStyle w:val="Heading1"/>
         <w:rPr/>
       </w:pPr>
-      <w:bookmarkStart w:id="9" w:name="__RefHeading___Toc1315_3593330738"/>
+      <w:bookmarkStart w:id="9" w:name="__RefHeading___Toc1317_2842061002"/>
       <w:bookmarkEnd w:id="9"/>
       <w:r>
         <w:rPr>
@@ -5959,7 +5981,7 @@
         <w:pStyle w:val="Heading2"/>
         <w:rPr/>
       </w:pPr>
-      <w:bookmarkStart w:id="10" w:name="__RefHeading___Toc1317_3593330738"/>
+      <w:bookmarkStart w:id="10" w:name="__RefHeading___Toc1319_2842061002"/>
       <w:bookmarkEnd w:id="10"/>
       <w:r>
         <w:rPr>
@@ -5991,7 +6013,7 @@
         <w:pStyle w:val="Heading2"/>
         <w:rPr/>
       </w:pPr>
-      <w:bookmarkStart w:id="11" w:name="__RefHeading___Toc1319_3593330738"/>
+      <w:bookmarkStart w:id="11" w:name="__RefHeading___Toc1321_2842061002"/>
       <w:bookmarkEnd w:id="11"/>
       <w:r>
         <w:rPr>
@@ -6023,7 +6045,7 @@
         <w:pStyle w:val="Heading2"/>
         <w:rPr/>
       </w:pPr>
-      <w:bookmarkStart w:id="12" w:name="__RefHeading___Toc1321_3593330738"/>
+      <w:bookmarkStart w:id="12" w:name="__RefHeading___Toc1323_2842061002"/>
       <w:bookmarkEnd w:id="12"/>
       <w:r>
         <w:rPr>
@@ -6055,7 +6077,7 @@
         <w:pStyle w:val="Heading2"/>
         <w:rPr/>
       </w:pPr>
-      <w:bookmarkStart w:id="13" w:name="__RefHeading___Toc1323_3593330738"/>
+      <w:bookmarkStart w:id="13" w:name="__RefHeading___Toc1325_2842061002"/>
       <w:bookmarkEnd w:id="13"/>
       <w:r>
         <w:rPr>
@@ -6087,7 +6109,7 @@
         <w:pStyle w:val="Heading2"/>
         <w:rPr/>
       </w:pPr>
-      <w:bookmarkStart w:id="14" w:name="__RefHeading___Toc1325_3593330738"/>
+      <w:bookmarkStart w:id="14" w:name="__RefHeading___Toc1327_2842061002"/>
       <w:bookmarkEnd w:id="14"/>
       <w:r>
         <w:rPr>
@@ -6119,7 +6141,7 @@
         <w:pStyle w:val="Heading2"/>
         <w:rPr/>
       </w:pPr>
-      <w:bookmarkStart w:id="15" w:name="__RefHeading___Toc1327_3593330738"/>
+      <w:bookmarkStart w:id="15" w:name="__RefHeading___Toc1329_2842061002"/>
       <w:bookmarkEnd w:id="15"/>
       <w:r>
         <w:rPr>
@@ -6151,7 +6173,7 @@
         <w:pStyle w:val="Heading2"/>
         <w:rPr/>
       </w:pPr>
-      <w:bookmarkStart w:id="16" w:name="__RefHeading___Toc1329_3593330738"/>
+      <w:bookmarkStart w:id="16" w:name="__RefHeading___Toc1331_2842061002"/>
       <w:bookmarkEnd w:id="16"/>
       <w:r>
         <w:rPr>
@@ -6183,7 +6205,7 @@
         <w:pStyle w:val="Heading2"/>
         <w:rPr/>
       </w:pPr>
-      <w:bookmarkStart w:id="17" w:name="__RefHeading___Toc1331_3593330738"/>
+      <w:bookmarkStart w:id="17" w:name="__RefHeading___Toc1333_2842061002"/>
       <w:bookmarkEnd w:id="17"/>
       <w:r>
         <w:rPr>
@@ -6215,7 +6237,7 @@
         <w:pStyle w:val="Heading2"/>
         <w:rPr/>
       </w:pPr>
-      <w:bookmarkStart w:id="18" w:name="__RefHeading___Toc1333_3593330738"/>
+      <w:bookmarkStart w:id="18" w:name="__RefHeading___Toc1335_2842061002"/>
       <w:bookmarkEnd w:id="18"/>
       <w:r>
         <w:rPr>
@@ -6247,7 +6269,7 @@
         <w:pStyle w:val="Heading2"/>
         <w:rPr/>
       </w:pPr>
-      <w:bookmarkStart w:id="19" w:name="__RefHeading___Toc1335_3593330738"/>
+      <w:bookmarkStart w:id="19" w:name="__RefHeading___Toc1337_2842061002"/>
       <w:bookmarkEnd w:id="19"/>
       <w:r>
         <w:rPr>
@@ -6279,7 +6301,7 @@
         <w:pStyle w:val="Heading2"/>
         <w:rPr/>
       </w:pPr>
-      <w:bookmarkStart w:id="20" w:name="__RefHeading___Toc1337_3593330738"/>
+      <w:bookmarkStart w:id="20" w:name="__RefHeading___Toc1339_2842061002"/>
       <w:bookmarkEnd w:id="20"/>
       <w:r>
         <w:rPr>
@@ -6311,7 +6333,7 @@
         <w:pStyle w:val="Heading2"/>
         <w:rPr/>
       </w:pPr>
-      <w:bookmarkStart w:id="21" w:name="__RefHeading___Toc1339_3593330738"/>
+      <w:bookmarkStart w:id="21" w:name="__RefHeading___Toc1341_2842061002"/>
       <w:bookmarkEnd w:id="21"/>
       <w:r>
         <w:rPr>
@@ -6346,7 +6368,7 @@
         <w:pStyle w:val="Heading1"/>
         <w:rPr/>
       </w:pPr>
-      <w:bookmarkStart w:id="22" w:name="__RefHeading___Toc1341_3593330738"/>
+      <w:bookmarkStart w:id="22" w:name="__RefHeading___Toc1343_2842061002"/>
       <w:bookmarkEnd w:id="22"/>
       <w:r>
         <w:rPr>
@@ -6363,7 +6385,7 @@
         <w:pStyle w:val="Heading2"/>
         <w:rPr/>
       </w:pPr>
-      <w:bookmarkStart w:id="23" w:name="__RefHeading___Toc1343_3593330738"/>
+      <w:bookmarkStart w:id="23" w:name="__RefHeading___Toc1345_2842061002"/>
       <w:bookmarkEnd w:id="23"/>
       <w:r>
         <w:rPr>
@@ -6395,7 +6417,7 @@
         <w:pStyle w:val="Heading2"/>
         <w:rPr/>
       </w:pPr>
-      <w:bookmarkStart w:id="24" w:name="__RefHeading___Toc1345_3593330738"/>
+      <w:bookmarkStart w:id="24" w:name="__RefHeading___Toc1347_2842061002"/>
       <w:bookmarkEnd w:id="24"/>
       <w:r>
         <w:rPr>
@@ -6427,7 +6449,7 @@
         <w:pStyle w:val="Heading2"/>
         <w:rPr/>
       </w:pPr>
-      <w:bookmarkStart w:id="25" w:name="__RefHeading___Toc1347_3593330738"/>
+      <w:bookmarkStart w:id="25" w:name="__RefHeading___Toc1349_2842061002"/>
       <w:bookmarkEnd w:id="25"/>
       <w:r>
         <w:rPr>
@@ -6459,7 +6481,7 @@
         <w:pStyle w:val="Heading2"/>
         <w:rPr/>
       </w:pPr>
-      <w:bookmarkStart w:id="26" w:name="__RefHeading___Toc1349_3593330738"/>
+      <w:bookmarkStart w:id="26" w:name="__RefHeading___Toc1351_2842061002"/>
       <w:bookmarkEnd w:id="26"/>
       <w:r>
         <w:rPr>
@@ -6491,7 +6513,7 @@
         <w:pStyle w:val="Heading2"/>
         <w:rPr/>
       </w:pPr>
-      <w:bookmarkStart w:id="27" w:name="__RefHeading___Toc1351_3593330738"/>
+      <w:bookmarkStart w:id="27" w:name="__RefHeading___Toc1353_2842061002"/>
       <w:bookmarkEnd w:id="27"/>
       <w:r>
         <w:rPr>
@@ -6523,7 +6545,7 @@
         <w:pStyle w:val="Heading2"/>
         <w:rPr/>
       </w:pPr>
-      <w:bookmarkStart w:id="28" w:name="__RefHeading___Toc1353_3593330738"/>
+      <w:bookmarkStart w:id="28" w:name="__RefHeading___Toc1355_2842061002"/>
       <w:bookmarkEnd w:id="28"/>
       <w:r>
         <w:rPr>
@@ -6703,7 +6725,7 @@
         <w:pStyle w:val="Heading2"/>
         <w:rPr/>
       </w:pPr>
-      <w:bookmarkStart w:id="29" w:name="__RefHeading___Toc1355_3593330738"/>
+      <w:bookmarkStart w:id="29" w:name="__RefHeading___Toc1357_2842061002"/>
       <w:bookmarkEnd w:id="29"/>
       <w:r>
         <w:rPr>
@@ -6738,7 +6760,7 @@
         <w:pStyle w:val="Heading1"/>
         <w:rPr/>
       </w:pPr>
-      <w:bookmarkStart w:id="30" w:name="__RefHeading___Toc1357_3593330738"/>
+      <w:bookmarkStart w:id="30" w:name="__RefHeading___Toc1359_2842061002"/>
       <w:bookmarkEnd w:id="30"/>
       <w:r>
         <w:rPr>
@@ -6755,7 +6777,7 @@
         <w:pStyle w:val="Heading2"/>
         <w:rPr/>
       </w:pPr>
-      <w:bookmarkStart w:id="31" w:name="__RefHeading___Toc1359_3593330738"/>
+      <w:bookmarkStart w:id="31" w:name="__RefHeading___Toc1361_2842061002"/>
       <w:bookmarkEnd w:id="31"/>
       <w:r>
         <w:rPr>
@@ -6787,7 +6809,7 @@
         <w:pStyle w:val="Heading2"/>
         <w:rPr/>
       </w:pPr>
-      <w:bookmarkStart w:id="32" w:name="__RefHeading___Toc1361_3593330738"/>
+      <w:bookmarkStart w:id="32" w:name="__RefHeading___Toc1363_2842061002"/>
       <w:bookmarkEnd w:id="32"/>
       <w:r>
         <w:rPr>
@@ -6819,7 +6841,7 @@
         <w:pStyle w:val="Heading2"/>
         <w:rPr/>
       </w:pPr>
-      <w:bookmarkStart w:id="33" w:name="__RefHeading___Toc1363_3593330738"/>
+      <w:bookmarkStart w:id="33" w:name="__RefHeading___Toc1365_2842061002"/>
       <w:bookmarkEnd w:id="33"/>
       <w:r>
         <w:rPr>
@@ -6851,7 +6873,7 @@
         <w:pStyle w:val="Heading2"/>
         <w:rPr/>
       </w:pPr>
-      <w:bookmarkStart w:id="34" w:name="__RefHeading___Toc1365_3593330738"/>
+      <w:bookmarkStart w:id="34" w:name="__RefHeading___Toc1367_2842061002"/>
       <w:bookmarkEnd w:id="34"/>
       <w:r>
         <w:rPr>
@@ -6883,7 +6905,7 @@
         <w:pStyle w:val="Heading2"/>
         <w:rPr/>
       </w:pPr>
-      <w:bookmarkStart w:id="35" w:name="__RefHeading___Toc1367_3593330738"/>
+      <w:bookmarkStart w:id="35" w:name="__RefHeading___Toc1369_2842061002"/>
       <w:bookmarkEnd w:id="35"/>
       <w:r>
         <w:rPr>
@@ -6915,7 +6937,7 @@
         <w:pStyle w:val="Heading2"/>
         <w:rPr/>
       </w:pPr>
-      <w:bookmarkStart w:id="36" w:name="__RefHeading___Toc1369_3593330738"/>
+      <w:bookmarkStart w:id="36" w:name="__RefHeading___Toc1371_2842061002"/>
       <w:bookmarkEnd w:id="36"/>
       <w:r>
         <w:rPr>
@@ -6950,7 +6972,7 @@
         <w:pStyle w:val="Heading1"/>
         <w:rPr/>
       </w:pPr>
-      <w:bookmarkStart w:id="37" w:name="__RefHeading___Toc1371_3593330738"/>
+      <w:bookmarkStart w:id="37" w:name="__RefHeading___Toc1373_2842061002"/>
       <w:bookmarkEnd w:id="37"/>
       <w:r>
         <w:rPr>
@@ -6967,7 +6989,7 @@
         <w:pStyle w:val="Heading2"/>
         <w:rPr/>
       </w:pPr>
-      <w:bookmarkStart w:id="38" w:name="__RefHeading___Toc1373_3593330738"/>
+      <w:bookmarkStart w:id="38" w:name="__RefHeading___Toc1375_2842061002"/>
       <w:bookmarkEnd w:id="38"/>
       <w:r>
         <w:rPr>
@@ -6999,7 +7021,7 @@
         <w:pStyle w:val="Heading2"/>
         <w:rPr/>
       </w:pPr>
-      <w:bookmarkStart w:id="39" w:name="__RefHeading___Toc1375_3593330738"/>
+      <w:bookmarkStart w:id="39" w:name="__RefHeading___Toc1377_2842061002"/>
       <w:bookmarkEnd w:id="39"/>
       <w:r>
         <w:rPr>
@@ -7031,7 +7053,7 @@
         <w:pStyle w:val="Heading2"/>
         <w:rPr/>
       </w:pPr>
-      <w:bookmarkStart w:id="40" w:name="__RefHeading___Toc1377_3593330738"/>
+      <w:bookmarkStart w:id="40" w:name="__RefHeading___Toc1379_2842061002"/>
       <w:bookmarkEnd w:id="40"/>
       <w:r>
         <w:rPr>
@@ -7063,7 +7085,7 @@
         <w:pStyle w:val="Heading2"/>
         <w:rPr/>
       </w:pPr>
-      <w:bookmarkStart w:id="41" w:name="__RefHeading___Toc1379_3593330738"/>
+      <w:bookmarkStart w:id="41" w:name="__RefHeading___Toc1381_2842061002"/>
       <w:bookmarkEnd w:id="41"/>
       <w:r>
         <w:rPr>
@@ -7095,7 +7117,7 @@
         <w:pStyle w:val="Heading2"/>
         <w:rPr/>
       </w:pPr>
-      <w:bookmarkStart w:id="42" w:name="__RefHeading___Toc1381_3593330738"/>
+      <w:bookmarkStart w:id="42" w:name="__RefHeading___Toc1383_2842061002"/>
       <w:bookmarkEnd w:id="42"/>
       <w:r>
         <w:rPr>
@@ -7127,7 +7149,7 @@
         <w:pStyle w:val="Heading2"/>
         <w:rPr/>
       </w:pPr>
-      <w:bookmarkStart w:id="43" w:name="__RefHeading___Toc1383_3593330738"/>
+      <w:bookmarkStart w:id="43" w:name="__RefHeading___Toc1385_2842061002"/>
       <w:bookmarkEnd w:id="43"/>
       <w:r>
         <w:rPr>
@@ -7162,7 +7184,7 @@
         <w:pStyle w:val="Heading1"/>
         <w:rPr/>
       </w:pPr>
-      <w:bookmarkStart w:id="44" w:name="__RefHeading___Toc1385_3593330738"/>
+      <w:bookmarkStart w:id="44" w:name="__RefHeading___Toc1387_2842061002"/>
       <w:bookmarkEnd w:id="44"/>
       <w:r>
         <w:rPr>
@@ -7179,7 +7201,7 @@
         <w:pStyle w:val="Heading2"/>
         <w:rPr/>
       </w:pPr>
-      <w:bookmarkStart w:id="45" w:name="__RefHeading___Toc1387_3593330738"/>
+      <w:bookmarkStart w:id="45" w:name="__RefHeading___Toc1389_2842061002"/>
       <w:bookmarkEnd w:id="45"/>
       <w:r>
         <w:rPr>
@@ -7211,7 +7233,7 @@
         <w:pStyle w:val="Heading2"/>
         <w:rPr/>
       </w:pPr>
-      <w:bookmarkStart w:id="46" w:name="__RefHeading___Toc1389_3593330738"/>
+      <w:bookmarkStart w:id="46" w:name="__RefHeading___Toc1391_2842061002"/>
       <w:bookmarkEnd w:id="46"/>
       <w:r>
         <w:rPr>
@@ -7243,7 +7265,7 @@
         <w:pStyle w:val="Heading2"/>
         <w:rPr/>
       </w:pPr>
-      <w:bookmarkStart w:id="47" w:name="__RefHeading___Toc1391_3593330738"/>
+      <w:bookmarkStart w:id="47" w:name="__RefHeading___Toc1393_2842061002"/>
       <w:bookmarkEnd w:id="47"/>
       <w:r>
         <w:rPr>
@@ -7275,7 +7297,7 @@
         <w:pStyle w:val="Heading2"/>
         <w:rPr/>
       </w:pPr>
-      <w:bookmarkStart w:id="48" w:name="__RefHeading___Toc1393_3593330738"/>
+      <w:bookmarkStart w:id="48" w:name="__RefHeading___Toc1395_2842061002"/>
       <w:bookmarkEnd w:id="48"/>
       <w:r>
         <w:rPr>
@@ -7310,7 +7332,7 @@
         <w:pStyle w:val="Heading1"/>
         <w:rPr/>
       </w:pPr>
-      <w:bookmarkStart w:id="49" w:name="__RefHeading___Toc1395_3593330738"/>
+      <w:bookmarkStart w:id="49" w:name="__RefHeading___Toc1397_2842061002"/>
       <w:bookmarkEnd w:id="49"/>
       <w:r>
         <w:rPr>
@@ -7327,7 +7349,7 @@
         <w:pStyle w:val="Heading2"/>
         <w:rPr/>
       </w:pPr>
-      <w:bookmarkStart w:id="50" w:name="__RefHeading___Toc1397_3593330738"/>
+      <w:bookmarkStart w:id="50" w:name="__RefHeading___Toc1399_2842061002"/>
       <w:bookmarkEnd w:id="50"/>
       <w:r>
         <w:rPr>
@@ -7359,7 +7381,7 @@
         <w:pStyle w:val="Heading2"/>
         <w:rPr/>
       </w:pPr>
-      <w:bookmarkStart w:id="51" w:name="__RefHeading___Toc1399_3593330738"/>
+      <w:bookmarkStart w:id="51" w:name="__RefHeading___Toc1401_2842061002"/>
       <w:bookmarkEnd w:id="51"/>
       <w:r>
         <w:rPr>
@@ -7391,7 +7413,7 @@
         <w:pStyle w:val="Heading2"/>
         <w:rPr/>
       </w:pPr>
-      <w:bookmarkStart w:id="52" w:name="__RefHeading___Toc1401_3593330738"/>
+      <w:bookmarkStart w:id="52" w:name="__RefHeading___Toc1403_2842061002"/>
       <w:bookmarkEnd w:id="52"/>
       <w:r>
         <w:rPr>
@@ -7426,7 +7448,7 @@
         <w:pStyle w:val="Heading1"/>
         <w:rPr/>
       </w:pPr>
-      <w:bookmarkStart w:id="53" w:name="__RefHeading___Toc1403_3593330738"/>
+      <w:bookmarkStart w:id="53" w:name="__RefHeading___Toc1405_2842061002"/>
       <w:bookmarkEnd w:id="53"/>
       <w:r>
         <w:rPr>
@@ -7443,7 +7465,7 @@
         <w:pStyle w:val="Heading2"/>
         <w:rPr/>
       </w:pPr>
-      <w:bookmarkStart w:id="54" w:name="__RefHeading___Toc1405_3593330738"/>
+      <w:bookmarkStart w:id="54" w:name="__RefHeading___Toc1407_2842061002"/>
       <w:bookmarkEnd w:id="54"/>
       <w:r>
         <w:rPr>
@@ -7475,7 +7497,7 @@
         <w:pStyle w:val="Heading2"/>
         <w:rPr/>
       </w:pPr>
-      <w:bookmarkStart w:id="55" w:name="__RefHeading___Toc1407_3593330738"/>
+      <w:bookmarkStart w:id="55" w:name="__RefHeading___Toc1409_2842061002"/>
       <w:bookmarkEnd w:id="55"/>
       <w:r>
         <w:rPr>
@@ -7484,7 +7506,7 @@
           <w:color w:val="0F4761"/>
           <w:sz w:val="26"/>
         </w:rPr>
-        <w:t>10.2  Which model should we choose?</w:t>
+        <w:t>10.2  Are the AML/CFT, IC compliance and BIR modules add-ons? What costs extra?</w:t>
       </w:r>
     </w:p>
     <w:p>
@@ -7499,7 +7521,7 @@
           <w:color w:val="101820"/>
           <w:sz w:val="21"/>
         </w:rPr>
-        <w:t>Subscription costs less in cash for the first three years and needs no capital approval. Perpetual costs less over five years: for the reference user counts, 13% to 18% less, with break-even in Year 4. iorta TechNXT recommends subscription for small and medium brokers and perpetual for large and enterprise brokers, or for any broker planning four years or more ahead.</w:t>
+        <w:t>No module is an add-on: every module, including the AML/CFT toolkit, the IC and NPC compliance registers, the BIR pack, the integration connectors, dealer programmes and branding, is in every package at no module price. What is optional is the service around them, listed in the Rate Card under "Optional modules and partner services" and confirmed by iorta TechNXT management on 04 October 2026: activation of the AML/CFT toolkit (PHP 130,000.00), of the IC compliance registers (PHP 100,000.00) and of the BIR pack (PHP 130,000.00); connector go-live with a partner (PHP 80,000.00 per connector); dealer programme set-up (PHP 50,000.00 per programme); client brand pack (PHP 30,000.00 per pack); and the regulator and partner steps: AMLC reporting file validation and portal test (PHP 50,000.00), IC annual statement form alignment (PHP 50,000.00), EOPT invoicing review with the broker's tax adviser (PHP 30,000.00), BIR CAS registration support (PHP 60,000.00), BIR EIS enrolment and certification (PHP 80,000.00), CTPL authentication and LTO interface certification (PHP 60,000.00), insurer API onboarding (PHP 50,000.00 per insurer), bank payment file certification (PHP 30,000.00 per bank), SMS or Viber gateway activation (PHP 20,000.00) and screening list provider onboarding (PHP 30,000.00). Each is man-days times the blended rate, is ordered only if the broker wants it, and does not change the package price. The fees of the regulator or the partner (AMLC, IC, BIR, CTPL provider, insurers, banks, gateways, list providers) are not included: the broker contracts and pays them directly, and files in its own name. Proof: the Rate Card, section "Optional modules and partner services".</w:t>
       </w:r>
     </w:p>
     <w:p>
@@ -7507,7 +7529,7 @@
         <w:pStyle w:val="Heading2"/>
         <w:rPr/>
       </w:pPr>
-      <w:bookmarkStart w:id="56" w:name="__RefHeading___Toc1409_3593330738"/>
+      <w:bookmarkStart w:id="56" w:name="__RefHeading___Toc1411_2842061002"/>
       <w:bookmarkEnd w:id="56"/>
       <w:r>
         <w:rPr>
@@ -7516,7 +7538,7 @@
           <w:color w:val="0F4761"/>
           <w:sz w:val="26"/>
         </w:rPr>
-        <w:t>10.3  Who counts as a user?</w:t>
+        <w:t>10.3  Which model should we choose?</w:t>
       </w:r>
     </w:p>
     <w:p>
@@ -7531,7 +7553,7 @@
           <w:color w:val="101820"/>
           <w:sz w:val="21"/>
         </w:rPr>
-        <w:t>A named person with a sign-in. Inactive users are not counted. Referrers do not sign in and are not users.</w:t>
+        <w:t>Subscription costs less in cash for the first three years and needs no capital approval. Perpetual costs less over five years: for the reference user counts, 13% to 18% less, with break-even in Year 4. iorta TechNXT recommends subscription for small and medium brokers and perpetual for large and enterprise brokers, or for any broker planning four years or more ahead.</w:t>
       </w:r>
     </w:p>
     <w:p>
@@ -7539,7 +7561,7 @@
         <w:pStyle w:val="Heading2"/>
         <w:rPr/>
       </w:pPr>
-      <w:bookmarkStart w:id="57" w:name="__RefHeading___Toc1411_3593330738"/>
+      <w:bookmarkStart w:id="57" w:name="__RefHeading___Toc1413_2842061002"/>
       <w:bookmarkEnd w:id="57"/>
       <w:r>
         <w:rPr>
@@ -7548,7 +7570,7 @@
           <w:color w:val="0F4761"/>
           <w:sz w:val="26"/>
         </w:rPr>
-        <w:t>10.4  What are the payment terms?</w:t>
+        <w:t>10.4  Who counts as a user?</w:t>
       </w:r>
     </w:p>
     <w:p>
@@ -7563,7 +7585,7 @@
           <w:color w:val="101820"/>
           <w:sz w:val="21"/>
         </w:rPr>
-        <w:t>Implementation: 40% on signing, 40% on UAT sign-off, 20% on go-live. Perpetual licence: 100% on go-live. AMC: yearly in advance. Subscription and hosting: monthly in advance. Invoices are payable in 30 days. The recommended minimum subscription term is 12 months.</w:t>
+        <w:t>A named person with a sign-in. Inactive users are not counted. Referrers do not sign in and are not users.</w:t>
       </w:r>
     </w:p>
     <w:p>
@@ -7571,7 +7593,7 @@
         <w:pStyle w:val="Heading2"/>
         <w:rPr/>
       </w:pPr>
-      <w:bookmarkStart w:id="58" w:name="__RefHeading___Toc1413_3593330738"/>
+      <w:bookmarkStart w:id="58" w:name="__RefHeading___Toc1415_2842061002"/>
       <w:bookmarkEnd w:id="58"/>
       <w:r>
         <w:rPr>
@@ -7580,7 +7602,7 @@
           <w:color w:val="0F4761"/>
           <w:sz w:val="26"/>
         </w:rPr>
-        <w:t>10.5  Can we withhold tax on your invoices?</w:t>
+        <w:t>10.5  What are the payment terms?</w:t>
       </w:r>
     </w:p>
     <w:p>
@@ -7595,7 +7617,7 @@
           <w:color w:val="101820"/>
           <w:sz w:val="21"/>
         </w:rPr>
-        <w:t>Yes, where the broker is a withholding agent; withholding does not reduce the invoice price and the broker issues BIR Form 2307. The treatment of the perpetual licence (sale of software or royalty) is confirmed by both parties' tax advisers before contract.</w:t>
+        <w:t>Implementation: 40% on signing, 40% on UAT sign-off, 20% on go-live. Perpetual licence: 100% on go-live. AMC: yearly in advance. Subscription and hosting: monthly in advance. Invoices are payable in 30 days. The recommended minimum subscription term is 12 months.</w:t>
       </w:r>
     </w:p>
     <w:p>
@@ -7603,7 +7625,7 @@
         <w:pStyle w:val="Heading2"/>
         <w:rPr/>
       </w:pPr>
-      <w:bookmarkStart w:id="59" w:name="__RefHeading___Toc1415_3593330738"/>
+      <w:bookmarkStart w:id="59" w:name="__RefHeading___Toc1417_2842061002"/>
       <w:bookmarkEnd w:id="59"/>
       <w:r>
         <w:rPr>
@@ -7612,7 +7634,7 @@
           <w:color w:val="0F4761"/>
           <w:sz w:val="26"/>
         </w:rPr>
-        <w:t>10.6  Is there a discount?</w:t>
+        <w:t>10.6  Can we withhold tax on your invoices?</w:t>
       </w:r>
     </w:p>
     <w:p>
@@ -7627,6 +7649,38 @@
           <w:color w:val="101820"/>
           <w:sz w:val="21"/>
         </w:rPr>
+        <w:t>Yes, where the broker is a withholding agent; withholding does not reduce the invoice price and the broker issues BIR Form 2307. The treatment of the perpetual licence (sale of software or royalty) is confirmed by both parties' tax advisers before contract.</w:t>
+      </w:r>
+    </w:p>
+    <w:p>
+      <w:pPr>
+        <w:pStyle w:val="Heading2"/>
+        <w:rPr/>
+      </w:pPr>
+      <w:bookmarkStart w:id="60" w:name="__RefHeading___Toc1419_2842061002"/>
+      <w:bookmarkEnd w:id="60"/>
+      <w:r>
+        <w:rPr>
+          <w:rFonts w:eastAsia="Segoe UI" w:cs="Segoe UI"/>
+          <w:b/>
+          <w:color w:val="0F4761"/>
+          <w:sz w:val="26"/>
+        </w:rPr>
+        <w:t>10.7  Is there a discount?</w:t>
+      </w:r>
+    </w:p>
+    <w:p>
+      <w:pPr>
+        <w:pStyle w:val="Normal"/>
+        <w:spacing w:lineRule="auto" w:line="276" w:before="0" w:after="120"/>
+        <w:rPr/>
+      </w:pPr>
+      <w:r>
+        <w:rPr>
+          <w:rFonts w:eastAsia="Segoe UI" w:cs="Segoe UI" w:ascii="Segoe UI" w:hAnsi="Segoe UI"/>
+          <w:color w:val="101820"/>
+          <w:sz w:val="21"/>
+        </w:rPr>
         <w:t>The onboarding fee percentage for subscription is an input that can be reduced as a commercial concession, with approval. Any other concession needs approval from iorta TechNXT management: [to confirm the discount authority of the sales team].</w:t>
       </w:r>
       <w:r>
@@ -7638,8 +7692,8 @@
         <w:pStyle w:val="Heading1"/>
         <w:rPr/>
       </w:pPr>
-      <w:bookmarkStart w:id="60" w:name="__RefHeading___Toc1417_3593330738"/>
-      <w:bookmarkEnd w:id="60"/>
+      <w:bookmarkStart w:id="61" w:name="__RefHeading___Toc1421_2842061002"/>
+      <w:bookmarkEnd w:id="61"/>
       <w:r>
         <w:rPr>
           <w:rFonts w:eastAsia="Segoe UI" w:cs="Segoe UI" w:ascii="Segoe UI" w:hAnsi="Segoe UI"/>
@@ -7655,8 +7709,8 @@
         <w:pStyle w:val="Heading2"/>
         <w:rPr/>
       </w:pPr>
-      <w:bookmarkStart w:id="61" w:name="__RefHeading___Toc1419_3593330738"/>
-      <w:bookmarkEnd w:id="61"/>
+      <w:bookmarkStart w:id="62" w:name="__RefHeading___Toc1423_2842061002"/>
+      <w:bookmarkEnd w:id="62"/>
       <w:r>
         <w:rPr>
           <w:rFonts w:eastAsia="Segoe UI" w:cs="Segoe UI"/>
@@ -7748,8 +7802,8 @@
         <w:pStyle w:val="Heading2"/>
         <w:rPr/>
       </w:pPr>
-      <w:bookmarkStart w:id="62" w:name="__RefHeading___Toc1421_3593330738"/>
-      <w:bookmarkEnd w:id="62"/>
+      <w:bookmarkStart w:id="63" w:name="__RefHeading___Toc1425_2842061002"/>
+      <w:bookmarkEnd w:id="63"/>
       <w:r>
         <w:rPr>
           <w:rFonts w:eastAsia="Segoe UI" w:cs="Segoe UI"/>
@@ -7837,8 +7891,8 @@
         <w:pStyle w:val="Heading2"/>
         <w:rPr/>
       </w:pPr>
-      <w:bookmarkStart w:id="63" w:name="__RefHeading___Toc1423_3593330738"/>
-      <w:bookmarkEnd w:id="63"/>
+      <w:bookmarkStart w:id="64" w:name="__RefHeading___Toc1427_2842061002"/>
+      <w:bookmarkEnd w:id="64"/>
       <w:r>
         <w:rPr>
           <w:rFonts w:eastAsia="Segoe UI" w:cs="Segoe UI"/>
@@ -7926,8 +7980,8 @@
         <w:pStyle w:val="Heading2"/>
         <w:rPr/>
       </w:pPr>
-      <w:bookmarkStart w:id="64" w:name="__RefHeading___Toc1425_3593330738"/>
-      <w:bookmarkEnd w:id="64"/>
+      <w:bookmarkStart w:id="65" w:name="__RefHeading___Toc1429_2842061002"/>
+      <w:bookmarkEnd w:id="65"/>
       <w:r>
         <w:rPr>
           <w:rFonts w:eastAsia="Segoe UI" w:cs="Segoe UI"/>
@@ -8015,8 +8069,8 @@
         <w:pStyle w:val="Heading2"/>
         <w:rPr/>
       </w:pPr>
-      <w:bookmarkStart w:id="65" w:name="__RefHeading___Toc1427_3593330738"/>
-      <w:bookmarkEnd w:id="65"/>
+      <w:bookmarkStart w:id="66" w:name="__RefHeading___Toc1431_2842061002"/>
+      <w:bookmarkEnd w:id="66"/>
       <w:r>
         <w:rPr>
           <w:rFonts w:eastAsia="Segoe UI" w:cs="Segoe UI"/>
@@ -8104,8 +8158,8 @@
         <w:pStyle w:val="Heading2"/>
         <w:rPr/>
       </w:pPr>
-      <w:bookmarkStart w:id="66" w:name="__RefHeading___Toc1429_3593330738"/>
-      <w:bookmarkEnd w:id="66"/>
+      <w:bookmarkStart w:id="67" w:name="__RefHeading___Toc1433_2842061002"/>
+      <w:bookmarkEnd w:id="67"/>
       <w:r>
         <w:rPr>
           <w:rFonts w:eastAsia="Segoe UI" w:cs="Segoe UI"/>
@@ -8193,8 +8247,8 @@
         <w:pStyle w:val="Heading2"/>
         <w:rPr/>
       </w:pPr>
-      <w:bookmarkStart w:id="67" w:name="__RefHeading___Toc1431_3593330738"/>
-      <w:bookmarkEnd w:id="67"/>
+      <w:bookmarkStart w:id="68" w:name="__RefHeading___Toc1435_2842061002"/>
+      <w:bookmarkEnd w:id="68"/>
       <w:r>
         <w:rPr>
           <w:rFonts w:eastAsia="Segoe UI" w:cs="Segoe UI"/>
@@ -8282,8 +8336,8 @@
         <w:pStyle w:val="Heading2"/>
         <w:rPr/>
       </w:pPr>
-      <w:bookmarkStart w:id="68" w:name="__RefHeading___Toc1433_3593330738"/>
-      <w:bookmarkEnd w:id="68"/>
+      <w:bookmarkStart w:id="69" w:name="__RefHeading___Toc1437_2842061002"/>
+      <w:bookmarkEnd w:id="69"/>
       <w:r>
         <w:rPr>
           <w:rFonts w:eastAsia="Segoe UI" w:cs="Segoe UI"/>
@@ -8371,8 +8425,8 @@
         <w:pStyle w:val="Heading2"/>
         <w:rPr/>
       </w:pPr>
-      <w:bookmarkStart w:id="69" w:name="__RefHeading___Toc1435_3593330738"/>
-      <w:bookmarkEnd w:id="69"/>
+      <w:bookmarkStart w:id="70" w:name="__RefHeading___Toc1439_2842061002"/>
+      <w:bookmarkEnd w:id="70"/>
       <w:r>
         <w:rPr>
           <w:rFonts w:eastAsia="Segoe UI" w:cs="Segoe UI"/>
@@ -8460,8 +8514,8 @@
         <w:pStyle w:val="Heading2"/>
         <w:rPr/>
       </w:pPr>
-      <w:bookmarkStart w:id="70" w:name="__RefHeading___Toc1437_3593330738"/>
-      <w:bookmarkEnd w:id="70"/>
+      <w:bookmarkStart w:id="71" w:name="__RefHeading___Toc1441_2842061002"/>
+      <w:bookmarkEnd w:id="71"/>
       <w:r>
         <w:rPr>
           <w:rFonts w:eastAsia="Segoe UI" w:cs="Segoe UI"/>
@@ -8549,8 +8603,8 @@
         <w:pStyle w:val="Heading2"/>
         <w:rPr/>
       </w:pPr>
-      <w:bookmarkStart w:id="71" w:name="__RefHeading___Toc1439_3593330738"/>
-      <w:bookmarkEnd w:id="71"/>
+      <w:bookmarkStart w:id="72" w:name="__RefHeading___Toc1443_2842061002"/>
+      <w:bookmarkEnd w:id="72"/>
       <w:r>
         <w:rPr>
           <w:rFonts w:eastAsia="Segoe UI" w:cs="Segoe UI"/>
@@ -8638,8 +8692,8 @@
         <w:pStyle w:val="Heading2"/>
         <w:rPr/>
       </w:pPr>
-      <w:bookmarkStart w:id="72" w:name="__RefHeading___Toc1441_3593330738"/>
-      <w:bookmarkEnd w:id="72"/>
+      <w:bookmarkStart w:id="73" w:name="__RefHeading___Toc1445_2842061002"/>
+      <w:bookmarkEnd w:id="73"/>
       <w:r>
         <w:rPr>
           <w:rFonts w:eastAsia="Segoe UI" w:cs="Segoe UI"/>
@@ -8679,8 +8733,8 @@
         <w:pStyle w:val="Heading2"/>
         <w:rPr/>
       </w:pPr>
-      <w:bookmarkStart w:id="73" w:name="__RefHeading___Toc1443_3593330738"/>
-      <w:bookmarkEnd w:id="73"/>
+      <w:bookmarkStart w:id="74" w:name="__RefHeading___Toc1447_2842061002"/>
+      <w:bookmarkEnd w:id="74"/>
       <w:r>
         <w:rPr>
           <w:rFonts w:eastAsia="Segoe UI" w:cs="Segoe UI"/>
@@ -8720,8 +8774,8 @@
         <w:pStyle w:val="Heading2"/>
         <w:rPr/>
       </w:pPr>
-      <w:bookmarkStart w:id="74" w:name="__RefHeading___Toc1445_3593330738"/>
-      <w:bookmarkEnd w:id="74"/>
+      <w:bookmarkStart w:id="75" w:name="__RefHeading___Toc1449_2842061002"/>
+      <w:bookmarkEnd w:id="75"/>
       <w:r>
         <w:rPr>
           <w:rFonts w:eastAsia="Segoe UI" w:cs="Segoe UI"/>
@@ -8761,8 +8815,8 @@
         <w:pStyle w:val="Heading2"/>
         <w:rPr/>
       </w:pPr>
-      <w:bookmarkStart w:id="75" w:name="__RefHeading___Toc1447_3593330738"/>
-      <w:bookmarkEnd w:id="75"/>
+      <w:bookmarkStart w:id="76" w:name="__RefHeading___Toc1451_2842061002"/>
+      <w:bookmarkEnd w:id="76"/>
       <w:r>
         <w:rPr>
           <w:rFonts w:eastAsia="Segoe UI" w:cs="Segoe UI"/>
@@ -8826,8 +8880,8 @@
         <w:pStyle w:val="Heading2"/>
         <w:rPr/>
       </w:pPr>
-      <w:bookmarkStart w:id="76" w:name="__RefHeading___Toc1449_3593330738"/>
-      <w:bookmarkEnd w:id="76"/>
+      <w:bookmarkStart w:id="77" w:name="__RefHeading___Toc1453_2842061002"/>
+      <w:bookmarkEnd w:id="77"/>
       <w:r>
         <w:rPr>
           <w:rFonts w:eastAsia="Segoe UI" w:cs="Segoe UI"/>
@@ -8870,8 +8924,8 @@
         <w:pStyle w:val="Heading1"/>
         <w:rPr/>
       </w:pPr>
-      <w:bookmarkStart w:id="77" w:name="__RefHeading___Toc1451_3593330738"/>
-      <w:bookmarkEnd w:id="77"/>
+      <w:bookmarkStart w:id="78" w:name="__RefHeading___Toc1455_2842061002"/>
+      <w:bookmarkEnd w:id="78"/>
       <w:r>
         <w:rPr>
           <w:rFonts w:eastAsia="Segoe UI" w:cs="Segoe UI" w:ascii="Segoe UI" w:hAnsi="Segoe UI"/>
@@ -10088,9 +10142,9 @@
       <w:r>
         <w:br w:type="page"/>
       </w:r>
-      <w:bookmarkStart w:id="78" w:name="__RefHeading___Toc1453_3593330738"/>
-      <w:bookmarkStart w:id="79" w:name="_Toc233203395"/>
-      <w:bookmarkEnd w:id="78"/>
+      <w:bookmarkStart w:id="79" w:name="__RefHeading___Toc1457_2842061002"/>
+      <w:bookmarkStart w:id="80" w:name="_Toc233203395"/>
+      <w:bookmarkEnd w:id="79"/>
       <w:r>
         <w:rPr>
           <w:rStyle w:val="BookTitle"/>
@@ -10101,7 +10155,7 @@
         </w:rPr>
         <w:t>13.  Document Sign-Off</w:t>
       </w:r>
-      <w:bookmarkEnd w:id="79"/>
+      <w:bookmarkEnd w:id="80"/>
     </w:p>
     <w:p>
       <w:pPr>
@@ -11846,7 +11900,7 @@
       <w:r>
         <w:rPr/>
         <w:drawing>
-          <wp:anchor behindDoc="1" distT="0" distB="0" distL="0" distR="0" simplePos="0" locked="0" layoutInCell="0" allowOverlap="1" relativeHeight="29">
+          <wp:anchor behindDoc="1" distT="0" distB="0" distL="0" distR="0" simplePos="0" locked="0" layoutInCell="0" allowOverlap="1" relativeHeight="30">
             <wp:simplePos x="0" y="0"/>
             <wp:positionH relativeFrom="margin">
               <wp:align>center</wp:align>
@@ -11917,7 +11971,7 @@
     <w:r>
       <w:rPr/>
       <w:drawing>
-        <wp:anchor behindDoc="1" distT="0" distB="0" distL="0" distR="0" simplePos="0" locked="0" layoutInCell="0" allowOverlap="1" relativeHeight="28">
+        <wp:anchor behindDoc="1" distT="0" distB="0" distL="0" distR="0" simplePos="0" locked="0" layoutInCell="0" allowOverlap="1" relativeHeight="29">
           <wp:simplePos x="0" y="0"/>
           <wp:positionH relativeFrom="page">
             <wp:align>left</wp:align>
@@ -11976,7 +12030,7 @@
     <w:r>
       <w:rPr/>
       <w:drawing>
-        <wp:anchor behindDoc="1" distT="0" distB="0" distL="0" distR="0" simplePos="0" locked="0" layoutInCell="0" allowOverlap="1" relativeHeight="28">
+        <wp:anchor behindDoc="1" distT="0" distB="0" distL="0" distR="0" simplePos="0" locked="0" layoutInCell="0" allowOverlap="1" relativeHeight="29">
           <wp:simplePos x="0" y="0"/>
           <wp:positionH relativeFrom="page">
             <wp:align>left</wp:align>

</xml_diff>